<commit_message>
Integrate NEA chapter into the report and deep-edit Chapters 2-5
Renumbers chapters 6-7 to 7-8 to make room for the new Chapter 6 (NEA
telemetry/forecasting), applies document-wide style rules (no em-dashes,
no semicolons, APA numeral gating, no dramatic short sentences), and adds
a dedicated grammar/clarity/redundancy pass to Chapters 2-5. Adds
claude/report-context.md documenting the report's structure, style rules
and per-chapter editing status for future sessions.

Co-Authored-By: Claude Sonnet 5 <noreply@anthropic.com>
Claude-Session: https://claude.ai/code/session_011k3d6fapLJpWBRtB65pE84
</commit_message>
<xml_diff>
--- a/FYP_Report_Updated.docx
+++ b/FYP_Report_Updated.docx
@@ -11833,7 +11833,7 @@
         <w:rPr>
           <w:rFonts w:asciiTheme="majorHAnsi" w:hAnsiTheme="majorHAnsi" w:cstheme="majorHAnsi"/>
         </w:rPr>
-        <w:t>Chapter 6, Results, reports the analysis of historical NEA forecast and observation data and provides the structure for the bench and field results.</w:t>
+        <w:t>Chapter 6, Exploiting NEA Telemetry and Forecasts for Preemptive Pond Management, reports the collection and analysis of 6 years of historical NEA forecast and observation data and sets out what each forecast lead time is validated to add.</w:t>
       </w:r>
     </w:p>
     <w:p>
@@ -11847,8 +11847,7 @@
         <w:rPr>
           <w:rFonts w:asciiTheme="majorHAnsi" w:hAnsiTheme="majorHAnsi" w:cstheme="majorHAnsi"/>
         </w:rPr>
-        <w:lastRenderedPageBreak/>
-        <w:t>Chapter 7, Discussion and Conclusion, interprets the results against the aims in Section 1.4, states the project’s limitations and sets out future work.</w:t>
+        <w:t>Chapter 7, Results, reports the automated software verification and provides the structure for the bench and field results. Chapter 8, Discussion and Conclusion, interprets the results against the aims in Section 1.4, states the project’s limitations and sets out future work.</w:t>
       </w:r>
     </w:p>
     <w:p>
@@ -11913,7 +11912,7 @@
         <w:rPr>
           <w:rFonts w:asciiTheme="majorHAnsi" w:hAnsiTheme="majorHAnsi" w:cstheme="majorHAnsi"/>
         </w:rPr>
-        <w:t>Low-cost IoT monitoring of aquaculture water has been approached from several directions. One study kept hardware cost down by fitting affordable temperature and pH sensors and using manual test kits for dissolved oxygen (DO) and ammonia, with the owner entering the kit results into a mobile application (Taher Tamim et al., 2022). Another instrumented pH, DO, temperature and ammonia directly (Luo et al., 2015), but the DO and ammonia sensors it selected are expensive, and Zuhaer et al. (2025) suggest that such sensors are better suited to intermittent, experimental operation than to continuous deployment. Zuhaer et al. (2025) also addressed the gap in DO and ammonia coverage with a chemical-mechanical sampling mechanism. The approach is novel, but actuators add failure points, and an outdoor enclosure exposed to rain, heat and debris is a poor place for moving parts. A further paper claimed pH, DO, temperature and water level measurement for under USD 50 (Reddy et al., 2026), but it reached that figure by using an air temperature sensor, a soil pH probe and a blood oxygen sensor outside their intended operating conditions. Across these studies, full coverage of the chemical parameters at a low price has not been achieved without either manual labour or compromised sensing. The studies do agree that pH and temperature form the baseline of any such system (Karim et al., 2021; Suhaimi et al., 2021).</w:t>
+        <w:t>Low-cost IoT monitoring of aquaculture water has been approached from several directions. One study kept hardware cost down by fitting affordable temperature and pH sensors and using manual test kits for dissolved oxygen (DO) and ammonia, with the owner entering the kit results into a mobile application (Taher Tamim et al., 2022). Another instrumented pH, DO, temperature and ammonia directly (Luo et al., 2015), but the DO and ammonia sensors it selected are expensive, and Zuhaer et al. (2025) suggest that such sensors are better suited to intermittent, experimental operation than to continuous deployment. Zuhaer et al. (2025) also addressed the gap in DO and ammonia coverage with a chemical-mechanical sampling mechanism. The approach is novel, but actuators add failure points, and an outdoor enclosure exposed to rain, heat and debris is a poor place for moving parts. A further paper claimed pH, DO, temperature and water level measurement for under USD 50 (Reddy et al., 2026), but it reached that figure by using an air temperature sensor, a soil pH probe and a blood oxygen sensor outside their intended operating conditions. Across these studies, full coverage of the chemical parameters at a low price has not been achieved without either manual labour or compromised sensing. Karim et al. (2021) and Suhaimi et al. (2021) both find that pH and temperature form the baseline of any such system.</w:t>
       </w:r>
     </w:p>
     <w:p>
@@ -11960,7 +11959,7 @@
         <w:rPr>
           <w:rFonts w:asciiTheme="majorHAnsi" w:hAnsiTheme="majorHAnsi" w:cstheme="majorHAnsi"/>
         </w:rPr>
-        <w:t>The literature converges strongly on a small set of parameters as determinative of fish welfare, with dissolved oxygen repeatedly identified as the single most critical and time-sensitive variable, given that "all physiological activities relate to fish which includes breathing, excretion of waste, feeding, maintaining salt balance and reproduction" depend on water as the medium through which oxygen, waste, and heat are exchanged (Boyd, 1998, as cited in Komal et al., 2021). Critically, the literature identifies photosynthesis, not atmospheric diffusion, as the dominant oxygen source in a still pond, "compared to photosynthesis, total oxygen gains and loss due to diffusion during daylight is minor" (Komal et al., 2021). This poses risks after dusk, when oxygen production ceases, and respiratory consumption by fish, plankton, and decomposing organic matter continues. This means "the level of DO should be maintained at almost 24 hours, but culture species respond immediately in the context to low DO levels especially at night" (Boyd &amp; Hanson, 2010, as cited in Komal et al., 2021). Water temperature is a significant factor for DO. Temperature directly impacts the oxygen carrying capacity of water and fish metabolism. With "the metabolic demand for oxygen uptake in aquatic organisms becoming double or triple with every 10°C increase" (Begum et al., 2004, as cited in Komal et al., 2021). Temperature, photosynthesis and time of day therefore combine into a predictable pattern of night-time oxygen risk. This pattern could support an indirect hypoxia risk flag gated on water temperature and darkness. The present system does not implement such a flag. It addresses the temperature side through feeding guidance (Section 3.9.2), and a dedicated night-time hypoxia indicator is left as future work (Section 7.4).</w:t>
+        <w:t>The literature converges strongly on a small set of parameters as determinative of fish welfare, with dissolved oxygen repeatedly identified as the single most critical and time-sensitive variable, given that "all physiological activities relate to fish which includes breathing, excretion of waste, feeding, maintaining salt balance and reproduction" depend on water as the medium through which oxygen, waste, and heat are exchanged (Boyd, 1998, as cited in Komal et al., 2021). Critically, the literature identifies photosynthesis, not atmospheric diffusion, as the dominant oxygen source in a still pond, "compared to photosynthesis, total oxygen gains and loss due to diffusion during daylight is minor" (Komal et al., 2021). This poses risks after dusk, when oxygen production ceases, and respiratory consumption by fish, plankton, and decomposing organic matter continues. This means "the level of DO should be maintained at almost 24 hours, but culture species respond immediately in the context to low DO levels especially at night" (Boyd &amp; Hanson, 2010, as cited in Komal et al., 2021). Water temperature also directly affects DO, since "the metabolic demand for oxygen uptake in aquatic organisms becoming double or triple with every 10°C increase" (Begum et al., 2004, as cited in Komal et al., 2021) compounds the effect of reduced oxygen solubility at higher temperatures. Temperature, photosynthesis and time of day therefore combine into a predictable pattern of night-time oxygen risk. This pattern could support an indirect hypoxia risk flag gated on water temperature and darkness. The present system does not implement such a flag. It addresses the temperature side through feeding guidance (Section 3.9.2), and a dedicated night-time hypoxia indicator is left as future work (Section 8.4).</w:t>
       </w:r>
     </w:p>
     <w:p>
@@ -12307,14 +12306,12 @@
         <w:rPr>
           <w:rFonts w:asciiTheme="majorHAnsi" w:hAnsiTheme="majorHAnsi" w:cstheme="majorHAnsi"/>
         </w:rPr>
-        <w:t xml:space="preserve">Algal growth is governed jointly by light and temperature, with optimum growth reported across species between 20–30°C and, in some species, 22–35°C (Singh &amp; Singh, n.d.), a range broadly consistent with tropical outdoor conditions. Light-driven bloom formation has been quantified directly, with a minimum daily light integral of approximately 13.2 mol m⁻² d⁻¹ identified as necessary for surface bloom formation in shallow freshwater systems (Kemp et al., n.d.), providing a citable numerical anchor for a light-driven algal risk model. However, it should be noted that the same study reported an optimal bloom-formation temperature of 16–22°C. This temperature is significantly lower than that faced annually by an outdoor pond setting in Singapore, limiting the applicability of said paper in this context.  More recent work further complicates a simple light-times-temperature model, demonstrating that light itself induces localised photothermal heating distinct from bulk ambient warming, and that "photothermal fluctuations govern the timing of diurnal bloom peaks" (Lin et al., </w:t>
-      </w:r>
-      <w:r>
-        <w:rPr>
-          <w:rFonts w:asciiTheme="majorHAnsi" w:hAnsiTheme="majorHAnsi" w:cstheme="majorHAnsi"/>
-        </w:rPr>
-        <w:lastRenderedPageBreak/>
-        <w:t>n.d.) . This mechanism is not captured by models, including this project's, that treat light and temperature as independent multiplicative factors. Finally, the relationship between fish and algae is not unidirectional, fish waste supplies the nitrogen that fuels algal growth, fish presence has also been shown to suppress harmful cyanobacterial dominance through grazing and competitive effects, with cyanobacteria comprising over 80% of phytoplankton in an unmanaged control pond compared to under 40% where fish were present (Wang et al., n.d.). This bidirectional relationship is a limitation of a model, including this project's where for simplicity fish are assumed not to influence algal population.</w:t>
+        <w:t>Algal growth is governed jointly by light and temperature, with optimum growth reported across species between 20–30°C and, in some species, 22–35°C (Singh &amp; Singh, n.d.), a range broadly consistent with tropical outdoor conditions. Light-driven bloom formation has been quantified directly, with a minimum daily light integral of approximately 13.2 mol m⁻² d⁻¹ identified as necessary for surface bloom formation in shallow freshwater systems (Kemp et al., n.d.), providing a citable numerical anchor for a light-driven algal risk model. However, it should be noted that the same study reported an optimal bloom-formation temperature of 16–22°C. This temperature is significantly lower than that faced annually by an outdoor pond setting in Singapore, limiting the applicability of that study in this context.  More recent work further complicates a simple light-times-temperature model, demonstrating that light itself induces localised photothermal heating distinct from bulk ambient warming, and that "photothermal fluctuations govern the timing of diurnal bloom peaks" (Lin et al., n.d.) . This mechanism is not captured by models, including this project's, that treat light and temperature as independent multiplicative factors. Finally, the relationship between fish and algae is not unidirectional. Fish waste supplies the nitrogen that fuels algal growth, and fish presence has also been shown to suppress harmful cyanobacterial dominance through grazing and competitive effects, with cyanobacteria comprising over 80% of phytoplankton in an unmanaged control pond compared to under 40% where fish were present (Wang et al., n.d.). This bidirectional relationship is a limitation of a model, including this project's where for simplicity fish are assumed not to influence algal population.</w:t>
+      </w:r>
+      <w:r>
+        <w:rPr>
+          <w:rFonts w:asciiTheme="majorHAnsi" w:hAnsiTheme="majorHAnsi" w:cstheme="majorHAnsi"/>
+        </w:rPr>
       </w:r>
     </w:p>
     <w:p>
@@ -12346,14 +12343,12 @@
         <w:rPr>
           <w:rFonts w:asciiTheme="majorHAnsi" w:hAnsiTheme="majorHAnsi" w:cstheme="majorHAnsi"/>
         </w:rPr>
-        <w:t xml:space="preserve">Extreme rainfall introduces risk through physical water-column disruption rather than gradual chemical accumulation. A reservoir study found that "moderate and heavy rainfall events could reduce the thermal stability of water column, deepen the mixing layer depth, and shape the thermocline," with "the hypoxia and anoxia initial depths increas[ing]... during rainfall events" (Zhang et al., 2020). While conducted at a larger scale than an ornamental pond, the underlying mechanism described as  inflow-driven cooling and mixing destabilising stratification and displacing oxygen-depleted bottom water upward is directly transferable, and trade literature corroborates real-world consequences, citing heavy shrimp and finfish mortality following extreme rainfall events attributed to disturbed pond-bottom sediment releasing accumulated hydrogen sulphide, ammonia, and nitrite. Interestingly, another study found “A noticeable increase was observed between summer season inflow and outflow event mean pond runoff temperatures with a minimum difference of 4°C on August 15th and a maximum difference of 10°C on July 26th, 2011.” This study suggests that rainfall has a severe impact upon entry into pond waterbodies with wide-ranging temperature increases. The study found that the thermal enrichment of the pond is directly proportional to rain volume, pond inflow temperature and initial water temperature (Sabouri et al., 2016). This result on first examination sits in opposition to  the finding by (Zhang et al., 2020) which suggested the likely impact in albeit larger bodies of water was a severe plunge in temperature and driving oxygen depleted water upwards. This set of opposing results can be explained with the differing pond experimental parameters. The reservoir study (Zhang et al., 2020) examined hot bodies of water with direct rainfall input causing rapid cooling of the water body, meanwhile (Sabouri et al., 2016) studied </w:t>
-      </w:r>
-      <w:r>
-        <w:rPr>
-          <w:rFonts w:asciiTheme="majorHAnsi" w:hAnsiTheme="majorHAnsi" w:cstheme="majorHAnsi"/>
-        </w:rPr>
-        <w:lastRenderedPageBreak/>
-        <w:t>urban stormwater ponds warmed by hot impervious-surface runoff such as roads and parking lots flowing into ponds. Both studies, while differing in results, do agree that thermal destratification induced by severe rainfall poses temperature fluctuations which could potentially stress fish in outdoor ponds. Notably, if a general case had to be picked to describe the average pond owner in Singapore, the induced result would likely be closer to the reservoir study. This is a direct result of most outdoor ornamental ponds typically being present in gardens with no direct or little exposure to concrete and other surfaces likely to get heated and run off into the pond water.</w:t>
+        <w:t>Extreme rainfall introduces risk through physical water-column disruption rather than gradual chemical accumulation. A reservoir study found that "moderate and heavy rainfall events could reduce the thermal stability of water column, deepen the mixing layer depth, and shape the thermocline," with "the hypoxia and anoxia initial depths increas[ing]... during rainfall events" (Zhang et al., 2020). While conducted at a larger scale than an ornamental pond, the underlying mechanism, inflow-driven cooling and mixing that destabilises stratification and displaces oxygen-depleted bottom water upward, is directly transferable, and trade literature corroborates real-world consequences, citing heavy shrimp and finfish mortality following extreme rainfall events attributed to disturbed pond-bottom sediment releasing accumulated hydrogen sulphide, ammonia, and nitrite. A separate study, by contrast, found "a noticeable increase... between summer season inflow and outflow event mean pond runoff temperatures, with a minimum difference of 4°C on August 15th and a maximum difference of 10°C on July 26th, 2011," and that this thermal enrichment was directly proportional to rain volume, pond inflow temperature and initial water temperature (Sabouri et al., 2016). This result, on first examination, sits in opposition to the finding of Zhang et al. (2020), which suggested that the likely impact in larger bodies of water was a severe plunge in temperature, driving oxygen-depleted water upwards rather than warming the pond. The two studies differ because they examined different settings: Zhang et al. (2020) examined hot bodies of water with direct rainfall input causing rapid cooling, while Sabouri et al. (2016) studied urban stormwater ponds warmed by hot impervious-surface runoff from roads and car parks. Both studies, despite differing in direction, agree that thermal destratification induced by severe rainfall causes temperature fluctuations that could stress fish in outdoor ponds. The typical outdoor ornamental pond in Singapore is likely closer to the reservoir case than to the stormwater case, since most such ponds sit in gardens with little or no exposure to the heated impervious surfaces that drive the stormwater result.</w:t>
+      </w:r>
+      <w:r>
+        <w:rPr>
+          <w:rFonts w:asciiTheme="majorHAnsi" w:hAnsiTheme="majorHAnsi" w:cstheme="majorHAnsi"/>
+        </w:rPr>
       </w:r>
     </w:p>
     <w:p>
@@ -12461,7 +12456,7 @@
         <w:rPr>
           <w:rFonts w:asciiTheme="majorHAnsi" w:hAnsiTheme="majorHAnsi" w:cstheme="majorHAnsi"/>
         </w:rPr>
-        <w:t>The stressors previously reviewed all have substantial literature backing their ability to create fish loss, yet outdoor pond keeping is not considered a high risk activity nor is it particularly uncommon. The literature attributes this to the labour-intensive, vigilance-dependent way ponds are currently managed, rather than to the pond environment being benign. Precision aquaculture research explicitly frames existing manual approaches as effective but costly: "manual approaches are subjective and labour-intensive, which adversely affects fish health, welfare, yield, and management decisions," and the stated objectives of precision fish farming frameworks include reducing "dependencies on manual labor and subjective assessments" (Føre et al., 2018). This is particularly relevant for fish farming, "where water conditions can make observations difficult or risky for farmers". Good outcomes today therefore depend on sustained owner attention.</w:t>
+        <w:t>The stressors previously reviewed all have substantial literature backing their ability to create fish loss, yet outdoor pond keeping is not considered a high risk activity nor is it particularly uncommon. The literature attributes this to the labour-intensive, vigilance-dependent way ponds are currently managed, rather than to the pond environment being benign. Precision aquaculture research explicitly frames existing manual approaches as effective but costly: "manual approaches are subjective and labour-intensive, which adversely affects fish health, welfare, yield, and management decisions," and the stated objectives of precision fish farming frameworks include reducing "dependencies on manual labor and subjective assessments" (Føre et al., 2018). This is particularly relevant for fish farming, "where water conditions can make observations difficult or risky for farmers." Good outcomes today therefore depend on sustained owner attention.</w:t>
       </w:r>
     </w:p>
     <w:p>
@@ -12550,7 +12545,7 @@
         <w:rPr>
           <w:rFonts w:asciiTheme="majorHAnsi" w:hAnsiTheme="majorHAnsi" w:cstheme="majorHAnsi"/>
         </w:rPr>
-        <w:t>The general case for forecast-augmented decision support in outdoor IoT systems is established in the precision agriculture domain, where an IoT-based intelligent irrigation recommendation system demonstrated that gathering environmental sensor data and forwarding it to a cloud-based analysis layer to generate advisory recommendations, rather than directly actuating irrigation, could achieve efficient resource use "with the nominal intervention of farmers" (Bhoi et al., n.d.). A broader systematic review of low-cost agrometeorological IoT stations similarly concludes that such systems contribute meaningfully to "climate resilience" and "data-driven decision-making," and specifically that integrating external weather data alongside locally sensed data outperforms reliance on either source alone. This highlights that forecast integration, in tandem sensing, is able to increase marginal value of an IoT system. Lastly, the paper endorses a recommend-rather-than-actuate architecture as an effective pattern in this domain rather than a compromise.</w:t>
+        <w:t>The general case for forecast-augmented decision support in outdoor IoT systems is established in the precision agriculture domain, where an IoT-based intelligent irrigation recommendation system demonstrated that gathering environmental sensor data and forwarding it to a cloud-based analysis layer to generate advisory recommendations, rather than directly actuating irrigation, could achieve efficient resource use "with the nominal intervention of farmers" (Bhoi et al., n.d.). A broader systematic review of low-cost agrometeorological IoT stations similarly concludes that such systems contribute meaningfully to "climate resilience" and "data-driven decision-making," and specifically that integrating external weather data alongside locally sensed data outperforms reliance on either source alone. This highlights that forecast integration, used in tandem with sensing, increases the marginal value of an IoT system. Lastly, the paper endorses a recommend-rather-than-actuate architecture as an effective pattern in this domain rather than a compromise.</w:t>
       </w:r>
     </w:p>
     <w:p>
@@ -12564,14 +12559,12 @@
         <w:rPr>
           <w:rFonts w:asciiTheme="majorHAnsi" w:hAnsiTheme="majorHAnsi" w:cstheme="majorHAnsi"/>
         </w:rPr>
-        <w:t xml:space="preserve">This raises the more specific architectural question of how that forecast should be sourced. Should a system train its own short-horizon forecasting model from locally sensed data, or consume an existing, externally-maintained meteorological forecast. Two independent empirical studies argue against the former. A controlled study of short-horizon outdoor temperature forecasting found that even a purpose-built battery of models ranging from </w:t>
-      </w:r>
-      <w:r>
-        <w:rPr>
-          <w:rFonts w:asciiTheme="majorHAnsi" w:hAnsiTheme="majorHAnsi" w:cstheme="majorHAnsi"/>
-        </w:rPr>
-        <w:lastRenderedPageBreak/>
-        <w:t>linear, adaptive to modern neural architectures achieved only modest gains over a naive persistence baseline at short horizons, and were outperformed by a simple daily-seasonal-naive reference at longer horizons. The best-performing adaptive model saturating in accuracy after only two to three days of training data (Hernández-Paredes et al., 2026). A directly analogous result was obtained in an aquaculture-specific context: a field evaluation of short-horizon dissolved oxygen forecasting in Nile Tilapia ponds found "only modest improvement over a persistence baseline" at 30 minutes, degrading further to "limited predictive value at the extended horizon" of six hours (Al-Khaldi et al., n.d.). Taken together, these two independently obtained empirically observed domain varying results place the burden of proof on in-house short horizon modelling rather than against it.  If a dedicated, well-resourced short-horizon forecasting study achieves only marginal gains over a naive baseline, a bucket-scale in-house model would be expected to fare no better, and very plausibly worse, given its far smaller training dataset. This is corroborated in a related agricultural context, where a purpose-built low-temperature forecasting model was deployed specifically "to help farmers activate anti-frost techniques to save the crop" (Guillén et al., n.d.) and an embedded air-temperature forecasting model was developed for greenhouse micro-climate management (Codeluppi et al., 2021) , both establishing forecast-triggered pre-emptive action as a recognised pattern in outdoor agricultural IoT, while neither claiming forecasting accuracy gains beyond what the temperature-saturation and DO-forecasting studies above would predict.</w:t>
+        <w:t>This raises the more specific architectural question of how that forecast should be sourced. Should a system train its own short-horizon forecasting model from locally sensed data, or consume an existing, externally-maintained meteorological forecast? Two independent empirical studies argue against the former. A controlled study of short-horizon outdoor temperature forecasting found that even a purpose-built battery of models ranging from linear, adaptive to modern neural architectures achieved only modest gains over a naive persistence baseline at short horizons, and were outperformed by a simple daily-seasonal-naive reference at longer horizons. The best-performing adaptive model saturating in accuracy after only 2 to 3 days of training data (Hernández-Paredes et al., 2026). A directly analogous result was obtained in an aquaculture-specific context: a field evaluation of short-horizon dissolved oxygen forecasting in Nile Tilapia ponds found "only modest improvement over a persistence baseline" at 30 minutes, degrading further to "limited predictive value at the extended horizon" of 6 hours (Al-Khaldi et al., n.d.). Taken together, these two independently obtained, domain-varying empirical results place the burden of proof on in-house short-horizon modelling rather than against it. If a dedicated, well-resourced short-horizon forecasting study achieves only marginal gains over a naive baseline, a bucket-scale in-house model would be expected to fare no better, and very plausibly worse, given its far smaller training dataset. This is corroborated in a related agricultural context, where a purpose-built low-temperature forecasting model was deployed specifically "to help farmers activate anti-frost techniques to save the crop" (Guillén et al., n.d.) and an embedded air-temperature forecasting model was developed for greenhouse micro-climate management (Codeluppi et al., 2021), both establishing forecast-triggered pre-emptive action as a recognised pattern in outdoor agricultural IoT, while neither claiming forecasting accuracy gains beyond what the temperature-saturation and DO-forecasting studies above would predict.</w:t>
+      </w:r>
+      <w:r>
+        <w:rPr>
+          <w:rFonts w:asciiTheme="majorHAnsi" w:hAnsiTheme="majorHAnsi" w:cstheme="majorHAnsi"/>
+        </w:rPr>
       </w:r>
     </w:p>
     <w:p>
@@ -12623,7 +12616,7 @@
         <w:rPr>
           <w:rFonts w:asciiTheme="majorHAnsi" w:hAnsiTheme="majorHAnsi" w:cstheme="majorHAnsi"/>
         </w:rPr>
-        <w:t>Water temperature is directly instrumented and is an essential in most outdoor IoT water quality monitoring deployments. Given the multi-domain importance of temperature established earlier and energy transfer into ponds achieved via radiation from the atmosphere, it becomes tempting to question if we were able to forecast water temperature using air temperature.</w:t>
+        <w:t>Water temperature is directly instrumented and is essential in most outdoor IoT water quality monitoring deployments. Given the multi-domain importance of temperature established earlier, and energy transfer into ponds achieved via radiation from the atmosphere, it becomes tempting to ask whether water temperature could instead be forecast from air temperature.</w:t>
       </w:r>
     </w:p>
     <w:p>
@@ -12637,14 +12630,12 @@
         <w:rPr>
           <w:rFonts w:asciiTheme="majorHAnsi" w:hAnsiTheme="majorHAnsi" w:cstheme="majorHAnsi"/>
         </w:rPr>
-        <w:t xml:space="preserve">It is important to first address what water temperature forecasting address that a current water temperature reading does not. Previous sections of this literature review have highlighted 2 main risks of thermal stress. The first risk is hypoxia, temperature reduces the supply of oxygen while increasing fish metabolism and then by proxy oxygen demand. The second risk is the nitrification process. Nitrites as previously noted are huge chemical risks for fishes with nitrification optimal temperature range being 25-30°C (Hossain et al. ,2022). The intervention in current fish care literature prescribes against thermal stress is a reduction in feeding, notably ration reduction in temperatures above 28°C. This would certainly be achievable with current temperature sensors to address hypoxia risk. However, the limitation in this practice is that the time lag of nitrification means temperature spikes </w:t>
-      </w:r>
-      <w:r>
-        <w:rPr>
-          <w:rFonts w:asciiTheme="majorHAnsi" w:hAnsiTheme="majorHAnsi" w:cstheme="majorHAnsi"/>
-        </w:rPr>
-        <w:lastRenderedPageBreak/>
-        <w:t>hitting after a huge feeding session poses risk to fishes and drastically shortens the potential lifespan of water before change in the pond. Therefore using current temperature readings while useful in addressing hypoxia are markedly less so for addressing chemical loading. Knowing where water temperature is heading, and not only where it currently sits, is therefore of direct operational value in a way that a real-time reading alone is not. The relevant literature is consequently relating water temperature to the ambient meteorological variables for which a forecast already exists.</w:t>
+        <w:t>It is important to first address what water temperature forecasting offers that a current reading does not. Previous sections of this literature review have highlighted 2 main risks of thermal stress. The first is hypoxia: temperature reduces the supply of oxygen while increasing fish metabolism and, by proxy, oxygen demand. The second is the nitrification process, since nitrite, as previously noted, is a substantial chemical risk for fish, with an optimal nitrification temperature range of 25 to 30°C (Hossain et al., 2022). The intervention that current fish care literature prescribes against thermal stress is a reduction in feeding, notably ration reduction at temperatures above 28°C, which is achievable with current temperature sensors alone to address hypoxia risk. The limitation is that the time lag of nitrification means a temperature spike after a large feeding session poses a risk to fish and drastically shortens the safe interval before a change is needed. Using current temperature readings, while useful for hypoxia, is therefore markedly less useful for chemical loading. Knowing where water temperature is heading, not only where it currently sits, is consequently of direct operational value in a way a real-time reading alone is not, which is why the relevant literature relates water temperature to the ambient meteorological variables for which a forecast already exists.</w:t>
+      </w:r>
+      <w:r>
+        <w:rPr>
+          <w:rFonts w:asciiTheme="majorHAnsi" w:hAnsiTheme="majorHAnsi" w:cstheme="majorHAnsi"/>
+        </w:rPr>
       </w:r>
     </w:p>
     <w:p>
@@ -12672,7 +12663,7 @@
         <w:rPr>
           <w:rFonts w:asciiTheme="majorHAnsi" w:hAnsiTheme="majorHAnsi" w:cstheme="majorHAnsi"/>
         </w:rPr>
-        <w:t>A dedicated pond energy-balance model, PHATR, characterises what a physically complete treatment requires and what it achieves. PHATR solves a ten-term energy balance (solar radiation, back radiation, sky radiation, evaporation, convection, soil conduction, seepage, rainfall, well-water input, and outflow) via a fourth-order Runge-Kutta numerical method, in which air temperature enters only indirectly, itself a function of dew point, and a separate convection term but never as a direct linear driver (Lamoureux et al., 2006). This is consistent with the radiation-dominant energy budget reported in the same work and reviewed earlier. Even this full model produced an average bias of 0.7°C for unheated ponds and 2.4°C for heated ponds relative to measured data, establishing a practical floor on the accuracy any simpler air-temperature-driven projection can expect to reach.</w:t>
+        <w:t>A dedicated pond energy-balance model, PHATR, characterises what a physically complete treatment requires and what it achieves. PHATR solves a 10-term energy balance (solar radiation, back radiation, sky radiation, evaporation, convection, soil conduction, seepage, rainfall, well-water input, and outflow) via a fourth-order Runge-Kutta numerical method, in which air temperature enters only indirectly, itself a function of dew point, and a separate convection term but never as a direct linear driver (Lamoureux et al., 2006). This is consistent with the radiation-dominant energy budget reported in the same work and reviewed earlier. Even this full model produced an average bias of 0.7°C for unheated ponds and 2.4°C for heated ponds relative to measured data, establishing a practical floor on the accuracy any simpler air-temperature-driven projection can expect to reach.</w:t>
       </w:r>
     </w:p>
     <w:p>
@@ -12686,14 +12677,12 @@
         <w:rPr>
           <w:rFonts w:asciiTheme="majorHAnsi" w:hAnsiTheme="majorHAnsi" w:cstheme="majorHAnsi"/>
         </w:rPr>
-        <w:t xml:space="preserve">More directly relevant to the look-ahead question, the same study demonstrated that model accuracy is strongly sensitive to temporal resolution, with the correlation coefficient </w:t>
-      </w:r>
-      <w:r>
-        <w:rPr>
-          <w:rFonts w:asciiTheme="majorHAnsi" w:hAnsiTheme="majorHAnsi" w:cstheme="majorHAnsi"/>
-        </w:rPr>
-        <w:lastRenderedPageBreak/>
-        <w:t>falling from 0.92 at a one-hour time step to 0.70 at six hours. This is the clearest quantitative statement identified in this review of how far ahead an ambient-driven water temperature projection remains useful, and it bounds the horizon over which any feeding look-ahead can claim meaningful accuracy. The literature thus supports the value of a short-horizon projection while placing a firm and citable limit on how far that horizon can be extended, and this limit is the constraint the architecture chapter must design within.</w:t>
+        <w:t>More directly relevant to the look-ahead question, the same study demonstrated that model accuracy is strongly sensitive to temporal resolution, with the correlation coefficient falling from 0.92 at a 1-hour time step to 0.70 at 6 hours. This is the clearest quantitative statement identified in this review of how far ahead an ambient-driven water temperature projection remains useful, and it bounds the horizon over which any feeding look-ahead can claim meaningful accuracy. The literature thus supports the value of a short-horizon projection while placing a firm and citable limit on how far that horizon can be extended, and this limit is the constraint the architecture chapter must design within.</w:t>
+      </w:r>
+      <w:r>
+        <w:rPr>
+          <w:rFonts w:asciiTheme="majorHAnsi" w:hAnsiTheme="majorHAnsi" w:cstheme="majorHAnsi"/>
+        </w:rPr>
       </w:r>
     </w:p>
     <w:p>
@@ -12771,7 +12760,7 @@
         <w:rPr>
           <w:rFonts w:asciiTheme="majorHAnsi" w:hAnsiTheme="majorHAnsi" w:cstheme="majorHAnsi"/>
         </w:rPr>
-        <w:t>Before considering individual parameters, the reviewed literature exposes a structural distinction between sensor classes that recurs across every parameter examined invisible in purchase price alone.</w:t>
+        <w:t>Before considering individual parameters, the reviewed literature exposes a structural distinction between sensor classes that recurs across every parameter examined, invisible in purchase price alone.</w:t>
       </w:r>
     </w:p>
     <w:p>
@@ -13177,7 +13166,7 @@
         <w:rPr>
           <w:rFonts w:asciiTheme="majorHAnsi" w:hAnsiTheme="majorHAnsi" w:cstheme="majorHAnsi"/>
         </w:rPr>
-        <w:t>Physical and optical sensors transduce through a solid-state element, a semiconductor junction, thermistor or photodiode, which responds to a physical quantity without exchanging anything with the medium. They consume only the power required to operate, and the sensing element itself has no mechanism of chemical drift. Their characteristic failure is typically external rather than internal. An occluded optical path or a biofilm on the housing, which attenuates the reading without altering the calibration of the element behind it. Correction modes therefore are simple, typically involving cleaning rather than by recalibration.</w:t>
+        <w:t>Physical and optical sensors transduce through a solid-state element, a semiconductor junction, thermistor or photodiode, which responds to a physical quantity without exchanging anything with the medium. They consume only the power required to operate, and the sensing element itself has no mechanism of chemical drift. Their characteristic failure is typically external rather than internal, such as an occluded optical path or a biofilm on the housing, which attenuates the reading without altering the calibration of the element behind it. Correction is therefore simple, typically involving cleaning rather than recalibration.</w:t>
       </w:r>
     </w:p>
     <w:p>
@@ -13205,14 +13194,12 @@
         <w:rPr>
           <w:rFonts w:asciiTheme="majorHAnsi" w:hAnsiTheme="majorHAnsi" w:cstheme="majorHAnsi"/>
         </w:rPr>
-        <w:t xml:space="preserve">Chemical colorimetric indicators occupy a third position that a two-way split obscures. They are chemical sensors, deriving selectivity from a reagent that reacts with the target analyte, but they do not generate an electrical signal. This sensor class still remains the most commonly employed class in the fish hobbyist domain. The reagent changes colour and the reading is taken optically, typically by the fish owner’s eyes. Removing the electrode removes the failure modes that belong to the electrode. There is no reference junction to foul, no electrolyte to exhaust, and no calibration against buffer standards, because the quantity being read is a visible colour change rather than a millivolt offset requiring a reference point. However the main drawbacks associated with this sensor class is the </w:t>
-      </w:r>
-      <w:r>
-        <w:rPr>
-          <w:rFonts w:asciiTheme="majorHAnsi" w:hAnsiTheme="majorHAnsi" w:cstheme="majorHAnsi"/>
-        </w:rPr>
-        <w:lastRenderedPageBreak/>
-        <w:t>outright requirement of humans in the loop to conduct tests manually combined with the consumability of test kits. Their cost is extremely economical, however due to their consumption based nature sensing costs increase as frequency of tests increase for the average chemical test kit. Their employment within IoT domains is with some exception largely underutilised due to the high consumability and therefore maintenance as well as the limited automability of test kits.</w:t>
+        <w:t>Chemical colorimetric indicators occupy a third position that a two-way split obscures. They are chemical sensors, deriving selectivity from a reagent that reacts with the target analyte, but they do not generate an electrical signal. This sensor class still remains the most commonly employed class in the fish hobbyist domain. The reagent changes colour and the reading is taken optically, typically by the fish owner’s eyes. Removing the electrode removes the failure modes that belong to the electrode. There is no reference junction to foul, no electrolyte to exhaust, and no calibration against buffer standards, because the quantity being read is a visible colour change rather than a millivolt offset requiring a reference point. However, the main drawback of this sensor class is that it requires a human in the loop to conduct tests manually, and its consumable test kits mean sensing cost rises directly with test frequency. Largely for this reason, colorimetric indicators remain, with some exceptions, underused in IoT deployments despite their low unit cost.</w:t>
+      </w:r>
+      <w:r>
+        <w:rPr>
+          <w:rFonts w:asciiTheme="majorHAnsi" w:hAnsiTheme="majorHAnsi" w:cstheme="majorHAnsi"/>
+        </w:rPr>
       </w:r>
     </w:p>
     <w:p>
@@ -13226,7 +13213,7 @@
         <w:rPr>
           <w:rFonts w:asciiTheme="majorHAnsi" w:hAnsiTheme="majorHAnsi" w:cstheme="majorHAnsi"/>
         </w:rPr>
-        <w:t>A three-month laboratory and field stability study of a low-cost multiparameter IoT station quantifies this gradient within a single deployment. Naloufi et al. found that "weekly calibration and cleaning were required" to compensate for drift across the instrumented parameters, with the temperature sensor demonstrating good stability and minimal drift, the pH sensors showing acceptable stability under that weekly maintenance regime, and the dissolved oxygen sensor requiring monthly membrane cap replacement, with a six-month-old membrane exhibiting visibly degraded performance (Naloufi et al., 2024). The gradient is therefore not merely conceptual: within one study, on one water body, the maintenance interval ranged from effectively none to monthly consumable replacement depending on the sensing principle.</w:t>
+        <w:t>A 3-month laboratory and field stability study of a low-cost multiparameter IoT station quantifies this gradient within a single deployment. Naloufi et al. found that "weekly calibration and cleaning were required" to compensate for drift across the instrumented parameters, with the temperature sensor demonstrating good stability and minimal drift, the pH sensors showing acceptable stability under that weekly maintenance regime, and the dissolved oxygen sensor requiring monthly membrane cap replacement, with a 6-month-old membrane exhibiting visibly degraded performance (Naloufi et al., 2024). The gradient is therefore not merely conceptual: within one study, on one water body, the maintenance interval ranged from effectively none to monthly consumable replacement depending on the sensing principle.</w:t>
       </w:r>
     </w:p>
     <w:p>
@@ -13240,7 +13227,7 @@
         <w:rPr>
           <w:rFonts w:asciiTheme="majorHAnsi" w:hAnsiTheme="majorHAnsi" w:cstheme="majorHAnsi"/>
         </w:rPr>
-        <w:t>The adoption pattern across the wider literature tracks this gradient closely. A systematic review of 142 low-cost water quality sensing papers found pH instrumented in 90% of studies, temperature in 80%, and turbidity in 59%, but dissolved oxygen in only 38%, attributing the last figure explicitly to "the difficulty of performing reliable DO measurements in real conditions" (Martins et al., 2023). The same review reports fouling, water ingress and component degradation as recurring field failures, and notes that only 18 of the 142 studies performed the expected comparison against reference instrumentation. Plausibly indicating that low-cost sensor accuracy is thinner than the volume of publication suggests.</w:t>
+        <w:t>The adoption pattern across the wider literature tracks this gradient closely. A systematic review of 142 low-cost water quality sensing papers found pH instrumented in 90% of studies, temperature in 80%, and turbidity in 59%, but dissolved oxygen in only 38%, attributing the last figure explicitly to "the difficulty of performing reliable DO measurements in real conditions" (Martins et al., 2023). The same review reports fouling, water ingress and component degradation as recurring field failures, and notes that only 18 of the 142 studies performed the expected comparison against reference instrumentation, plausibly indicating that low-cost sensor accuracy is thinner than the volume of publication suggests.</w:t>
       </w:r>
     </w:p>
     <w:p>
@@ -13402,14 +13389,12 @@
         <w:rPr>
           <w:rFonts w:asciiTheme="majorHAnsi" w:hAnsiTheme="majorHAnsi" w:cstheme="majorHAnsi"/>
         </w:rPr>
-        <w:t xml:space="preserve">Dissolved oxygen sits at the unfavourable extreme of the gradient on both of its axes. Conventional electrochemical DO sensors rely on platinum electrodes, which are costly, and are additionally documented to suffer biofouling in natural water that "leads to reduced sensitivity and variable performance" (Hsu et al., n.d.). More specifically, experimental characterisation of a low-cost DO sensor found that the addition of nitrate and phosphate compounds caused approximately 30% and 70% current variation respectively in sensor response (Hsu et al., n.d.). Nitrate and phosphate are routine constituents of a fed outdoor pond, so the chemistry the pond generates is documented to corrupt the readings of affordable DO sensors. This is corroborated in deployment: the stability study reviewed above required monthly membrane cap replacement for its DO channel and observed degraded performance from a six-month-old membrane (Naloufi et al., 2024), and the </w:t>
-      </w:r>
-      <w:r>
-        <w:rPr>
-          <w:rFonts w:asciiTheme="majorHAnsi" w:hAnsiTheme="majorHAnsi" w:cstheme="majorHAnsi"/>
-        </w:rPr>
-        <w:lastRenderedPageBreak/>
-        <w:t>systematic review found DO instrumented in only 38% of low-cost studies against pH's 90%, attributing the shortfall to the difficulty of reliable DO measurement in real conditions (Martins et al., 2023). Unlike pH, the parameter also feeds no other derived quantity, so its maintenance burden is amortised across nothing.</w:t>
+        <w:t>Dissolved oxygen sits at the unfavourable extreme of the gradient on both of its axes. Conventional electrochemical DO sensors rely on platinum electrodes, which are costly, and are additionally documented to suffer biofouling in natural water that "leads to reduced sensitivity and variable performance" (Hsu et al., n.d.). More specifically, experimental characterisation of a low-cost DO sensor found that the addition of nitrate and phosphate compounds caused approximately 30% and 70% current variation respectively in sensor response (Hsu et al., n.d.). Nitrate and phosphate are routine constituents of a fed outdoor pond, so the chemistry the pond generates is documented to corrupt the readings of affordable DO sensors. This is corroborated in deployment: the stability study reviewed above required monthly membrane cap replacement for its DO channel and observed degraded performance from a 6-month-old membrane (Naloufi et al., 2024), and the systematic review found DO instrumented in only 38% of low-cost studies against pH's 90%, attributing the shortfall to the difficulty of reliable DO measurement in real conditions (Martins et al., 2023). Unlike pH, the parameter also feeds no other derived quantity, so its maintenance burden is amortised across nothing.</w:t>
+      </w:r>
+      <w:r>
+        <w:rPr>
+          <w:rFonts w:asciiTheme="majorHAnsi" w:hAnsiTheme="majorHAnsi" w:cstheme="majorHAnsi"/>
+        </w:rPr>
       </w:r>
     </w:p>
     <w:p>
@@ -13423,7 +13408,7 @@
         <w:rPr>
           <w:rFonts w:asciiTheme="majorHAnsi" w:hAnsiTheme="majorHAnsi" w:cstheme="majorHAnsi"/>
         </w:rPr>
-        <w:t>A four-year field comparison did report strong performance from low-cost DO sensors, with mean absolute errors below 1 mg/L against reference stations and little drift even without recalibration (Leischner et al., 2026). Those deployments were in flowing streams, where continuous movement resists both biofouling and the build-up of interfering nutrients.</w:t>
+        <w:t>A 4-year field comparison did report strong performance from low-cost DO sensors, with mean absolute errors below 1 mg/L against reference stations and little drift even without recalibration (Leischner et al., 2026). Those deployments were in flowing streams, where continuous movement resists both biofouling and the build-up of interfering nutrients.</w:t>
       </w:r>
     </w:p>
     <w:p>
@@ -13469,7 +13454,7 @@
         <w:rPr>
           <w:rFonts w:asciiTheme="majorHAnsi" w:hAnsiTheme="majorHAnsi" w:cstheme="majorHAnsi"/>
         </w:rPr>
-        <w:t>Nitrate instrumentation presents a similar structure. The established continuous-monitoring standard, ultraviolet absorption spectroscopy, is reported to cost between $15,000 and $25,000 per unit while remaining vulnerable to organic-matter interference. For all intents and purposes such sensors are in no contention for being considered in an IoT project with a budgetary system as one of its core directives. The more affordable alternative, the ion-selective electrode, shares the electrochemical class’s fouling and drift and adds interference from other ions. Capella et al. (2015) identify chloride and bicarbonate as the major interferents for nitrate electrodes, and both are present in any pond that receives tap-water top-ups. Emerging low-cost optical prototypes exist, with one recent design achieving a sub-$800 unit cost, but as of publication remained a research prototype requiring "further calibration work to address challenges with matrix effects in dirty water" rather than a commercially mature solution (Furuta et al., 2026).</w:t>
+        <w:t>Nitrate instrumentation presents a similar structure. The established continuous-monitoring standard, ultraviolet absorption spectroscopy, is reported to cost between $15,000 and $25,000 per unit while remaining vulnerable to organic-matter interference. Such sensors are accordingly out of contention for an IoT project with a tight budget as one of its core constraints. The more affordable alternative, the ion-selective electrode, shares the electrochemical class’s fouling and drift and adds interference from other ions. Capella et al. (2015) identify chloride and bicarbonate as the major interferents for nitrate electrodes, and both are present in any pond that receives tap-water top-ups. Emerging low-cost optical prototypes exist, with one recent design achieving a sub-$800 unit cost, but as of publication remained a research prototype requiring "further calibration work to address challenges with matrix effects in dirty water" rather than a commercially mature solution (Furuta et al., 2026).</w:t>
       </w:r>
     </w:p>
     <w:p>
@@ -13611,7 +13596,7 @@
         <w:rPr>
           <w:rFonts w:asciiTheme="majorHAnsi" w:hAnsiTheme="majorHAnsi" w:cstheme="majorHAnsi"/>
         </w:rPr>
-        <w:t>A spreadsheet-based mass-balance model of total ammonia nitrogen dynamics in semi-intensive earthen ponds achieved a reported model efficiency exceeding 90% against three years of field data. However this outcome required thirteen manually calibrated parameters standardised against site-specific observations (Ray et al., 2017). A validated pond-scale kinetic model of this type required extensive site-specific calibration rather than universally transferable coefficients. Any implementation adopting published rate constants without equivalent local calibration is therefore operating with placeholders pending experimental identification.</w:t>
+        <w:t>A spreadsheet-based mass-balance model of total ammonia nitrogen dynamics in semi-intensive earthen ponds achieved a reported model efficiency exceeding 90% against 3 years of field data. However this outcome required 13 manually calibrated parameters standardised against site-specific observations (Ray et al., 2017). A validated pond-scale kinetic model of this type required extensive site-specific calibration rather than universally transferable coefficients. Any implementation adopting published rate constants without equivalent local calibration is therefore operating with placeholders pending experimental identification.</w:t>
       </w:r>
     </w:p>
     <w:p>
@@ -13654,7 +13639,7 @@
         <w:rPr>
           <w:rFonts w:asciiTheme="majorHAnsi" w:hAnsiTheme="majorHAnsi" w:cstheme="majorHAnsi"/>
         </w:rPr>
-        <w:t>One limitation applies to the whole of this precedent. All the kinetic modelling studies reviewed here were conducted either in flow-through recirculating systems or in managed earthen ponds without significant uncontrolled external biological input. An outdoor deployment differs materially, since wind and rain introduce allochthonous organic matter, airborne debris, and biological material such as pollen, insects, bird waste. This constitutes an explicit limitation on transferring these otherwise well-precedented kinetic approaches to an uncontrolled outdoor environment. It is also a limitation the approach cannot detect in itself, so its error under such conditions is silent. This is the strongest argument identified in this review for obtaining some chemical observation independent of the model, and it motivates examining a third route.</w:t>
+        <w:t>One limitation applies to the whole of this precedent. All the kinetic modelling studies reviewed here were conducted either in flow-through recirculating systems or in managed earthen ponds without significant uncontrolled external biological input. An outdoor deployment differs materially, since wind and rain introduce allochthonous organic matter, airborne debris, and biological material such as pollen, insects, and bird waste. This constitutes an explicit limitation on transferring these otherwise well-precedented kinetic approaches to an uncontrolled outdoor environment. It is also a limitation the approach cannot detect in itself, so its error under such conditions is silent. This is the strongest argument identified in this review for obtaining some chemical observation independent of the model, and it motivates examining a third route.</w:t>
       </w:r>
     </w:p>
     <w:p>
@@ -13700,14 +13685,12 @@
         <w:rPr>
           <w:rFonts w:asciiTheme="majorHAnsi" w:hAnsiTheme="majorHAnsi" w:cstheme="majorHAnsi"/>
         </w:rPr>
-        <w:t xml:space="preserve">The academic precedent is direct and recent. An image processing system for total ammonia nitrogen monitoring in aquaculture, built on a Raspberry Pi, extracted RGB channel values from images of standard TAN solutions across 0–5 mg/L and fitted regression models to predict concentration, the green channel model achieved a coefficient of determination of 0.969, mean absolute error of 0.535 mg/L, root mean squared error of 0.805 mg/L, and a </w:t>
-      </w:r>
-      <w:r>
-        <w:rPr>
-          <w:rFonts w:asciiTheme="majorHAnsi" w:hAnsiTheme="majorHAnsi" w:cstheme="majorHAnsi"/>
-        </w:rPr>
-        <w:lastRenderedPageBreak/>
-        <w:t>limit of detection of 0.215 mg/L, with an optimal working range of 0.2–2.0 mg/L (Puangsuwan et al., 2026). Notably, the red channel model achieved higher numerical accuracy but "exhibited greater drift at higher TAN concentrations, reducing its reliability in operational settings". This result is consistent with the channel-selection findings in the algal colour literature reviewed later, where specific colour-space channels rather than raw RGB proved most stable. Related work has demonstrated quantitative colorimetric detection of dissolved ammonia using polydiacetylene sensors with machine-learning classifiers, and smartphone-based colorimetric determination of ammonium and nitrite using reference calibration to correct for illumination variation. Camera-read colorimetry for nitrogen species is therefore a validated class of technique rather than an improvisation, though every study in it reports the same dependence on controlled or corrected illumination that the algal imaging literature reports independently.</w:t>
+        <w:t>The academic precedent is direct and recent. An image processing system for total ammonia nitrogen monitoring in aquaculture, built on a Raspberry Pi, extracted RGB channel values from images of standard TAN solutions across 0–5 mg/L and fitted regression models to predict concentration, the green channel model achieved a coefficient of determination of 0.969, mean absolute error of 0.535 mg/L, root mean squared error of 0.805 mg/L, and a limit of detection of 0.215 mg/L, with an optimal working range of 0.2–2.0 mg/L (Puangsuwan et al., 2026). Notably, the red channel model achieved higher numerical accuracy but "exhibited greater drift at higher TAN concentrations, reducing its reliability in operational settings." This result is consistent with the channel-selection findings in the algal colour literature reviewed later, where specific colour-space channels rather than raw RGB proved most stable. Related work has demonstrated quantitative colorimetric detection of dissolved ammonia using polydiacetylene sensors with machine-learning classifiers, and smartphone-based colorimetric determination of ammonium and nitrite using reference calibration to correct for illumination variation. Camera-read colorimetry for nitrogen species is therefore a validated class of technique rather than an improvisation, though every study in it reports the same dependence on controlled or corrected illumination that the algal imaging literature reports independently.</w:t>
+      </w:r>
+      <w:r>
+        <w:rPr>
+          <w:rFonts w:asciiTheme="majorHAnsi" w:hAnsiTheme="majorHAnsi" w:cstheme="majorHAnsi"/>
+        </w:rPr>
       </w:r>
     </w:p>
     <w:p>
@@ -13764,14 +13747,12 @@
         <w:rPr>
           <w:rFonts w:asciiTheme="majorHAnsi" w:hAnsiTheme="majorHAnsi" w:cstheme="majorHAnsi"/>
         </w:rPr>
-        <w:t xml:space="preserve">This commercial product's existence validates the class within a domain that has otherwise been dominated by direct sensing. Colorimetric chemical sensing is second-order by nature, since the instrument reads the output of a separate sensing element rather than transducing the analyte itself.  This approach explores chemical sensing in unattended consumer instruments rather than only as laboratory apparatus or in manual water testing. An interesting takeaway from the Seneye Ammonia monitoring system is that the light required for reading the colorimetric data is supplied rather than using the ambient environment. The instrument carries its own light source behind the sensing element, which converts the illumination variance that the imaging literature identifies as the principal confound into a fixed property of the optical design. Lastly, the system combines two </w:t>
-      </w:r>
-      <w:r>
-        <w:rPr>
-          <w:rFonts w:asciiTheme="majorHAnsi" w:hAnsiTheme="majorHAnsi" w:cstheme="majorHAnsi"/>
-        </w:rPr>
-        <w:lastRenderedPageBreak/>
-        <w:t>properties that the sensor classes above hold separately, taking the calibration-free operation of the chemical class and the automation of the electrochemical class. The manufacturer states that the disposable slide removes the need for device calibration and that fitting a new slide re-establishes the reference condition (Seneye, n.d.-a). As such much like other chemical sensors this system requires consumables. However this is a domain wide constraint affecting electrodes as well , not a specific constraint placed on this specific system.</w:t>
+        <w:t>This commercial product's existence validates the class within a domain that has otherwise been dominated by direct sensing. Colorimetric chemical sensing is second-order by nature, since the instrument reads the output of a separate sensing element rather than transducing the analyte itself. This approach explores chemical sensing in unattended consumer instruments rather than only as laboratory apparatus or in manual water testing. An interesting takeaway from the Seneye Ammonia monitoring system is that the light required for reading the colorimetric data is supplied rather than using the ambient environment. The instrument carries its own light source behind the sensing element, which converts the illumination variance that the imaging literature identifies as the principal confound into a fixed property of the optical design. Lastly, the system combines two properties that the sensor classes above hold separately, taking the calibration-free operation of the chemical class and the automation of the electrochemical class. The manufacturer states that the disposable slide removes the need for device calibration and that fitting a new slide re-establishes the reference condition (Seneye, n.d.-a). Like other chemical sensors, this system requires consumables. This is, however, a domain-wide constraint affecting electrodes as well, not one specific to this system.</w:t>
+      </w:r>
+      <w:r>
+        <w:rPr>
+          <w:rFonts w:asciiTheme="majorHAnsi" w:hAnsiTheme="majorHAnsi" w:cstheme="majorHAnsi"/>
+        </w:rPr>
       </w:r>
     </w:p>
     <w:p>
@@ -13815,7 +13796,7 @@
         <w:rPr>
           <w:rFonts w:asciiTheme="majorHAnsi" w:hAnsiTheme="majorHAnsi" w:cstheme="majorHAnsi"/>
         </w:rPr>
-        <w:t>SeaChem Ammonia Alert is a hobbyist-tier indicator of the same general class, by contrast, changes reversibly through colour bands stated bands of below 0.02 mg/L (safe), 0.05 mg/L (alert), 0.2 mg/L (alarm) and 0.5 mg/L (toxic), requires no calibration, and carries a stated service life of approximately one year (Seachem Laboratories, n.d.). The SeaChem Ammonia Alert system does not provide the exact fidelity as claimed by that of the Seneye monitor test kit by nature of its approximate colour bands. However, it similarly provides long operation windows without replacement. This actually outperforms Seneye system’s maintenance requirements which instead recommends monthly replacement. Although this could be reasoned out as Seneye’s higher fidelity system making it more susceptible to drift than the safety bands of the Sea Chem system.</w:t>
+        <w:t>SeaChem Ammonia Alert is a hobbyist-tier indicator of the same general class. By contrast to the Seneye monitor, it changes colour reversibly through stated bands of below 0.02 mg/L (safe), 0.05 mg/L (alert), 0.2 mg/L (alarm) and 0.5 mg/L (toxic), requires no calibration, and carries a stated service life of approximately 1 year (Seachem Laboratories, n.d.). Its approximate colour bands do not match the Seneye kit’s precision, but it similarly provides long operation windows without replacement, in fact outperforming Seneye’s own monthly-replacement requirement. This could reasonably be attributed to Seneye’s higher-fidelity slide being more susceptible to drift than SeaChem’s coarser safety bands.</w:t>
       </w:r>
     </w:p>
     <w:p>
@@ -13829,14 +13810,12 @@
         <w:rPr>
           <w:rFonts w:asciiTheme="majorHAnsi" w:hAnsiTheme="majorHAnsi" w:cstheme="majorHAnsi"/>
         </w:rPr>
-        <w:t xml:space="preserve">Both products also report free NH₃ rather than total ammonia nitrogen, the SeaChem product stating plainly that its indicator "only measure[s] free ammonia because that is the harmful form" (Seachem Laboratories, n.d.). Since the toxicology literature reviewed above identifies un-ionised NH₃ as the acutely toxic species, this reads the biologically meaningful quantity directly and bypasses the pH- and temperature-dependent speciation conversion </w:t>
-      </w:r>
-      <w:r>
-        <w:rPr>
-          <w:rFonts w:asciiTheme="majorHAnsi" w:hAnsiTheme="majorHAnsi" w:cstheme="majorHAnsi"/>
-        </w:rPr>
-        <w:lastRenderedPageBreak/>
-        <w:t>that the RAS modelling literature identified as commonly omitted. A measurement that is intrinsically pH-weighted requires no pH correction to be interpreted as a hazard.This output expressed as free NH₃ is also limiting, and for a more consequential reason than incomparability with the total-ammonia thresholds tabulated earlier (Stone &amp; Thomforde, 2004, as cited in Komal et al., 2021). Free NH₃ is a pH-dependent slice of the total ammonia pool rather than the pool itself, and at typical pond pH it is a small slice, on the order of one percent at pH 7.0 rising to roughly twenty percent at pH 8.5 at tropical temperatures. The indicator therefore reports the fraction of the load that is currently toxic, not the size of the load. Those two quantities diverge, and the divergence matters twice over. A pond can hold a large nitrogenous load at low pH while the indicator reads safe, and that same load becomes hazardous when photosynthesis raises pH through the afternoon without any nitrogen having been added. Separately, nitrite production draws on the whole ammonia pool rather than on the free fraction alone, since ammonium and free ammonia remain in rapid equilibrium as nitrifying bacteria consume the latter, so an indicator reading free NH₃ carries no information about downstream nitrite risk. An optical ammonia channel, a modelled total ammonia figure and a pH sensor are therefore complementary rather than redundant. The model supplies the load that nitrification kinetics require, pH and temperature convert that modelled load into a predicted hazard, and the indicator measures the hazard independently and validates the prediction.</w:t>
+        <w:t>Both products also report free NH₃ rather than total ammonia nitrogen, the SeaChem product stating plainly that its indicator "only measure[s] free ammonia because that is the harmful form" (Seachem Laboratories, n.d.). Since the toxicology literature reviewed above identifies un-ionised NH₃ as the acutely toxic species, this reads the biologically meaningful quantity directly and bypasses the pH- and temperature-dependent speciation conversion that the RAS modelling literature identified as commonly omitted. A measurement that is intrinsically pH-weighted requires no pH correction to be interpreted as a hazard. This output, expressed as free NH₃, is also limiting, and for a more consequential reason than incomparability with the total-ammonia thresholds tabulated earlier (Stone &amp; Thomforde, 2004, as cited in Komal et al., 2021). Free NH₃ is a pH-dependent slice of the total ammonia pool rather than the pool itself, and at typical pond pH it is a small slice, on the order of 1 percent at pH 7.0 rising to roughly 20 percent at pH 8.5 at tropical temperatures. The indicator therefore reports the fraction of the load that is currently toxic, not the size of the load. Those two quantities diverge, and the divergence matters twice over. A pond can hold a large nitrogenous load at low pH while the indicator reads safe, and that same load becomes hazardous when photosynthesis raises pH through the afternoon without any nitrogen having been added. Separately, nitrite production draws on the whole ammonia pool rather than on the free fraction alone, since ammonium and free ammonia remain in rapid equilibrium as nitrifying bacteria consume the latter, so an indicator reading free NH₃ carries no information about downstream nitrite risk. An optical ammonia channel, a modelled total ammonia figure and a pH sensor are therefore complementary rather than redundant. The model supplies the load that nitrification kinetics require, pH and temperature convert that modelled load into a predicted hazard, and the indicator measures the hazard independently and validates the prediction.</w:t>
+      </w:r>
+      <w:r>
+        <w:rPr>
+          <w:rFonts w:asciiTheme="majorHAnsi" w:hAnsiTheme="majorHAnsi" w:cstheme="majorHAnsi"/>
+        </w:rPr>
       </w:r>
     </w:p>
     <w:p>
@@ -13850,14 +13829,12 @@
         <w:rPr>
           <w:rFonts w:asciiTheme="majorHAnsi" w:hAnsiTheme="majorHAnsi" w:cstheme="majorHAnsi"/>
         </w:rPr>
-        <w:t xml:space="preserve">However, it should be noted that SeaChem is not a full IoT implementation, only the chemical sensing portion equivalent to the Seneye system. The reason for the exploration of an independent solution away from direct Seneye system is twofold. The Seneye pond monitoring suite is extremely costly , more than $230 SGD and is against the direct budgetary constraints of the project. Secondly, Seneye is a full suite IoT system not intended to be a subsystem integrated into larger monitoring suites. This creates challenges later when trying to ingest the data from Seneye into the system proposed by this paper. SeaChem’s chemical sensor therefore provides the crucial building block to reproduce a system directionally comparable if less precise than the Seneye system. A full system buildup involving an enclosure, Seachem sensor, LEDs and photodiodes will still be necessary to reproduce the Seneye system baseline capability. Given the availability of cheap electronic modules with decent operating parameters, an independently developed </w:t>
-      </w:r>
-      <w:r>
-        <w:rPr>
-          <w:rFonts w:asciiTheme="majorHAnsi" w:hAnsiTheme="majorHAnsi" w:cstheme="majorHAnsi"/>
-        </w:rPr>
-        <w:lastRenderedPageBreak/>
-        <w:t>system leveraging SeaChem sensors should cost a fraction of the $230 SGD figure, better aligning with the project goals.</w:t>
+        <w:t>However, it should be noted that SeaChem is not a full IoT implementation, only the chemical sensing portion equivalent to the Seneye system. The reason for the exploration of an independent solution away from direct Seneye system is twofold. The Seneye pond monitoring suite is extremely costly, more than $230 SGD and is against the direct budgetary constraints of the project. Secondly, Seneye is a full suite IoT system not intended to be a subsystem integrated into larger monitoring suites. This creates challenges later when trying to ingest Seneye’s data into the system this project proposes. SeaChem’s chemical sensor therefore provides the crucial building block to reproduce a system directionally comparable if less precise than the Seneye system. A full system buildup involving an enclosure, Seachem sensor, LEDs and photodiodes will still be necessary to reproduce the Seneye system baseline capability. Given the availability of cheap electronic modules with decent operating parameters, an independently developed system leveraging SeaChem sensors should cost a fraction of the $230 SGD figure, better aligning with the project goals.</w:t>
+      </w:r>
+      <w:r>
+        <w:rPr>
+          <w:rFonts w:asciiTheme="majorHAnsi" w:hAnsiTheme="majorHAnsi" w:cstheme="majorHAnsi"/>
+        </w:rPr>
       </w:r>
     </w:p>
     <w:p>
@@ -13904,7 +13881,7 @@
         <w:rPr>
           <w:rFonts w:asciiTheme="majorHAnsi" w:hAnsiTheme="majorHAnsi" w:cstheme="majorHAnsi"/>
         </w:rPr>
-        <w:t>A laboratory study across eight microalgae species found that HSV colour-space channels was among the most effective indicators for identifying non-homogeneously distributed algal species, and that a single vegetation index (VEG) consistently provided the best-fit growth kinetic model across all species tested, achieving RMSE of 0.2–0.4 (Sunoj et al., 2021). Importantly, this study also found that colour intensity tracks chlorophyll content specifically, which "grows unsteadily and then decays," while biomass grows more steadily. A colour-derived green ratio should be utilised as an tracking optical signal rather than a full proxy for standing biomass, especially as the two are liable to diverge across an algal life cycle.</w:t>
+        <w:t>A laboratory study across eight microalgae species found that HSV colour-space channels were among the most effective indicators for identifying non-homogeneously distributed algal species, and that a single vegetation index (VEG) consistently provided the best-fit growth kinetic model across all species tested, achieving RMSE of 0.2–0.4 (Sunoj et al., 2021). Importantly, this study also found that colour intensity tracks chlorophyll content specifically, which "grows unsteadily and then decays," while biomass grows more steadily. A colour-derived green ratio should be used as a tracking optical signal rather than a full proxy for standing biomass, especially as the two are liable to diverge across an algal life cycle.</w:t>
       </w:r>
     </w:p>
     <w:p>
@@ -13918,14 +13895,12 @@
         <w:rPr>
           <w:rFonts w:asciiTheme="majorHAnsi" w:hAnsiTheme="majorHAnsi" w:cstheme="majorHAnsi"/>
         </w:rPr>
-        <w:t xml:space="preserve">This laboratory-scale validation is reinforced by a real-world, production-scale deployment. A 2024 study developed a four-step HSV-thresholding pipeline for real-time cyanobacterial bloom detection on live 24-hour cameras at Dianchi Lake, China, computing an algae-pixel-to-water-pixel area ratio and reporting bloom-area ratios of 33–66% across real deployed frames (Gong et al., 2024). Both this study and an earlier laboratory-based colour-concentration regression study (Ngo et al.) similarly arrived at the same conclusion. HSV colour thresholds "vary according to different devices and locations" and must be calibrated per deployment rather than treated as universal constants. These two independent confirmations establish this as a calibration requirement rather than an optional refinement.  Thresholds must be resolved per installation, and any fixed universal cutoff should be expected to fail on transfer. A separate HSI-based threshold-segmentation method for algae counting achieved greater than 90% agreement with manual recognition conducted via microorganism object detection survey, offering further independent </w:t>
-      </w:r>
-      <w:r>
-        <w:rPr>
-          <w:rFonts w:asciiTheme="majorHAnsi" w:hAnsiTheme="majorHAnsi" w:cstheme="majorHAnsi"/>
-        </w:rPr>
-        <w:lastRenderedPageBreak/>
-        <w:t>corroboration that colour-space-based algal quantification constitutes a validated class of technique rather than an obscure unsubstantiated result.</w:t>
+        <w:t>This laboratory-scale validation is reinforced by a real-world, production-scale deployment. A 2024 study developed a four-step HSV-thresholding pipeline for real-time cyanobacterial bloom detection on live 24-hour cameras at Dianchi Lake, China, computing an algae-pixel-to-water-pixel area ratio and reporting bloom-area ratios of 33–66% across real deployed frames (Gong et al., 2024). Both this study and an earlier laboratory-based colour-concentration regression study (Ngo et al.) similarly arrived at the same conclusion. HSV colour thresholds "vary according to different devices and locations" and must be calibrated per deployment rather than treated as universal constants. These two independent confirmations establish this as a calibration requirement rather than an optional refinement. Thresholds must be resolved per installation, and any fixed universal cutoff should be expected to fail on transfer. A separate HSI-based threshold-segmentation method for algae counting achieved greater than 90% agreement with manual recognition conducted via microorganism object detection survey, offering further independent corroboration that colour-space-based algal quantification constitutes a validated class of technique rather than an obscure unsubstantiated result.</w:t>
+      </w:r>
+      <w:r>
+        <w:rPr>
+          <w:rFonts w:asciiTheme="majorHAnsi" w:hAnsiTheme="majorHAnsi" w:cstheme="majorHAnsi"/>
+        </w:rPr>
       </w:r>
     </w:p>
     <w:p>
@@ -14013,8 +13988,7 @@
         <w:rPr>
           <w:rFonts w:asciiTheme="majorHAnsi" w:hAnsiTheme="majorHAnsi" w:cstheme="majorHAnsi"/>
         </w:rPr>
-        <w:lastRenderedPageBreak/>
-        <w:t>Before assessing additional instrumentation it is necessary to check whether an external source could supply this quantity, as the forecasting section established it could for temperature, humidity, wind and rainfall. The NEA realtime weather collection provides air temperature, relative humidity, rainfall, wind speed and wind direction (National Environment Agency, n.d.-a). A separate feed publishes an ultraviolet index at thirty-minute intervals with a historical archive extending to 2016 (National Environment Agency, n.d.-b). A radiation-related parameter is therefore available, and should be evaluated if this reading is a sufficient substitute. The index is derived from ultraviolet A (315 to 400 nm) and ultraviolet B (280 to 315 nm), weighted to approximate the erythemal response of human skin (National Environment Agency, n.d.-c). Photosynthetically active radiation is defined over 400 to 700 nm, so the published index and the quantity algal growth kinetics require occupy separate regions of the spectrum. The Penman combination equation requires net radiation across the broadband shortwave range, of which the ultraviolet component carries only a few percent of the energy. The index measures a band that is either adjacent to or a small fraction of what each model needs. Furthermore, the relationship between the two is not fixed. Ultraviolet is attenuated differently from visible radiation by solar elevation, cloud, aerosol and ozone column, and the erythemal weighting emphasises the shorter ultraviolet B wavelengths, which are the most atmospherically variable part of the spectrum. A conversion from index to broadband irradiance would therefore be neither constant nor calibratable without the instrument it was intended to replace. Lastly, the index is reported as a dimensionless value from zero to eleven and above, grouped into exposure bands, as a single island-wide figure. Neither its quantisation nor its spatial resolution suits it to use as a continuous model input.</w:t>
+        <w:t>Before assessing additional instrumentation it is necessary to check whether an external source could supply this quantity, as the forecasting section established it could for temperature, humidity, wind and rainfall. The NEA realtime weather collection provides air temperature, relative humidity, rainfall, wind speed and wind direction (National Environment Agency, n.d.-a). A separate feed publishes an ultraviolet index at 30-minute intervals with a historical archive extending to 2016 (National Environment Agency, n.d.-b). A radiation-related parameter is therefore available, and should be evaluated if this reading is a sufficient substitute. The index is derived from ultraviolet A (315 to 400 nm) and ultraviolet B (280 to 315 nm), weighted to approximate the erythemal response of human skin (National Environment Agency, n.d.-c). Photosynthetically active radiation is defined over 400 to 700 nm, so the published index and the quantity algal growth kinetics require occupy separate regions of the spectrum. The Penman combination equation requires net radiation across the broadband shortwave range, of which the ultraviolet component carries only a few percent of the energy. The index measures a band that is either adjacent to or a small fraction of what each model needs. Furthermore, the relationship between the two is not fixed. Ultraviolet is attenuated differently from visible radiation by solar elevation, cloud, aerosol and ozone column, and the erythemal weighting emphasises the shorter ultraviolet B wavelengths, which are the most atmospherically variable part of the spectrum. A conversion from index to broadband irradiance would therefore be neither constant nor calibratable without the instrument it was intended to replace. Lastly, the index is reported as a dimensionless value from 0 to 11 and above, grouped into exposure bands, as a single island-wide figure. Neither its quantisation nor its spatial resolution suits it to use as a continuous model input.</w:t>
       </w:r>
     </w:p>
     <w:p>
@@ -14042,14 +14016,12 @@
         <w:rPr>
           <w:rFonts w:asciiTheme="majorHAnsi" w:hAnsiTheme="majorHAnsi" w:cstheme="majorHAnsi"/>
         </w:rPr>
-        <w:t xml:space="preserve">The instrumentation question is whether an inexpensive photometric sensor measures the right physical quantity. Lux is a photometric unit weighted by the human photopic response, which peaks near 555 nm and falls to zero outside the visible band. Photosynthesis requires photosynthetically active radiation in quantum units and the energy balance requires </w:t>
-      </w:r>
-      <w:r>
-        <w:rPr>
-          <w:rFonts w:asciiTheme="majorHAnsi" w:hAnsiTheme="majorHAnsi" w:cstheme="majorHAnsi"/>
-        </w:rPr>
-        <w:lastRenderedPageBreak/>
-        <w:t>irradiance in W m⁻², neither of which a lux sensor reports. Conversion factors exist but are source-dependent. An instrument manufacturer tabulates PPFD-to-lux factors of 54 for sunlight, 65 to 74 for various fluorescent and ceramic metal halide sources, and 82 for high-pressure sodium, a spread of roughly 52%, and cautions that applying the wrong factor introduces errors exceeding 50% (Apogee Instruments, n.d.). However, the 52% spread is notably spread across artificial illuminants. Meanwhile, the outdoor pond is lit by daylight and nothing else, so the applicable factor is the sunlight value alone, and the residual uncertainty is the narrower question of how the daylight spectrum shifts with solar elevation and cloud cover. The generic objection to lux-to-PAR conversion is largely an indoor objection and does not transfer at full strength to this deployment.</w:t>
+        <w:t>The instrumentation question is whether an inexpensive photometric sensor measures the right physical quantity. Lux is a photometric unit weighted by the human photopic response, which peaks near 555 nm and falls to zero outside the visible band. Photosynthesis requires photosynthetically active radiation in quantum units and the energy balance requires irradiance in W m⁻², neither of which a lux sensor reports. Conversion factors exist but are source-dependent. An instrument manufacturer tabulates PPFD-to-lux factors of 54 for sunlight, 65 to 74 for various fluorescent and ceramic metal halide sources, and 82 for high-pressure sodium, a spread of roughly 52%, and cautions that applying the wrong factor introduces errors exceeding 50% (Apogee Instruments, n.d.). However, that 52% range is concentrated across artificial illuminants specifically. Meanwhile, the outdoor pond is lit by daylight and nothing else, so the applicable factor is the sunlight value alone, and the residual uncertainty is the narrower question of how the daylight spectrum shifts with solar elevation and cloud cover. The generic objection to lux-to-PAR conversion is largely an indoor objection and does not transfer at full strength to this deployment.</w:t>
+      </w:r>
+      <w:r>
+        <w:rPr>
+          <w:rFonts w:asciiTheme="majorHAnsi" w:hAnsiTheme="majorHAnsi" w:cstheme="majorHAnsi"/>
+        </w:rPr>
       </w:r>
     </w:p>
     <w:p>
@@ -14145,14 +14117,12 @@
         <w:rPr>
           <w:rFonts w:asciiTheme="majorHAnsi" w:hAnsiTheme="majorHAnsi" w:cstheme="majorHAnsi"/>
         </w:rPr>
-        <w:t xml:space="preserve">On instrumentation, the review establishes a maintenance gradient that operates independently of purchase price and that the published adoption pattern already tracks, and it establishes that the gradient must be weighed against breadth of use rather than applied as a class exclusion. The same electrochemical weaknesses that make dissolved oxygen and nitrate instrumentation unattractive apply in full to pH, but pH feeds three separately established derived quantities, namely ammonia toxicity resolution, rainfall acid loading, and an independent signal of algal activity. pH sensors also arrive at a replacement cost an order of magnitude lower, which is a materially different trade rather than the same </w:t>
-      </w:r>
-      <w:r>
-        <w:rPr>
-          <w:rFonts w:asciiTheme="majorHAnsi" w:hAnsiTheme="majorHAnsi" w:cstheme="majorHAnsi"/>
-        </w:rPr>
-        <w:lastRenderedPageBreak/>
-        <w:t>one. The review further identifies a third sensing class, colorimetric indication read optically, that is calibration-free and provides a coarse but chemically independent of the feed-driven inference route.</w:t>
+        <w:t>On instrumentation, the review establishes a maintenance gradient that operates independently of purchase price and that the published adoption pattern already tracks, and it establishes that the gradient must be weighed against breadth of use rather than applied as a class exclusion. The same electrochemical weaknesses that make dissolved oxygen and nitrate instrumentation unattractive apply in full to pH, but pH feeds three separately established derived quantities, namely ammonia toxicity resolution, rainfall acid loading, and an independent signal of algal activity. pH sensors also arrive at a replacement cost an order of magnitude lower, which is a materially different trade rather than the same one. The review further identifies a third sensing class, colorimetric indication read optically, that is calibration-free and provides a coarse but chemically independent check on the feed-driven inference route.</w:t>
+      </w:r>
+      <w:r>
+        <w:rPr>
+          <w:rFonts w:asciiTheme="majorHAnsi" w:hAnsiTheme="majorHAnsi" w:cstheme="majorHAnsi"/>
+        </w:rPr>
       </w:r>
     </w:p>
     <w:p>
@@ -14252,7 +14222,7 @@
         <w:rPr>
           <w:rFonts w:asciiTheme="majorHAnsi" w:hAnsiTheme="majorHAnsi" w:cstheme="majorHAnsi"/>
         </w:rPr>
-        <w:t>A sensor suite selected on maintenance burden weighed against breadth of use rather than on unit cost alone, uninstrumented parameters are obtained by inference and cross-checked against an independent observation.</w:t>
+        <w:t>A sensor suite selected on maintenance burden weighed against breadth of use rather than on unit cost alone. Uninstrumented parameters are obtained by inference and cross-checked against an independent observation.</w:t>
       </w:r>
     </w:p>
     <w:p>
@@ -15381,14 +15351,12 @@
         <w:rPr>
           <w:rFonts w:asciiTheme="majorHAnsi" w:hAnsiTheme="majorHAnsi" w:cstheme="majorHAnsi"/>
         </w:rPr>
-        <w:t xml:space="preserve">This arrangement became possible when the pH front end changed to a 3.3 V analogue board (Section 3.2.5). Each remaining module draws a few milliamps at most: the DS18B20 draws up to 1.5 mA during conversion, the TDS board 3 mA to 6 mA and the TSL2591 well </w:t>
-      </w:r>
-      <w:r>
-        <w:rPr>
-          <w:rFonts w:asciiTheme="majorHAnsi" w:hAnsiTheme="majorHAnsi" w:cstheme="majorHAnsi"/>
-        </w:rPr>
-        <w:lastRenderedPageBreak/>
-        <w:t>under 1 mA (Analog Devices, 2026; ams OSRAM, 2023a; DFRobot, 2026a). These loads sit well inside the current an ESP32 pin can source at its highest drive setting, so separate load switches and a separate 5 V rail were no longer needed. Removing them cut the part count, removed two converters and their quiescent current, and allowed every sensor to share the ESP32’s regulated 3.3 V supply.</w:t>
+        <w:t>This arrangement became possible when the pH front end changed to a 3.3 V analogue board (Section 3.2.5). Each remaining module draws a few milliamps at most: the DS18B20 draws up to 1.5 mA during conversion, the TDS board 3 mA to 6 mA and the TSL2591 well under 1 mA (Analog Devices, 2026, ams OSRAM, 2023a, and DFRobot, 2026a). These loads sit well inside the current an ESP32 pin can source at its highest drive setting, so separate load switches and a separate 5 V rail were no longer needed. Removing them cut the part count, removed two converters and their quiescent current, and allowed every sensor to share the ESP32’s regulated 3.3 V supply.</w:t>
+      </w:r>
+      <w:r>
+        <w:rPr>
+          <w:rFonts w:asciiTheme="majorHAnsi" w:hAnsiTheme="majorHAnsi" w:cstheme="majorHAnsi"/>
+        </w:rPr>
       </w:r>
     </w:p>
     <w:p>
@@ -15614,7 +15582,7 @@
         <w:rPr>
           <w:rFonts w:asciiTheme="majorHAnsi" w:hAnsiTheme="majorHAnsi" w:cstheme="majorHAnsi"/>
         </w:rPr>
-        <w:t>The pH channel uses the DFRobot Gravity analogue industrial pH kit (SEN0169-V2). The kit pairs an industrial-grade glass electrode on a 5 m cable with a signal board that runs from 3.3 V to 5.5 V and outputs 0 V to 3.0 V. The manufacturer quotes an accuracy of ±0.1 pH at 25 °C, a response time under 60 s and a probe life of more than six months in continuous use (DFRobot, n.d.).</w:t>
+        <w:t>The pH channel uses the DFRobot Gravity analogue industrial pH kit (SEN0169-V2). The kit pairs an industrial-grade glass electrode on a 5 m cable with a signal board that runs from 3.3 V to 5.5 V and outputs 0 V to 3.0 V. The manufacturer quotes an accuracy of ±0.1 pH at 25 °C, a response time under 60 s and a probe life of more than 6 months in continuous use (DFRobot, n.d.).</w:t>
       </w:r>
     </w:p>
     <w:p>
@@ -15628,7 +15596,7 @@
         <w:rPr>
           <w:rFonts w:asciiTheme="majorHAnsi" w:hAnsiTheme="majorHAnsi" w:cstheme="majorHAnsi"/>
         </w:rPr>
-        <w:t>The earlier design used a pH-201 class electrode with an RS485 Modbus front end on an 8 V rail. A differential RS485 link resists noise on long cables, and it keeps the high-impedance amplifier near the probe. However, the Modbus board failed during bench testing and had to be discarded. The analogue kit was adopted in its place for three reasons. It runs from the ESP32’s own 3.3 V supply, which removed the 8 V rail, both buck converters and the reason for a 12 V battery pack. Its output fits the ESP32 ADC range directly. And it follows the same power-on, sample, power-off pattern as the other sensors, so the firmware needs no separate serial protocol.</w:t>
+        <w:t>The earlier design used a pH-201 class electrode with an RS485 Modbus front end on an 8 V rail. A differential RS485 link resists noise on long cables, and it keeps the high-impedance amplifier near the probe. However, the Modbus board failed during bench testing and had to be discarded. The analogue kit was adopted in its place for three reasons. It runs from the ESP32’s own 3.3 V supply, which removed the 8 V rail, both buck converters and the reason for a 12 V battery pack. Its output fits the ESP32 ADC range directly. It also follows the same power-on, sample, power-off pattern as the other sensors, so the firmware needs no separate serial protocol.</w:t>
       </w:r>
     </w:p>
     <w:p>
@@ -15642,7 +15610,7 @@
         <w:rPr>
           <w:rFonts w:asciiTheme="majorHAnsi" w:hAnsiTheme="majorHAnsi" w:cstheme="majorHAnsi"/>
         </w:rPr>
-        <w:t>The analogue board gives up some noise immunity. The signal travels from board to ADC as a voltage and can pick up interference from switching currents or the radio, and three measures limit this. The board sits inside the enclosure next to the ESP32, so the long, sensitive run is the shielded probe cable between the electrode and the board rather than the analogue output. The firmware takes 31 readings and uses their median, as for TDS. And the pH reading is taken with every other water-contact sensor and the radio switched off (Section 3.4.3).</w:t>
+        <w:t>The analogue board gives up some noise immunity. The signal travels from board to ADC as a voltage and can pick up interference from switching currents or the radio, and three measures limit this. The board sits inside the enclosure next to the ESP32, so the long, sensitive run is the shielded probe cable between the electrode and the board rather than the analogue output. The firmware takes 31 readings and uses their median, as for TDS. The pH reading is also taken with every other water-contact sensor and the radio switched off (Section 3.4.3).</w:t>
       </w:r>
     </w:p>
     <w:p>
@@ -16719,7 +16687,7 @@
         <w:rPr>
           <w:rFonts w:asciiTheme="majorHAnsi" w:hAnsiTheme="majorHAnsi" w:cstheme="majorHAnsi"/>
         </w:rPr>
-        <w:t>The board’s 6 mA deep sleep current is small beside its active current, but it flows all day and uses about 144 mAh from the 5 V supply each day even if no image is taken. The firmware reduces avoidable draw during sleep by holding the camera in power-down and the flash LED off with RTC GPIO holds. The board’s regulator and support parts still draw current. A load switch or timed latch that removes camera power completely between captures would make the camera’s energy use follow the number of images instead of the number of hours, and is listed as an improvement in Section 7.4.</w:t>
+        <w:t>The board’s 6 mA deep sleep current is small beside its active current, but it flows all day and uses about 144 mAh from the 5 V supply each day even if no image is taken. The firmware reduces avoidable draw during sleep by holding the camera in power-down and the flash LED off with RTC GPIO holds. The board’s regulator and support parts still draw current. A load switch or timed latch that removes camera power completely between captures would make the camera’s energy use follow the number of images instead of the number of hours, and is listed as an improvement in Section 8.4.</w:t>
       </w:r>
     </w:p>
     <w:p>
@@ -17640,8 +17608,7 @@
         <w:rPr>
           <w:rFonts w:asciiTheme="majorHAnsi" w:hAnsiTheme="majorHAnsi" w:cstheme="majorHAnsi"/>
         </w:rPr>
-        <w:lastRenderedPageBreak/>
-        <w:t>The sensing window lasts about 10 s to 13 s per cycle. The TDS reading takes about 2.6 s, the light and colour readings about 2 s to 3 s, the temperature reading about 1.8 s and the pH reading up to 5.6 s. Taking 12 s at 50 mA plus a 4 s upload at 120 mA gives about 0.30 mAh per cycle. At the five-minute production interval this is 288 cycles and about 86 mAh per day. The node sleeps for the remaining 22.7 hours. A development board drawing 8 mA in sleep consumes about 180 mAh per day in sleep alone, while a board with its power LED removed and a low-quiescent regulator might draw 0.2 mA, or about 5 mAh per day.</w:t>
+        <w:t>The sensing window lasts about 10 s to 13 s per cycle. The TDS reading takes about 2.6 s, the light and colour readings about 2 s to 3 s, the temperature reading about 1.8 s and the pH reading up to 5.6 s. Taking 12 s at 50 mA plus a 4 s upload at 120 mA gives about 0.30 mAh per cycle. At the 5-minute production interval this is 288 cycles and about 86 mAh per day. The node sleeps for the remaining 22.7 hours. A development board drawing 8 mA in sleep consumes about 180 mAh per day in sleep alone, while a board with its power LED removed and a low-quiescent regulator might draw 0.2 mA, or about 5 mAh per day.</w:t>
       </w:r>
     </w:p>
     <w:p>
@@ -18159,7 +18126,7 @@
         <w:rPr>
           <w:rFonts w:asciiTheme="majorHAnsi" w:hAnsiTheme="majorHAnsi" w:cstheme="majorHAnsi"/>
         </w:rPr>
-        <w:t>The table shows that the development board’s own sleep current sets the service interval, far more than the sensors or the radio do. Removing that current extends life about threefold, while a buck converter adds roughly another quarter. The five-minute interval accounts for most of the remaining active energy, so a stable-pond interval of 15 minutes would roughly halve the active share. These results set the order of work: measure the board’s sleep current first, then decide on the regulator.</w:t>
+        <w:t>The table shows that the development board’s own sleep current sets the service interval, far more than the sensors or the radio do. Removing that current extends life about threefold, while a buck converter adds roughly another quarter. The 5-minute interval accounts for most of the remaining active energy, so a stable-pond interval of 15 minutes would roughly halve the active share. These results set the order of work: measure the board’s sleep current first, then decide on the regulator.</w:t>
       </w:r>
     </w:p>
     <w:p>
@@ -18194,7 +18161,7 @@
         <w:rPr>
           <w:rFonts w:asciiTheme="majorHAnsi" w:hAnsiTheme="majorHAnsi" w:cstheme="majorHAnsi"/>
         </w:rPr>
-        <w:t>3.4.1 Five-Minute Base Interval</w:t>
+        <w:t>3.4.1 5-Minute Base Interval</w:t>
       </w:r>
       <w:bookmarkEnd w:id="92"/>
     </w:p>
@@ -18209,7 +18176,7 @@
         <w:rPr>
           <w:rFonts w:asciiTheme="majorHAnsi" w:hAnsiTheme="majorHAnsi" w:cstheme="majorHAnsi"/>
         </w:rPr>
-        <w:t>The production interval is five minutes, which gives 288 readings per day. Pond temperature and conductivity change more slowly than this, so a one-minute interval would mainly add Wi-Fi sessions and database rows. A fifteen-minute interval would save more energy but could delay the record of a change after feeding, maintenance or a sudden storm. Five minutes gives enough trend detail while keeping the radio duty cycle low.</w:t>
+        <w:t>The production interval is 5 minutes, which gives 288 readings per day. Pond temperature and conductivity change more slowly than this, so a 1-minute interval would mainly add Wi-Fi sessions and database rows. A 15-minute interval would save more energy but could delay the record of a change after feeding, maintenance or a sudden storm. A 5-minute interval gives enough trend detail while keeping the radio duty cycle low.</w:t>
       </w:r>
     </w:p>
     <w:p>
@@ -20343,20 +20310,8 @@
             <w:tcW w:w="0" w:type="auto"/>
           </w:tcPr>
           <w:p>
-            <w:pPr>
-              <w:pStyle w:val="Compact"/>
-              <w:spacing w:before="20" w:after="20" w:line="264" w:lineRule="auto"/>
-              <w:jc w:val="left"/>
-              <w:rPr>
-                <w:rFonts w:asciiTheme="majorHAnsi" w:hAnsiTheme="majorHAnsi" w:cstheme="majorHAnsi"/>
-              </w:rPr>
-            </w:pPr>
-            <w:r>
-              <w:rPr>
-                <w:rFonts w:asciiTheme="majorHAnsi" w:hAnsiTheme="majorHAnsi" w:cstheme="majorHAnsi"/>
-                <w:sz w:val="19"/>
-              </w:rPr>
-              <w:t>—</w:t>
+            <w:r>
+              <w:t>N/A</w:t>
             </w:r>
           </w:p>
         </w:tc>
@@ -20485,14 +20440,12 @@
         <w:rPr>
           <w:rFonts w:asciiTheme="majorHAnsi" w:hAnsiTheme="majorHAnsi" w:cstheme="majorHAnsi"/>
         </w:rPr>
-        <w:t xml:space="preserve">HTTP has a large connection overhead beside a short sensor payload, which supports batching. MQTT would reduce repeated overhead and handle queued delivery better, but it </w:t>
-      </w:r>
-      <w:r>
-        <w:rPr>
-          <w:rFonts w:asciiTheme="majorHAnsi" w:hAnsiTheme="majorHAnsi" w:cstheme="majorHAnsi"/>
-        </w:rPr>
-        <w:lastRenderedPageBreak/>
-        <w:t>would add a broker to run and maintain. For one node reporting every five minutes, batched HTTPS is the simpler choice.</w:t>
+        <w:t>HTTP has a large connection overhead beside a short sensor payload, which supports batching. MQTT would reduce repeated overhead and handle queued delivery better, but it would add a broker to run and maintain. For one node reporting every 5 minutes, batched HTTPS is the simpler choice.</w:t>
+      </w:r>
+      <w:r>
+        <w:rPr>
+          <w:rFonts w:asciiTheme="majorHAnsi" w:hAnsiTheme="majorHAnsi" w:cstheme="majorHAnsi"/>
+        </w:rPr>
       </w:r>
     </w:p>
     <w:p>
@@ -20588,7 +20541,7 @@
         <w:rPr>
           <w:rFonts w:asciiTheme="majorHAnsi" w:hAnsiTheme="majorHAnsi" w:cstheme="majorHAnsi"/>
         </w:rPr>
-        <w:t>Hosting on the public internet required three changes. The camera sends a device token in an HTTP header, and the service rejects uploads without a matching token. The service rejects payloads above 1 MB so a malformed upload cannot exhaust its memory. And because PythonAnywhere servers run in UTC, the schedule computes all times in Singapore time explicitly. Without this, the 08:00 slot would have fired at 16:00 local time.</w:t>
+        <w:t>Hosting on the public internet required three changes. The camera sends a device token in an HTTP header, and the service rejects uploads without a matching token. The service rejects payloads above 1 MB so a malformed upload cannot exhaust its memory. Because PythonAnywhere servers run in UTC, the schedule also computes all times in Singapore time explicitly. Without this, the 08:00 slot would have fired at 16:00 local time.</w:t>
       </w:r>
     </w:p>
     <w:p>
@@ -21078,7 +21031,7 @@
         <w:rPr>
           <w:rFonts w:asciiTheme="majorHAnsi" w:hAnsiTheme="majorHAnsi" w:cstheme="majorHAnsi"/>
         </w:rPr>
-        <w:t>Three further design choices sit behind this table. First, the baseline is frozen while the camera is in the obstruction state, so a leaf or glare on the lens is not absorbed into the pond’s normal level. Second, outside daylight hours every state falls back to the base schedule, so a dynamic or obstructed state cannot wake the camera all night for dark frames. Third, a wake up to 10 minutes before a slot counts as that slot, because the ESP32’s sleep timer drifts and might otherwise wake just early and schedule a second capture a few seconds later.</w:t>
+        <w:t>Three further design choices sit behind this table. First, the baseline is frozen while the camera is in the obstruction state, so a leaf or glare on the lens is not absorbed into the pond’s normal level. Second, outside daylight hours every state falls back to the base schedule, so a dynamic or obstructed state cannot wake the camera all night for dark frames. Third, a wake up to 10 minutes before a slot counts as that slot, because the ESP32’s sleep timer drifts and might otherwise wake a little early and schedule a second capture a few seconds later.</w:t>
       </w:r>
     </w:p>
     <w:p>
@@ -21092,8 +21045,7 @@
         <w:rPr>
           <w:rFonts w:asciiTheme="majorHAnsi" w:hAnsiTheme="majorHAnsi" w:cstheme="majorHAnsi"/>
         </w:rPr>
-        <w:lastRenderedPageBreak/>
-        <w:t>Two parts of the earlier design are not yet implemented. The dynamic state uses a fixed 30-minute interval instead of the planned 2-hour, 1-hour and 30-minute steps. The state machine also changes state on a single frame in both directions, so one noisy frame can start 30-minute captures. Requiring two raised frames to enter the dynamic state and several stable frames to leave it would reduce this, at the cost of reacting one interval later to a genuine change. The owner alert for an obstruction is also not yet sent. These are recorded as limitations in Section 7.3.</w:t>
+        <w:t>Two parts of the earlier design are not yet implemented. The dynamic state uses a fixed 30-minute interval instead of the planned 2-hour, 1-hour and 30-minute steps. The state machine also changes state on a single frame in both directions, so one noisy frame can start 30-minute captures. Requiring two raised frames to enter the dynamic state and several stable frames to leave it would reduce this, at the cost of reacting one interval later to a genuine change. The owner alert for an obstruction is also not yet sent. These are recorded as limitations in Section 8.3.</w:t>
       </w:r>
     </w:p>
     <w:p>
@@ -22049,7 +22001,7 @@
         <w:rPr>
           <w:rFonts w:asciiTheme="majorHAnsi" w:hAnsiTheme="majorHAnsi" w:cstheme="majorHAnsi"/>
         </w:rPr>
-        <w:t>The digital twin service holds one model object per pond, called a pond twin, which contains the three domain engines. A single logged event often affects several engines at once. A water change dilutes the chemistry pools, resets the evaporation engine’s accumulated loss and dilutes suspended algae. If each engine were stored and locked separately, a failure part-way through could leave the pond “diluted but still 12 % evaporated”, a state that never existed. Holding the three engines in one object, under one lock, saved as one snapshot, makes that kind of partial update impossible.</w:t>
+        <w:t>The digital twin service holds one model object per pond, called a pond twin, which contains the three domain engines. A single logged event often affects several engines at once. A water change dilutes the chemistry pools, resets the evaporation engine’s accumulated loss and dilutes suspended algae. If each engine were stored and locked separately, a failure part-way through could leave the pond “diluted but still 12 % evaporated,” a state that never existed. Holding the three engines in one object, under one lock, saved as one snapshot, makes that kind of partial update impossible.</w:t>
       </w:r>
     </w:p>
     <w:p>
@@ -22098,13 +22050,12 @@
           <w:b/>
           <w:bCs/>
         </w:rPr>
-        <w:t>Chemistry.</w:t>
-      </w:r>
-      <w:r>
-        <w:rPr>
-          <w:rFonts w:asciiTheme="majorHAnsi" w:hAnsiTheme="majorHAnsi" w:cstheme="majorHAnsi"/>
-        </w:rPr>
-        <w:t xml:space="preserve"> The chemistry engine tracks total ammonia nitrogen (TAN), nitrite and nitrate as masses in the pond volume. Each logged feed adds TAN in proportion to the feed mass, its protein fraction, a nitrogen content of 16 % of protein and an excreted fraction of 70 %. Between samples, first-order rates convert TAN to nitrite and nitrite to nitrate, both scaled by a temperature factor that peaks at 28 °C and falls away on either side. Light-dependent algal uptake removes nitrate. A water change removes the stated fraction of each pool and blends nitrate toward the tap-water level. The engine also computes a daily pH “reactivity”, the day’s pH swing divided by its mean light, as an indicator of buffering. Its trend over at least three days, together with the TAN and nitrate estimates, the TDS trend and incoming rain, forms a risk score that maps to green, amber and red. A nitrite estimate above 0.5 mg/L forces a red status regardless of score. Section 2.6.6 explains why these rate constants should be treated as placeholders until they are calibrated against the pond.</w:t>
+        <w:t>Chemistry. The chemistry engine tracks total ammonia nitrogen (TAN), nitrite and nitrate as masses in the pond volume. Each logged feed adds TAN in proportion to the feed mass, its protein fraction, a nitrogen content of 16 % of protein and an excreted fraction of 70 %. Between samples, first-order rates convert TAN to nitrite and nitrite to nitrate, both scaled by a temperature factor that peaks at 28 °C and falls away on either side. Light-dependent algal uptake removes nitrate. A water change removes the stated fraction of each pool and blends nitrate toward the tap-water level. The engine also computes a daily pH “reactivity,” the day’s pH swing divided by its mean light, as an indicator of buffering. Its trend over at least 3 days, together with the TAN and nitrate estimates, the TDS trend and incoming rain, forms a risk score that maps to green, amber and red. A nitrite estimate above 0.5 mg/L forces a red status regardless of score. Section 2.6.6 explains why these rate constants should be treated as placeholders until they are calibrated against the pond.</w:t>
+      </w:r>
+      <w:r>
+        <w:rPr>
+          <w:rFonts w:asciiTheme="majorHAnsi" w:hAnsiTheme="majorHAnsi" w:cstheme="majorHAnsi"/>
+        </w:rPr>
       </w:r>
     </w:p>
     <w:p>
@@ -22201,7 +22152,7 @@
         <w:rPr>
           <w:rFonts w:asciiTheme="majorHAnsi" w:hAnsiTheme="majorHAnsi" w:cstheme="majorHAnsi"/>
         </w:rPr>
-        <w:t>Before any reading reaches a model, a validation gate checks it. A value outside a plausible range is rejected and replaced by the last trusted value. A value repeated unchanged for four samples is flagged as a possibly stalled sensor. A value that moves faster than a channel’s plausible rate, with no water change or top-up logged within six hours, is treated as drift. A TDS reading below 5 ppm is taken to mean the probe is out of the water. Each rejected or flagged value carries a reason that is passed to the application as a sensor warning, so the owner sees why a reading was not used.</w:t>
+        <w:t>Before any reading reaches a model, a validation gate checks it. A value outside a plausible range is rejected and replaced by the last trusted value. A value repeated unchanged for four samples is flagged as a possibly stalled sensor. A value that moves faster than a channel’s plausible rate, with no water change or top-up logged within 6 hours, is treated as drift. A TDS reading below 5 ppm is taken to mean the probe is out of the water. Each rejected or flagged value carries a reason that is passed to the application as a sensor warning, so the owner sees why a reading was not used.</w:t>
       </w:r>
     </w:p>
     <w:p>
@@ -22215,7 +22166,7 @@
         <w:rPr>
           <w:rFonts w:asciiTheme="majorHAnsi" w:hAnsiTheme="majorHAnsi" w:cstheme="majorHAnsi"/>
         </w:rPr>
-        <w:t>The poller reads the latest reading for each channel at each poll and stamps it with the poll time. At the production interval, this means one reading in three reaches the models, and the recorded time can differ from the sample time by up to 15 minutes. For the slowly changing quantities the engines model this loss of resolution has little effect, and it kept the poller simple. It becomes a problem if the node stops reporting, because the same last reading is presented again at each poll until the stale check flags it after four polls, about one hour. Reading all rows since the previous poll, using their own sample times, would remove both effects and is listed in Section 7.4.</w:t>
+        <w:t>The poller reads the latest reading for each channel at each poll and stamps it with the poll time. At the production interval, this means one reading in three reaches the models, and the recorded time can differ from the sample time by up to 15 minutes. For the slowly changing quantities the engines model, this loss of resolution has little effect, and it kept the poller simple. It becomes a problem if the node stops reporting, because the same last reading is presented again at each poll until the stale check flags it after four polls, about 1 hour. Reading all rows since the previous poll, using their own sample times, would remove both effects and is listed in Section 8.4.</w:t>
       </w:r>
     </w:p>
     <w:p>
@@ -22247,14 +22198,12 @@
         <w:rPr>
           <w:rFonts w:asciiTheme="majorHAnsi" w:hAnsiTheme="majorHAnsi" w:cstheme="majorHAnsi"/>
         </w:rPr>
-        <w:t xml:space="preserve">The implemented use of TDS is limited to the two roles in Section 3.2.4.1: a slope term in the chemistry risk that cannot act alone, and an independent check on the evaporation </w:t>
-      </w:r>
-      <w:r>
-        <w:rPr>
-          <w:rFonts w:asciiTheme="majorHAnsi" w:hAnsiTheme="majorHAnsi" w:cstheme="majorHAnsi"/>
-        </w:rPr>
-        <w:lastRenderedPageBreak/>
-        <w:t>estimate. The engine compares the observed TDS slope with the slope predicted from evaporative concentration. If the ratio lies between 0.4 and 2.5 the estimate is marked as corroborated, and otherwise it is marked as under- or over-predicted, which the application shows beside the top-up forecast.</w:t>
+        <w:t>The implemented use of TDS is limited to the two roles in Section 3.2.4.1: a slope term in the chemistry risk that cannot act alone, and an independent check on the evaporation estimate. The engine compares the observed TDS slope with the slope predicted from evaporative concentration. If the ratio lies between 0.4 and 2.5, the estimate is marked as corroborated, and otherwise it is marked as under- or over-predicted, which the application shows beside the top-up forecast.</w:t>
+      </w:r>
+      <w:r>
+        <w:rPr>
+          <w:rFonts w:asciiTheme="majorHAnsi" w:hAnsiTheme="majorHAnsi" w:cstheme="majorHAnsi"/>
+        </w:rPr>
       </w:r>
     </w:p>
     <w:p>
@@ -22328,14 +22277,12 @@
         <w:rPr>
           <w:rFonts w:asciiTheme="majorHAnsi" w:hAnsiTheme="majorHAnsi" w:cstheme="majorHAnsi"/>
         </w:rPr>
-        <w:t xml:space="preserve">The cost of local hosting is that the model service is reachable only on the same network as the machine running it. The application handles this by falling back to a simpler client-side pH assessment when the service does not respond (Section 3.12). Moving the twin to an </w:t>
-      </w:r>
-      <w:r>
-        <w:rPr>
-          <w:rFonts w:asciiTheme="majorHAnsi" w:hAnsiTheme="majorHAnsi" w:cstheme="majorHAnsi"/>
-        </w:rPr>
-        <w:lastRenderedPageBreak/>
-        <w:t>always-on host that supports a long-running process needs no change to its design, and it is listed in Section 7.4.</w:t>
+        <w:t>The cost of local hosting is that the model service is reachable only on the same network as the machine running it. The application handles this by falling back to a simpler client-side pH assessment when the service does not respond (Section 3.12). Moving the twin to an always-on host that supports a long-running process needs no change to its design, and it is listed in Section 8.4.</w:t>
+      </w:r>
+      <w:r>
+        <w:rPr>
+          <w:rFonts w:asciiTheme="majorHAnsi" w:hAnsiTheme="majorHAnsi" w:cstheme="majorHAnsi"/>
+        </w:rPr>
       </w:r>
     </w:p>
     <w:p>
@@ -22578,7 +22525,7 @@
         <w:rPr>
           <w:rFonts w:asciiTheme="majorHAnsi" w:hAnsiTheme="majorHAnsi" w:cstheme="majorHAnsi"/>
         </w:rPr>
-        <w:t>The antenna should be kept away from the water surface, battery pack and sensor cables. Water absorbs 2.4 GHz energy and a metal or battery mass can shield the antenna. A stronger link shortens connection time and reduces retransmission energy. The camera window needs a hood and a fixed mount so rain, glare and movement do not trigger the obstruction or dynamic states unnecessarily.</w:t>
+        <w:t>The antenna should be kept away from the water surface, battery pack and sensor cables. Water absorbs 2.4 GHz energy, and a metal or battery mass can shield the antenna. A stronger link shortens connection time and reduces retransmission energy. The camera window needs a hood and a fixed mount so rain, glare and movement do not trigger the obstruction or dynamic states unnecessarily.</w:t>
       </w:r>
     </w:p>
     <w:p>
@@ -22643,7 +22590,7 @@
         <w:rPr>
           <w:rFonts w:asciiTheme="majorHAnsi" w:hAnsiTheme="majorHAnsi" w:cstheme="majorHAnsi"/>
         </w:rPr>
-        <w:t>The preceding sections describe what was built and why. This section states the requirements those choices were meant to satisfy, so that the testing in Chapter 4 has a fixed target. Functional requirements describe what the system must do and non-functional requirements describe how well it must do it.</w:t>
+        <w:t>The preceding sections describe what was built and why. This section states the requirements those choices were meant to satisfy, so that the testing in Chapter 4 has a fixed target. Functional requirements describe what the system must do, and non-functional requirements describe how well it must do it.</w:t>
       </w:r>
     </w:p>
     <w:p>
@@ -23882,7 +23829,7 @@
         <w:rPr>
           <w:rFonts w:asciiTheme="majorHAnsi" w:hAnsiTheme="majorHAnsi" w:cstheme="majorHAnsi"/>
         </w:rPr>
-        <w:t>F11 no longer includes the context prompts for unexplained TDS changes, and salt addition and filter cleaning are not yet event types. Both are deferred until the TDS bench tests in Section 4.4.3.1 show whether the prompts are useful. F12 is met by status levels and advisory messages shown on the dashboard and detail screens. Push notifications, which would reach an owner who is not using the application, are not implemented and are discussed in Section 7.3.</w:t>
+        <w:t>F11 no longer includes the context prompts for unexplained TDS changes, and salt addition and filter cleaning are not yet event types. Both are deferred until the TDS bench tests in Section 4.4.3.1 show whether the prompts are useful. F12 is met by status levels and advisory messages shown on the dashboard and detail screens. Push notifications, which would reach an owner who is not using the application, are not implemented and are discussed in Section 8.3.</w:t>
       </w:r>
     </w:p>
     <w:p>
@@ -24167,20 +24114,8 @@
             <w:tcW w:w="0" w:type="auto"/>
           </w:tcPr>
           <w:p>
-            <w:pPr>
-              <w:pStyle w:val="Compact"/>
-              <w:spacing w:before="20" w:after="20" w:line="264" w:lineRule="auto"/>
-              <w:jc w:val="left"/>
-              <w:rPr>
-                <w:rFonts w:asciiTheme="majorHAnsi" w:hAnsiTheme="majorHAnsi" w:cstheme="majorHAnsi"/>
-              </w:rPr>
-            </w:pPr>
-            <w:r>
-              <w:rPr>
-                <w:rFonts w:asciiTheme="majorHAnsi" w:hAnsiTheme="majorHAnsi" w:cstheme="majorHAnsi"/>
-                <w:sz w:val="19"/>
-              </w:rPr>
-              <w:t>Measured and reported, with at least 7 days on the test pack at the five-minute rate</w:t>
+            <w:r>
+              <w:t>Measured and reported, with at least 7 days on the test pack at the 5-minute rate</w:t>
             </w:r>
           </w:p>
         </w:tc>
@@ -24786,8 +24721,7 @@
         <w:rPr>
           <w:rFonts w:asciiTheme="majorHAnsi" w:hAnsiTheme="majorHAnsi" w:cstheme="majorHAnsi"/>
         </w:rPr>
-        <w:lastRenderedPageBreak/>
-        <w:t>The N2 target was lowered from two weeks when the power arrangement changed. Section 3.3.2 shows that a service interval of about 11 days on four AAA cells requires a low-sleep board and a buck converter, and about four weeks requires larger cells as well. Setting the target at 7 days on the test pack keeps it achievable with the planned board change, while the measurement itself decides the stated figure.</w:t>
+        <w:t>The N2 target was lowered from 2 weeks when the power arrangement changed. Section 3.3.2 shows that a service interval of about 11 days on four AAA cells requires a low-sleep board and a buck converter, and about 4 weeks requires larger cells as well. Setting the target at 7 days on the test pack keeps it achievable with the planned board change, while the measurement itself decides the stated figure.</w:t>
       </w:r>
     </w:p>
     <w:p>
@@ -24899,7 +24833,7 @@
         <w:rPr>
           <w:rFonts w:asciiTheme="majorHAnsi" w:hAnsiTheme="majorHAnsi" w:cstheme="majorHAnsi"/>
         </w:rPr>
-        <w:t>The earlier design proposed prompts that ask the owner for context when TDS changes without an explanation. For the reasons in Section 3.9.4 these are deferred. The owner can still log any event at any time, and the detail screens show logged events as markers on the same timeline as the sensor readings, which lets the owner relate a change in a reading to something they did. The screens keep measured values, owner records and model estimates visually separate.</w:t>
+        <w:t>The earlier design proposed prompts that ask the owner for context when TDS changes without an explanation. For the reasons in Section 3.9.4, these are deferred. The owner can still log any event at any time, and the detail screens show logged events as markers on the same timeline as the sensor readings, which lets the owner relate a change in a reading to something they did. The screens keep measured values, owner records and model estimates visually separate.</w:t>
       </w:r>
     </w:p>
     <w:p>
@@ -26163,8 +26097,7 @@
         <w:rPr>
           <w:rFonts w:asciiTheme="majorHAnsi" w:hAnsiTheme="majorHAnsi" w:cstheme="majorHAnsi"/>
         </w:rPr>
-        <w:lastRenderedPageBreak/>
-        <w:t>The move from the RS485 pH front end to the analogue kit removed an 8 V buck converter, a 5 V buck converter and a ten-cell battery holder from the bill. The budget should be read against the direct-sensing alternatives reviewed in Chapter 2. Continuous nitrate instruments were reported at USD 15,000 to 25,000 per unit, and a lower-cost research prototype still reached about USD 800. Dissolved oxygen probes add recurring membrane costs. The colorimetric badge and the batteries are recurring costs an owner would carry, and both should be recorded rather than hidden in the one-off total.</w:t>
+        <w:t>The move from the RS485 pH front end to the analogue kit removed an 8 V buck converter, a 5 V buck converter and a 10-cell battery holder from the bill. The budget should be read against the direct-sensing alternatives reviewed in Chapter 2. Continuous nitrate instruments were reported at USD 15,000 to 25,000 per unit, and a lower-cost research prototype still reached about USD 800. Dissolved oxygen probes add recurring membrane costs. The colorimetric badge and the batteries are recurring costs an owner would carry, and both should be recorded rather than hidden in the one-off total.</w:t>
       </w:r>
     </w:p>
     <w:p>
@@ -26261,7 +26194,7 @@
         <w:rPr>
           <w:rFonts w:asciiTheme="majorHAnsi" w:hAnsiTheme="majorHAnsi" w:cstheme="majorHAnsi"/>
         </w:rPr>
-        <w:t>This chapter defines the test sequence, acceptance limits and records for the hardware and the assembled system. The criteria are fixed before testing so that the results in Chapter 6 are judged against targets set in advance rather than against whatever the data happened to show. The automated software tests, which verify the firmware logic, the camera service and the digital twin without hardware, are reported in Chapter 5.</w:t>
+        <w:t>This chapter defines the test sequence, acceptance limits and records for the hardware and the assembled system. The criteria are fixed before testing so that the results in Chapter 7 are judged against targets set in advance rather than against whatever the data happened to show. The automated software tests, which verify the firmware logic, the camera service and the digital twin without hardware, are reported in Chapter 5.</w:t>
       </w:r>
     </w:p>
     <w:p>
@@ -26697,20 +26630,8 @@
             <w:tcW w:w="0" w:type="auto"/>
           </w:tcPr>
           <w:p>
-            <w:pPr>
-              <w:pStyle w:val="Compact"/>
-              <w:spacing w:before="20" w:after="20" w:line="264" w:lineRule="auto"/>
-              <w:jc w:val="left"/>
-              <w:rPr>
-                <w:rFonts w:asciiTheme="majorHAnsi" w:hAnsiTheme="majorHAnsi" w:cstheme="majorHAnsi"/>
-              </w:rPr>
-            </w:pPr>
-            <w:r>
-              <w:rPr>
-                <w:rFonts w:asciiTheme="majorHAnsi" w:hAnsiTheme="majorHAnsi" w:cstheme="majorHAnsi"/>
-                <w:sz w:val="19"/>
-              </w:rPr>
-              <w:t>One to two days</w:t>
+            <w:r>
+              <w:t>One to 2 days</w:t>
             </w:r>
           </w:p>
         </w:tc>
@@ -27745,7 +27666,7 @@
         <w:rPr>
           <w:rFonts w:asciiTheme="majorHAnsi" w:hAnsiTheme="majorHAnsi" w:cstheme="majorHAnsi"/>
         </w:rPr>
-        <w:t>T2 matters because an outdoor pond’s water temperature can swing 4 °C to 6 °C in a day. If the compensated reading still follows temperature, the daily cycle will look like a series of events and T4 will fail.</w:t>
+        <w:t>T2 matters because an outdoor pond’s water temperature can swing 4 °C to 6 °C in a day. If the compensated reading still follows temperature, the daily cycle will look like a series of events, and T4 will fail.</w:t>
       </w:r>
     </w:p>
     <w:p>
@@ -27843,7 +27764,7 @@
         <w:rPr>
           <w:rFonts w:asciiTheme="majorHAnsi" w:hAnsiTheme="majorHAnsi" w:cstheme="majorHAnsi"/>
         </w:rPr>
-        <w:t>If all four tests pass, the prompting design in Section 3.9.4 has evidence behind it. If T1 or T2 fail, the TDS channel stays a logged trend and an evaporation cross-check, and the report records the reason.</w:t>
+        <w:t>If all four tests pass, the prompting design in Section 3.9.4 has evidence behind it. If T1 or T2 fails, the TDS channel stays a logged trend and an evaporation cross-check, and the report records the reason.</w:t>
       </w:r>
     </w:p>
     <w:p>
@@ -28061,7 +27982,7 @@
         <w:rPr>
           <w:rFonts w:asciiTheme="majorHAnsi" w:hAnsiTheme="majorHAnsi" w:cstheme="majorHAnsi"/>
         </w:rPr>
-        <w:t>This outdoor test characterises two subsystems installed beside the pond. Subsystem A records water temperature, pH and light. Subsystem B captures pond images and records the camera service’s decisions. A three-hour attended rehearsal comes before a planned 48-hour unattended run. The run is intended to span two day and night cycles, and the results report the period actually achieved and any gaps.</w:t>
+        <w:t>This outdoor test characterises two subsystems installed beside the pond. Subsystem A records water temperature, pH and light. Subsystem B captures pond images and records the camera service’s decisions. A 3-hour attended rehearsal comes before a planned 48-hour unattended run. The run is intended to span 2 day-and-night cycles, and the results report the period actually achieved and any gaps.</w:t>
       </w:r>
     </w:p>
     <w:p>
@@ -28578,7 +28499,7 @@
         <w:rPr>
           <w:rFonts w:asciiTheme="majorHAnsi" w:hAnsiTheme="majorHAnsi" w:cstheme="majorHAnsi"/>
         </w:rPr>
-        <w:t>Each record keeps its sample time separately from its upload time, together with the device, cycle number, units, calibration state and any interruption (Section 4.5.5). Water temperature and local light are compared with the nearest NEA air temperature, rainfall and forecast records by their observation or validity times, with the station identity and distance kept. Weather records are coarser and less local than the pond readings, and two days of aligned data can support exploratory model tuning but not a causal claim.</w:t>
+        <w:t>Each record keeps its sample time separately from its upload time, together with the device, cycle number, units, calibration state and any interruption (Section 4.5.5). Water temperature and local light are compared with the nearest NEA air temperature, rainfall and forecast records by their observation or validity times, with the station identity and distance kept. Weather records are coarser and less local than the pond readings, and 2 days of aligned data can support exploratory model tuning but not a causal claim.</w:t>
       </w:r>
     </w:p>
     <w:p>
@@ -28744,7 +28665,7 @@
         <w:rPr>
           <w:rFonts w:asciiTheme="majorHAnsi" w:hAnsiTheme="majorHAnsi" w:cstheme="majorHAnsi"/>
         </w:rPr>
-        <w:t>Subsystem A runs at the five-minute production interval with sample and upload times logged. A full 48-hour run would contain 576 scheduled cycles. Every attempted cycle is kept, including failed reads and failed uploads. The report states the achieved duration, completed and missing cycles, reset count, per-channel spread, and the number of reference and state-driven camera frames. The weather export and the exact camera settings are kept with the dataset so later model work can reproduce the comparisons.</w:t>
+        <w:t>Subsystem A runs at the 5-minute production interval with sample and upload times logged. A full 48-hour run would contain 576 scheduled cycles. Every attempted cycle is kept, including failed reads and failed uploads. The report states the achieved duration, completed and missing cycles, reset count, per-channel spread, and the number of reference and state-driven camera frames. The weather export and the exact camera settings are kept with the dataset so later model work can reproduce the comparisons.</w:t>
       </w:r>
     </w:p>
     <w:p>
@@ -28864,7 +28785,7 @@
         <w:rPr>
           <w:rFonts w:asciiTheme="majorHAnsi" w:hAnsiTheme="majorHAnsi" w:cstheme="majorHAnsi"/>
         </w:rPr>
-        <w:t>Two limits apply to what these outputs can show. First, there are no direct ammonia, nitrite, nitrate or algae reference measurements in this run, so the chemistry and algae projections are reported as unvalidated model outputs. Second, two days give a working example of the pipeline and the pond’s short-term response, but little evidence about seasonal behaviour.</w:t>
+        <w:t>Two limits apply to what these outputs can show. First, there are no direct ammonia, nitrite, nitrate or algae reference measurements in this run, so the chemistry and algae projections are reported as unvalidated model outputs. Second, 2 days give a working example of the pipeline and the pond’s short-term response, but little evidence about seasonal behaviour.</w:t>
       </w:r>
     </w:p>
     <w:p>
@@ -28924,7 +28845,7 @@
         <w:rPr>
           <w:rFonts w:asciiTheme="majorHAnsi" w:hAnsiTheme="majorHAnsi" w:cstheme="majorHAnsi"/>
         </w:rPr>
-        <w:t>Events that happen during the run, such as a real feed or a top-up, are logged through the application at the time. This records them in the intervention table and applies them to the digital twin, and gives the later analysis context for unusual readings.</w:t>
+        <w:t>Events that happen during the run, such as a real feed or a top-up, are logged through the application at the time. This records them in the intervention table, applies them to the digital twin, and gives the later analysis context for unusual readings.</w:t>
       </w:r>
     </w:p>
     <w:p>
@@ -29143,20 +29064,8 @@
             <w:tcW w:w="0" w:type="auto"/>
           </w:tcPr>
           <w:p>
-            <w:pPr>
-              <w:pStyle w:val="Compact"/>
-              <w:spacing w:before="20" w:after="20" w:line="264" w:lineRule="auto"/>
-              <w:jc w:val="left"/>
-              <w:rPr>
-                <w:rFonts w:asciiTheme="majorHAnsi" w:hAnsiTheme="majorHAnsi" w:cstheme="majorHAnsi"/>
-              </w:rPr>
-            </w:pPr>
-            <w:r>
-              <w:rPr>
-                <w:rFonts w:asciiTheme="majorHAnsi" w:hAnsiTheme="majorHAnsi" w:cstheme="majorHAnsi"/>
-                <w:sz w:val="19"/>
-              </w:rPr>
-              <w:t>Run the complete sensor node indoors with probes in a container of water, from a fresh pack, at the five-minute production interval, until the regulator loses regulation. Do not intervene during the run</w:t>
+            <w:r>
+              <w:t>Run the complete sensor node indoors with probes in a container of water, from a fresh pack, at the 5-minute production interval, until the regulator loses regulation. Do not intervene during the run</w:t>
             </w:r>
           </w:p>
         </w:tc>
@@ -29591,20 +29500,8 @@
             <w:tcW w:w="0" w:type="auto"/>
           </w:tcPr>
           <w:p>
-            <w:pPr>
-              <w:pStyle w:val="Compact"/>
-              <w:spacing w:before="20" w:after="20" w:line="264" w:lineRule="auto"/>
-              <w:jc w:val="left"/>
-              <w:rPr>
-                <w:rFonts w:asciiTheme="majorHAnsi" w:hAnsiTheme="majorHAnsi" w:cstheme="majorHAnsi"/>
-              </w:rPr>
-            </w:pPr>
-            <w:r>
-              <w:rPr>
-                <w:rFonts w:asciiTheme="majorHAnsi" w:hAnsiTheme="majorHAnsi" w:cstheme="majorHAnsi"/>
-                <w:sz w:val="19"/>
-              </w:rPr>
-              <w:t>Deploy the complete system at the pond for several hours up to one day. Log a real feeding event and a top-up during the session and observe the resulting change in the modelled state</w:t>
+            <w:r>
+              <w:t>Deploy the complete system at the pond for several hours up to 1 day. Log a real feeding event and a top-up during the session and observe the resulting change in the modelled state</w:t>
             </w:r>
           </w:p>
         </w:tc>
@@ -29775,20 +29672,8 @@
             <w:tcW w:w="0" w:type="auto"/>
           </w:tcPr>
           <w:p>
-            <w:pPr>
-              <w:pStyle w:val="Compact"/>
-              <w:spacing w:before="20" w:after="20" w:line="264" w:lineRule="auto"/>
-              <w:jc w:val="left"/>
-              <w:rPr>
-                <w:rFonts w:asciiTheme="majorHAnsi" w:hAnsiTheme="majorHAnsi" w:cstheme="majorHAnsi"/>
-              </w:rPr>
-            </w:pPr>
-            <w:r>
-              <w:rPr>
-                <w:rFonts w:asciiTheme="majorHAnsi" w:hAnsiTheme="majorHAnsi" w:cstheme="majorHAnsi"/>
-                <w:sz w:val="19"/>
-              </w:rPr>
-              <w:t>Several hours to one day</w:t>
+            <w:r>
+              <w:t>Several hours to 1 day</w:t>
             </w:r>
           </w:p>
         </w:tc>
@@ -31097,7 +30982,7 @@
         <w:rPr>
           <w:rFonts w:asciiTheme="majorHAnsi" w:hAnsiTheme="majorHAnsi" w:cstheme="majorHAnsi"/>
         </w:rPr>
-        <w:t>The system grew feature by feature over about three months, and by late September 2026 each component worked but carried duplicated logic and some untested paths. A refactoring pass was then made in a separate working folder, component by component, in three rounds each. Each round looked for duplicated logic, dead code, inefficient work and untested behaviour, made the changes, and added tests for anything it touched. The refactored code keeps the original behaviour, wiring and interfaces unless a change is stated. Working in a separate folder kept the original, known-working code available for comparison while the refactored firmware is flashed and checked against it.</w:t>
+        <w:t>The system grew feature by feature over about 3 months, and by late September 2026 each component worked but carried duplicated logic and some untested paths. A refactoring pass was then made in a separate working folder, component by component, in three rounds each. Each round looked for duplicated logic, dead code, inefficient work and untested behaviour, made the changes, and added tests for anything it touched. The refactored code keeps the original behaviour, wiring and interfaces unless a change is stated. Working in a separate folder kept the original, known-working code available for comparison while the refactored firmware is flashed and checked against it.</w:t>
       </w:r>
     </w:p>
     <w:p>
@@ -32440,7 +32325,7 @@
         <w:rPr>
           <w:rFonts w:asciiTheme="majorHAnsi" w:hAnsiTheme="majorHAnsi" w:cstheme="majorHAnsi"/>
         </w:rPr>
-        <w:t>The camera service does not yet have an automated test suite in the repository. An earlier upload test script was removed with the old service. The corrections above have therefore not yet been checked by an automated test, and Section 4.4.6 defines the labelled-sequence test that will check them. Adding that sequence as an automated test, with Supabase replaced by an in-memory fake as the digital twin’s tests do, is a straightforward extension and is listed in Section 7.4.</w:t>
+        <w:t>The camera service does not yet have an automated test suite in the repository. An earlier upload test script was removed with the old service. The corrections above have therefore not yet been checked by an automated test, and Section 4.4.6 defines the labelled-sequence test that will check them. Adding that sequence as an automated test, with Supabase replaced by an in-memory fake as the digital twin’s tests do, is a straightforward extension and is listed in Section 8.4.</w:t>
       </w:r>
     </w:p>
     <w:p>
@@ -32490,7 +32375,7 @@
         <w:rPr>
           <w:rFonts w:asciiTheme="majorHAnsi" w:hAnsiTheme="majorHAnsi" w:cstheme="majorHAnsi"/>
         </w:rPr>
-        <w:t>The chemistry rules were first written in Dart inside the mobile application, where each card computed its own assessment from the sensor history. This caused two problems. The logic could not advance while the application was closed, so the modelled nitrogen pools had no way to follow the pond between uses. And the same rules had to be kept identical across several cards. The rules were therefore ported to Python as a server-side engine, with the same rate constants and validation logic, and the application now reads the result. The Python engine is the single source of the chemistry rules. The evaporation and algae engines were written on the server from the start.</w:t>
+        <w:t>The chemistry rules were first written in Dart inside the mobile application, where each card computed its own assessment from the sensor history. This caused two problems. The logic could not advance while the application was closed, so the modelled nitrogen pools had no way to follow the pond between uses. The same rules also had to be kept identical across several cards. The rules were therefore ported to Python as a server-side engine, with the same rate constants and validation logic, and the application now reads the result. The Python engine is the single source of the chemistry rules. The evaporation and algae engines were written on the server from the start.</w:t>
       </w:r>
     </w:p>
     <w:p>
@@ -32536,7 +32421,7 @@
         <w:rPr>
           <w:rFonts w:asciiTheme="majorHAnsi" w:hAnsiTheme="majorHAnsi" w:cstheme="majorHAnsi"/>
         </w:rPr>
-        <w:t>Table 5.3. Validation gate rules. The rate check is skipped when a water change or top-up was logged within six hours, and every channel is flagged as possibly stalled after four identical readings.</w:t>
+        <w:t>Table 5.3. Validation gate rules. The rate check is skipped when a water change or top-up was logged within 6 hours, and every channel is flagged as possibly stalled after four identical readings.</w:t>
       </w:r>
     </w:p>
     <w:tbl>
@@ -32739,20 +32624,8 @@
             <w:tcW w:w="0" w:type="auto"/>
           </w:tcPr>
           <w:p>
-            <w:pPr>
-              <w:pStyle w:val="Compact"/>
-              <w:spacing w:before="20" w:after="20" w:line="264" w:lineRule="auto"/>
-              <w:jc w:val="left"/>
-              <w:rPr>
-                <w:rFonts w:asciiTheme="majorHAnsi" w:hAnsiTheme="majorHAnsi" w:cstheme="majorHAnsi"/>
-              </w:rPr>
-            </w:pPr>
-            <w:r>
-              <w:rPr>
-                <w:rFonts w:asciiTheme="majorHAnsi" w:hAnsiTheme="majorHAnsi" w:cstheme="majorHAnsi"/>
-                <w:sz w:val="19"/>
-              </w:rPr>
-              <w:t>—</w:t>
+            <w:r>
+              <w:t>N/A</w:t>
             </w:r>
           </w:p>
         </w:tc>
@@ -32829,20 +32702,8 @@
             <w:tcW w:w="0" w:type="auto"/>
           </w:tcPr>
           <w:p>
-            <w:pPr>
-              <w:pStyle w:val="Compact"/>
-              <w:spacing w:before="20" w:after="20" w:line="264" w:lineRule="auto"/>
-              <w:jc w:val="left"/>
-              <w:rPr>
-                <w:rFonts w:asciiTheme="majorHAnsi" w:hAnsiTheme="majorHAnsi" w:cstheme="majorHAnsi"/>
-              </w:rPr>
-            </w:pPr>
-            <w:r>
-              <w:rPr>
-                <w:rFonts w:asciiTheme="majorHAnsi" w:hAnsiTheme="majorHAnsi" w:cstheme="majorHAnsi"/>
-                <w:sz w:val="19"/>
-              </w:rPr>
-              <w:t>—</w:t>
+            <w:r>
+              <w:t>N/A</w:t>
             </w:r>
           </w:p>
         </w:tc>
@@ -33040,7 +32901,7 @@
         <w:rPr>
           <w:rFonts w:asciiTheme="majorHAnsi" w:hAnsiTheme="majorHAnsi" w:cstheme="majorHAnsi"/>
         </w:rPr>
-        <w:t>The rate limit is what connects owner events to sensor validation. A 20 % water change can move TDS by tens of ppm within an hour, which would otherwise look like drift. Checking for a logged volume event within six hours lets the gate accept a real step while still rejecting an unexplained one.</w:t>
+        <w:t>The rate limit is what connects owner events to sensor validation. A 20 % water change can move TDS by tens of ppm within an hour, which would otherwise look like drift. Checking for a logged volume event within 6 hours lets the gate accept a real step while still rejecting an unexplained one.</w:t>
       </w:r>
     </w:p>
     <w:p>
@@ -33072,7 +32933,7 @@
         <w:rPr>
           <w:rFonts w:asciiTheme="majorHAnsi" w:hAnsiTheme="majorHAnsi" w:cstheme="majorHAnsi"/>
         </w:rPr>
-        <w:t>Section 3.9.1 explained why the three engines live in one pond twin object. In the implementation, every change goes through one registry function that takes the pond’s lock, loads the twin (restoring it from its Supabase snapshot if it is not in memory), applies the change, saves the new snapshot and releases the lock. The event endpoints and the poller both use this function, so there is exactly one path by which state can change. Snapshots carry a version and a separate section per engine. Snapshots from before the three engines were combined held only the chemistry engine; the loader recognises this older form and wraps it, so no pond lost its accumulated state when the structure changed.</w:t>
+        <w:t>Section 3.9.1 explained why the three engines live in one pond twin object. In the implementation, every change goes through one registry function that takes the pond’s lock, loads the twin (restoring it from its Supabase snapshot if it is not in memory), applies the change, saves the new snapshot and releases the lock. The event endpoints and the poller both use this function, so there is exactly one path by which state can change. Snapshots carry a version and a separate section per engine. Snapshots from before the three engines were combined held only the chemistry engine, and the loader recognises this older form and wraps it, so no pond lost its accumulated state when the structure changed.</w:t>
       </w:r>
     </w:p>
     <w:p>
@@ -33104,7 +32965,7 @@
         <w:rPr>
           <w:rFonts w:asciiTheme="majorHAnsi" w:hAnsiTheme="majorHAnsi" w:cstheme="majorHAnsi"/>
         </w:rPr>
-        <w:t>Each engine can project forward day by day under the NEA four-day outlook. The chemistry projection assumes the pond’s average daily feed over its recent feeding history, and reports the first day each risk level is reached. Beyond the four-day outlook it uses the pond’s own recent daily sensor averages as the assumed conditions. Two implementation choices keep projections consistent with the live status. The chemistry engine’s time step is a single function used both for real elapsed time and for simulated days, so a forecast day and a real day behave identically under the same conditions. And the risk thresholds are shared constants used by both the live assessment and the projection, so “first day at watch level” means the same thing as the current watch status. Projections run on copies of the engine state and never change it, so a read-only request cannot corrupt a pond’s state.</w:t>
+        <w:t>Each engine can project forward day by day under the NEA 4-day outlook. The chemistry projection assumes the pond’s average daily feed over its recent feeding history, and reports the first day each risk level is reached. Beyond the 4-day outlook it uses the pond’s own recent daily sensor averages as the assumed conditions. Two implementation choices keep projections consistent with the live status. The chemistry engine’s time step is a single function used both for real elapsed time and for simulated days, so a forecast day and a real day behave identically under the same conditions. The risk thresholds are also shared constants used by both the live assessment and the projection, so “first day at watch level” means the same thing as the current watch status. Projections run on copies of the engine state and never change it, so a read-only request cannot corrupt a pond’s state.</w:t>
       </w:r>
     </w:p>
     <w:p>
@@ -33210,7 +33071,7 @@
         <w:rPr>
           <w:rFonts w:asciiTheme="majorHAnsi" w:hAnsiTheme="majorHAnsi" w:cstheme="majorHAnsi"/>
         </w:rPr>
-        <w:t>The chemistry engine kept a record per day of trusted pH, light and TDS readings, used for the buffering and TDS trends, and never removed old days. On a long-running service this grows without limit. A 30-day retention limit was added. While adding it, a second fault appeared: day keys were built as text without zero padding, so “2026-10-5” sorted before “2026-9-1”, and a pruning rule based on comparing keys would have deleted the wrong days around month boundaries. The pruning now compares real dates. A dedicated test covers both the retention limit and the month-boundary case.</w:t>
+        <w:t>The chemistry engine kept a record per day of trusted pH, light and TDS readings, used for the buffering and TDS trends, and never removed old days. On a long-running service this grows without limit. A 30-day retention limit was added. While adding it, a second fault appeared: day keys were built as text without zero padding, so “2026-10-5” sorted before “2026-9-1,” and a pruning rule based on comparing keys would have deleted the wrong days around month boundaries. The pruning now compares real dates. A dedicated test covers both the retention limit and the month-boundary case.</w:t>
       </w:r>
     </w:p>
     <w:p>
@@ -33257,7 +33118,7 @@
         <w:rPr>
           <w:rFonts w:asciiTheme="majorHAnsi" w:hAnsiTheme="majorHAnsi" w:cstheme="majorHAnsi"/>
         </w:rPr>
-        <w:t>The NEA observations and forecasts reach Supabase through a retrieval service that calls the data.gov.sg real-time API. The poller and the application both read them through the bundled dashboard function, which also carries the latest sensor values (Section 3.8). A shared module converts the NEA forecast into model inputs: the two-hour nowcast text, falling back to the four-day outlook, gives the rain context, and the outlook’s temperature, humidity and wind bands give each forecast day’s conditions, with wind converted from knots to metres per second for the Penman formula. Keeping this conversion in one module means the poller’s rain decision and the forecast endpoint’s cannot drift apart.</w:t>
+        <w:t>The NEA observations and forecasts reach Supabase through a retrieval service that calls the data.gov.sg real-time API. The poller and the application both read them through the bundled dashboard function, which also carries the latest sensor values (Section 3.8). A shared module converts the NEA forecast into model inputs: the 2-hour nowcast text, falling back to the 4-day outlook, gives the rain context, and the outlook’s temperature, humidity and wind bands give each forecast day’s conditions, with wind converted from knots to metres per second for the Penman formula. Keeping this conversion in one module means the poller’s rain decision and the forecast endpoint’s cannot drift apart.</w:t>
       </w:r>
     </w:p>
     <w:p>
@@ -33566,7 +33427,7 @@
         <w:rPr>
           <w:rFonts w:asciiTheme="majorHAnsi" w:hAnsiTheme="majorHAnsi" w:cstheme="majorHAnsi"/>
         </w:rPr>
-        <w:t>Before the refactor the application had one test file, and it no longer compiled. The refactor added five test files: characterisation tests that fix the current behaviour of the temperature, pH and algae helper rules, widget tests for the pH card’s choice between the server assessment and the local fallback, and a test showing that the dashboard’s state survives a tab switch, which was confirmed to fail on the old code and pass on the fix. The refactor log records all of them passing. They were not re-run for this report because the Flutter toolchain was not available in the environment used for the backend and firmware tests. Writing the characterisation tests also exposed a quirk in the helper rules: the pH helper shifts each day by six hours before grouping, so N calendar days of data give only N − 1 groups that meet its minimum sample count. The contract test in Section 5.5 covers the part of the application most likely to fail silently.</w:t>
+        <w:t>Before the refactor the application had one test file, and it no longer compiled. The refactor added five test files: characterisation tests that fix the current behaviour of the temperature, pH and algae helper rules, widget tests for the pH card’s choice between the server assessment and the local fallback, and a test showing that the dashboard’s state survives a tab switch, which was confirmed to fail on the old code and pass on the fix. The refactor log records all of them passing. They were not re-run for this report because the Flutter toolchain was not available in the environment used for the backend and firmware tests. Writing the characterisation tests also exposed a quirk in the helper rules: the pH helper shifts each day by 6 hours before grouping, so N calendar days of data give only N − 1 groups that meet its minimum sample count. The contract test in Section 5.5 covers the part of the application most likely to fail silently.</w:t>
       </w:r>
     </w:p>
     <w:p>
@@ -33862,20 +33723,8 @@
             <w:tcW w:w="0" w:type="auto"/>
           </w:tcPr>
           <w:p>
-            <w:pPr>
-              <w:pStyle w:val="Compact"/>
-              <w:spacing w:before="20" w:after="20" w:line="264" w:lineRule="auto"/>
-              <w:jc w:val="left"/>
-              <w:rPr>
-                <w:rFonts w:asciiTheme="majorHAnsi" w:hAnsiTheme="majorHAnsi" w:cstheme="majorHAnsi"/>
-              </w:rPr>
-            </w:pPr>
-            <w:r>
-              <w:rPr>
-                <w:rFonts w:asciiTheme="majorHAnsi" w:hAnsiTheme="majorHAnsi" w:cstheme="majorHAnsi"/>
-                <w:sz w:val="19"/>
-              </w:rPr>
-              <w:t>A poll advances all three engines; each event resets the right engines; resets survive a snapshot round trip</w:t>
+            <w:r>
+              <w:t>A poll advances all three engines. Each event resets the right engines. Resets survive a snapshot round trip.</w:t>
             </w:r>
           </w:p>
         </w:tc>
@@ -34657,14 +34506,12 @@
         <w:rPr>
           <w:rFonts w:asciiTheme="majorHAnsi" w:hAnsiTheme="majorHAnsi" w:cstheme="majorHAnsi"/>
         </w:rPr>
-        <w:t xml:space="preserve">The tests have limits that should be stated alongside the pass counts. They show that the code does what its authors intended. They do not show that the intended behaviour is right for a real pond, which is what the rate constants, thresholds and model structure determine. The chemistry engine’s nitrification rates, the </w:t>
-      </w:r>
-      <w:r>
-        <w:rPr>
-          <w:rFonts w:asciiTheme="majorHAnsi" w:hAnsiTheme="majorHAnsi" w:cstheme="majorHAnsi"/>
-        </w:rPr>
-        <w:lastRenderedPageBreak/>
-        <w:t>evaporation shelter factor and the algae growth fallback are all placeholders from literature or judgement until they are calibrated against measurements. The contract test confirms that the keys match, but it does not check how the application displays them. And none of the tests exercises the real Supabase instance, the ESP32 hardware or the hosted camera service, which Chapter 4 covers.</w:t>
+        <w:t>The tests have limits that should be stated alongside the pass counts. They show that the code does what its authors intended. They do not show that the intended behaviour is right for a real pond, which is what the rate constants, thresholds and model structure determine. The chemistry engine’s nitrification rates, the evaporation shelter factor and the algae growth fallback are all placeholders from literature or judgement until they are calibrated against measurements. The contract test confirms that the keys match, but it does not check how the application displays them. None of the tests, moreover, exercises the real Supabase instance, the ESP32 hardware or the hosted camera service, which Chapter 4 covers.</w:t>
+      </w:r>
+      <w:r>
+        <w:rPr>
+          <w:rFonts w:asciiTheme="majorHAnsi" w:hAnsiTheme="majorHAnsi" w:cstheme="majorHAnsi"/>
+        </w:rPr>
       </w:r>
     </w:p>
     <w:p>
@@ -34696,7 +34543,7 @@
         <w:rPr>
           <w:rFonts w:asciiTheme="majorHAnsi" w:hAnsiTheme="majorHAnsi" w:cstheme="majorHAnsi"/>
         </w:rPr>
-        <w:t>The following limitations are known and are recorded here so that the results in Chapter 6 are read with them in mind. Section 7.4 proposes how each could be addressed.</w:t>
+        <w:t>The following limitations are known and are recorded here so that the results in Chapter 7 are read with them in mind. Section 8.4 proposes how each could be addressed.</w:t>
       </w:r>
     </w:p>
     <w:p>
@@ -34910,6 +34757,1385 @@
     <w:p>
       <w:pPr>
         <w:pStyle w:val="Heading1"/>
+      </w:pPr>
+      <w:r>
+        <w:t>Chapter 6: Exploiting NEA Telemetry and Forecasts for Preemptive Pond Management</w:t>
+      </w:r>
+    </w:p>
+    <w:p>
+      <w:pPr>
+        <w:pStyle w:val="Heading2"/>
+      </w:pPr>
+      <w:r>
+        <w:t>6.1 Introduction and Central Finding</w:t>
+      </w:r>
+    </w:p>
+    <w:p>
+      <w:pPr>
+        <w:pStyle w:val="FirstParagraph"/>
+      </w:pPr>
+      <w:r>
+        <w:t>Singapore's National Environment Agency distributes environmental data through the data.gov.sg platform at no cost and at high frequency. For a project concerned with the automated care of an outdoor koi pond, two products on that platform are of interest. The first is the real-time observation network, which reports rainfall, air temperature, relative humidity and wind as they are measured. The second is the forecast suite, which issues a 24-hour outlook broken into 6-hour regional periods, a 4-day outlook, and a 2-hour nowcast reissued roughly every 30 minutes. This chapter asks which parts of that supply carry information a pond controller could not obtain more cheaply from its own sensors, and answers the question across every lead time NEA actually offers rather than at a single horizon.</w:t>
+      </w:r>
+    </w:p>
+    <w:p>
+      <w:pPr>
+        <w:pStyle w:val="BodyText"/>
+      </w:pPr>
+      <w:r>
+        <w:t>The investigation arrived at a central finding considerably narrower than the project initially assumed, reached only after testing the rainfall hypothesis 7 separate ways and finding that it did not justify itself for pond chemistry. A slow, well-buffered chemical system is already served adequately by a gauge that reports what has fallen with certainty a few minutes after it falls, and warning a system like that in advance saves nothing worth the cost of building the warning. Heat prediction behaves differently for reasons that are physical rather than statistical, since the margin on dissolved oxygen narrows sharply above 30 degrees Celsius, the damage from a hot bright stretch accumulates over several days rather than one afternoon, and a 5-day heat run is exactly the situation in which knowing what is coming lets a keeper adjust feeding before the fish are already stressed. The forecast earns its place on that distinction between a fast, well-warned system and a slow, self-correcting one, and on very little beyond it.</w:t>
+      </w:r>
+    </w:p>
+    <w:p>
+      <w:pPr>
+        <w:pStyle w:val="BodyText"/>
+      </w:pPr>
+      <w:r>
+        <w:t>A further finding, developed later in the investigation once the rainfall and heat results were already in hand, concerns a 2-hour nowcast product not examined in the project's earlier work on this dataset. Because it is reissued every half hour and describes conditions in the immediate future rather than the coming days, it is the one layer in the whole forecast suite capable of genuine short-notice warning rather than same-day awareness. Section 6.7.3 shows that 79% of observed rain onsets in the record were flagged by an earlier nowcast issuance, with a median warning time of 50 minutes. No other product tested gives a pond keeper minutes of lead time on an event that has not yet started.</w:t>
+      </w:r>
+    </w:p>
+    <w:p>
+      <w:pPr>
+        <w:pStyle w:val="BodyText"/>
+      </w:pPr>
+      <w:r>
+        <w:t>Taken together, the four lead times NEA supplies, the 4-day outlook, the same-day periods forecast, the 2-hour nowcast, and the reactive value of the rain gauge itself, form a ladder in which each rung is useful for a different kind of decision, and none of them substitutes for the others. Section 6.9 turns that ladder into a concrete recommendation: a system that watches all four windows at once and raises whichever advisory the current lead time actually supports, rather than a single rule tuned to one horizon and silent about the rest.</w:t>
+      </w:r>
+    </w:p>
+    <w:p>
+      <w:pPr>
+        <w:pStyle w:val="Heading2"/>
+      </w:pPr>
+      <w:r>
+        <w:t>6.2 Data Sources and Collection Methodology</w:t>
+      </w:r>
+    </w:p>
+    <w:p>
+      <w:pPr>
+        <w:pStyle w:val="Heading3"/>
+      </w:pPr>
+      <w:r>
+        <w:t>6.2.1 Rainfall Observations</w:t>
+      </w:r>
+    </w:p>
+    <w:p>
+      <w:pPr>
+        <w:pStyle w:val="FirstParagraph"/>
+      </w:pPr>
+      <w:r>
+        <w:t>Rainfall was drawn from the v2 real-time rainfall API at data.gov.sg, which reports 5-minute station totals. A naive Woodlands station choice proved costly before any modelling began. Station S100, the geographically obvious proxy for the pond's location, reports on only 49.5% of days across the archive, a gap of whole missing days rather than partial-day shortfalls. Its 4 neighbouring stations, S104, S210, S211 and S227, each cover 92% to 94% of days individually, and averaging across the four reduces missing coverage to 25 days out of 2,391, or 99%. Every rainfall figure in this chapter uses that 4-station cluster mean rather than any single station.</w:t>
+      </w:r>
+    </w:p>
+    <w:p>
+      <w:pPr>
+        <w:pStyle w:val="BodyText"/>
+      </w:pPr>
+      <w:r>
+        <w:t>The API paginates at 25 readings per page. Early in the scraping work the completion signal was assumed to be a fixed page count, which failed silently on any day whose reading total happened to be an exact multiple of 25. The corrected scraper instead treats a short final page, or the absence of the pagination token the server returns, as the only trustworthy signal that a day is finished. The token itself decodes from base64 to the literal string offset=N, which let the scraper compute the next page directly rather than waiting on a round trip for each one. This shortened the rainfall collection considerably against the alternative of one request per page in strict sequence.</w:t>
+      </w:r>
+    </w:p>
+    <w:p>
+      <w:pPr>
+        <w:pStyle w:val="Heading3"/>
+      </w:pPr>
+      <w:r>
+        <w:t>6.2.2 24-Hour and 4-Day Forecasts</w:t>
+      </w:r>
+    </w:p>
+    <w:p>
+      <w:pPr>
+        <w:pStyle w:val="FirstParagraph"/>
+      </w:pPr>
+      <w:r>
+        <w:t>The 24-hour forecast issues a wording category for each of 5 regions across 4 6-hour periods per day, roughly 2 issuances daily. The 4-day outlook issues a temperature band and a wording category for each of the next 4 calendar days, also reissued roughly twice daily. Both were collected for the full span the real-time API exposes, from 1 February 2020 to the current date, yielding 9,266 block-level rows for the periods product and 9,264 rows for the outlook.</w:t>
+      </w:r>
+    </w:p>
+    <w:p>
+      <w:pPr>
+        <w:pStyle w:val="Heading3"/>
+      </w:pPr>
+      <w:r>
+        <w:t>6.2.3 Air Temperature and Relative Humidity</w:t>
+      </w:r>
+    </w:p>
+    <w:p>
+      <w:pPr>
+        <w:pStyle w:val="FirstParagraph"/>
+      </w:pPr>
+      <w:r>
+        <w:t>Air temperature and relative humidity observations are reported far more frequently than rainfall, once per minute rather than once every 5 minutes, which raised the page count for a full day from roughly 12 to roughly 58 per endpoint. Across the full record and 2 endpoints this implied on the order of a quarter of a million requests, several times the volume the rainfall scrape alone required, and closing a gap in this specific dataset consumed the majority of the 3 days of unattended scraping this chapter draws on.</w:t>
+      </w:r>
+    </w:p>
+    <w:p>
+      <w:pPr>
+        <w:pStyle w:val="BodyText"/>
+      </w:pPr>
+      <w:r>
+        <w:t>That gap existed because an earlier session's climate file, covering the period up to 2 June 2025, had no surviving generation script and could not simply be re-run. Rebuilding the temperature record from 2 June 2025 forward, rather than from the start of the archive, reduced the outstanding scrape from an estimated 77 hours to roughly 16, since the earlier period did not need to be repeated. Even at that reduced scope, unattended background runs of this length surfaced 2 separate classes of interruption before the collection actually completed.</w:t>
+      </w:r>
+    </w:p>
+    <w:p>
+      <w:pPr>
+        <w:pStyle w:val="BodyText"/>
+      </w:pPr>
+      <w:r>
+        <w:t>The first of the two was routine and had been expected from the outset, arising from the scraper's own retry logic rather than from anything external to it. The unauthenticated request rate is 6 calls per 10 seconds, and this project ran under a low authenticated rate rather than an unauthenticated one, so no external throttling was observed. The scraper's own exponential backoff on transient failures and its fixed wait on the rare rate-limit response meant a handful of days needed more than one attempt before the page count for that day matched the expected 58. The scraper's resumability, one JSON file per page with a completion marker written only once a day's last page is confirmed, meant no re-attempted day cost more than the pages that were actually missing.</w:t>
+      </w:r>
+    </w:p>
+    <w:p>
+      <w:pPr>
+        <w:pStyle w:val="BodyText"/>
+      </w:pPr>
+      <w:r>
+        <w:t>The second interruption was environmental rather than a defect in the scraper. The host machine repeatedly reclaimed memory from long-running background processes under general system load, unrelated to anything the scraper itself was doing, since its own memory footprint at any point in the run measured under 60 megabytes. Four such interruptions occurred across the run. Each cost nothing beyond the minutes needed to notice the process had stopped and relaunch it, because every page already written to disk survived the interruption and the scraper's own resumption logic correctly skipped every date already marked complete rather than re-fetching it. The collection was ultimately completed by launching the scraper as a process fully detached from the tool that was supervising it, which proved immune to the same reclamation that had repeatedly interrupted the supervised attempts. This detached run finished cleanly with zero page-level failures across the closing 636 day-endpoint pairs it still needed to fetch.</w:t>
+      </w:r>
+    </w:p>
+    <w:p>
+      <w:pPr>
+        <w:pStyle w:val="Heading3"/>
+      </w:pPr>
+      <w:r>
+        <w:t>6.2.4 The 2-Hour Nowcast</w:t>
+      </w:r>
+    </w:p>
+    <w:p>
+      <w:pPr>
+        <w:pStyle w:val="FirstParagraph"/>
+      </w:pPr>
+      <w:r>
+        <w:t>The 2-hour nowcast reports a wording category for each of 47 named areas across Singapore, valid for a 2-hour window beginning at the moment of issue and reissued roughly every 30 minutes. It was collected for the pond's Woodlands area specifically across the same full record as the other forecast products, yielding 146,135 issuances. This product had not been examined in the project's earlier work on this dataset, and its validation in section 6.7.3 is new.</w:t>
+      </w:r>
+    </w:p>
+    <w:p>
+      <w:pPr>
+        <w:pStyle w:val="Heading3"/>
+      </w:pPr>
+      <w:r>
+        <w:t>6.2.5 A Station Network Change and the Threshold It Broke</w:t>
+      </w:r>
+    </w:p>
+    <w:p>
+      <w:pPr>
+        <w:pStyle w:val="FirstParagraph"/>
+      </w:pPr>
+      <w:r>
+        <w:t>Closing the temperature gap described in section 6.2.3 introduced a defect that was found and corrected before any conclusion drawn from it was reported. The correction is recorded here because the failure mode is a general one and worth naming plainly rather than only fixing quietly. The pre-existing climate file used a 2-station average, apparently sampled at only 8 fixed times per day rather than continuously. The newly scraped portion used a full network mean across 12 to 33 stations sampled continuously. Averaging across more stations mechanically reduces day-to-day variance even when the underlying mean is unchanged, because station-to-station fluctuation partially cancels in the average the same way sampling error shrinks with sample size in any other statistical average.</w:t>
+      </w:r>
+    </w:p>
+    <w:p>
+      <w:pPr>
+        <w:pStyle w:val="BodyText"/>
+      </w:pPr>
+      <w:r>
+        <w:t>The two files were merged on the boundary date without accounting for this. Checking the merged file afterward showed the mean daily maximum temperature held flat across every year from 2020 to 2026 at roughly 31 to 32 degrees Celsius, while the standard deviation fell from a range of 1.7 to 2 degrees before the boundary to a range of 1.2 to 1.7 degrees after it. A fixed threshold calibrated on the higher-variance side of that boundary and applied unchanged past it will cross less often for a reason that has nothing to do with the climate or the forecast, and this is exactly what the merged data showed: a suppressed hot-day rate in every single calendar month after the switch rather than only in the months immediately surrounding it, the signature of a variance artefact rather than a seasonal or climatic one.</w:t>
+      </w:r>
+    </w:p>
+    <w:p>
+      <w:pPr>
+        <w:pStyle w:val="BodyText"/>
+      </w:pPr>
+      <w:r>
+        <w:t>The threshold was corrected by treating each side of the boundary as a separate measurement regime and re-deriving a second threshold for the new regime from its own mean and standard deviation, scaled so that the original regime's own hit rate on its own training period was preserved exactly. The effect of this single correction on the results that follow was large enough to be worth stating in one place before those results are presented. Precision on the strongest same-day heat rule in section 6.7.2 rose from 64% to 88.5% once the correction was applied, and the incremental skill test in section 6.7.1 reversed sign at every lead time tested, moving from no measurable gain to a clear and positive gain once observed temperature was measured consistently across the whole record rather than across two silently different instruments. Any later use of this dataset that extends it again with a further change in station coverage should repeat this variance check before trusting a threshold across the new boundary.</w:t>
+      </w:r>
+    </w:p>
+    <w:p>
+      <w:pPr>
+        <w:pStyle w:val="Heading2"/>
+      </w:pPr>
+      <w:r>
+        <w:t>6.3 Analytical Method</w:t>
+      </w:r>
+    </w:p>
+    <w:p>
+      <w:pPr>
+        <w:pStyle w:val="FirstParagraph"/>
+      </w:pPr>
+      <w:r>
+        <w:t>Every claim in this chapter is expressed as precision against a stated base rate, and as lift, the ratio of the two, because a raw hit rate on its own is close to meaningless in a climate where one forecast wording appears on a majority of days. A lift of 1 is exactly what chance produces at that firing rate. Every threshold, quantile cut and calibration constant was computed once on data up to 31 December 2024 and applied without adjustment to the period after that date, so a result reported for the held-out period reflects a rule fixed in advance rather than one tuned to the data it is being tested against. Uncertainty on a precision estimate is reported as a Wilson interval rather than a normal approximation, since several of the calibration tables in section 6.5 rest on samples small enough that a normal approximation would understate the true uncertainty.</w:t>
+      </w:r>
+    </w:p>
+    <w:p>
+      <w:pPr>
+        <w:pStyle w:val="BodyText"/>
+      </w:pPr>
+      <w:r>
+        <w:t>Two additional checks, described fully in section 6.8, were added later in the investigation once their value for distinguishing a real result from a base-rate artefact became apparent. A permutation control compares a rule's precision against 2,000 random selections of the same size from the same held-out pool, which distinguishes a rule doing real work from one that merely inherited a favourable base rate. A residual skill test removes the hottest 30% of days from the record entirely and asks whether the same rule still discriminates within what remains, which distinguishes a rule with graded skill from one that only ever calls the days a keeper would have noticed anyway.</w:t>
+      </w:r>
+    </w:p>
+    <w:p>
+      <w:pPr>
+        <w:pStyle w:val="Heading2"/>
+      </w:pPr>
+      <w:r>
+        <w:t>6.4 The Magnitude Argument: Why Rain Rarely Threatens Pond Chemistry</w:t>
+      </w:r>
+    </w:p>
+    <w:p>
+      <w:pPr>
+        <w:pStyle w:val="FirstParagraph"/>
+      </w:pPr>
+      <w:r>
+        <w:t>The dilution a rainfall event causes depends only on the depth of rain relative to the depth of the pond, since the exponential dilution relationship, 1 minus the exponent of negative rain depth over pond depth, has no surface-area term in it. A large shallow pond is therefore more exposed to a given rainfall total than a small deep one, and pond volume on its own is not a useful predictor of vulnerability.</w:t>
+      </w:r>
+    </w:p>
+    <w:p>
+      <w:pPr>
+        <w:pStyle w:val="BodyText"/>
+      </w:pPr>
+      <w:r>
+        <w:t>Across the full record the median wet day carried 16 millimetres of rain, and even the heaviest bracket of days, the 57 days classified as extreme with a median of 63 millimetres and a maximum of 173, produced a median carbonate hardness loss equivalent to 1.3 days of ordinary fish feeding load at the stocking density this project assumed, using a pond depth of 1.2 metres and the same nitrification stoichiometry, 7.14 milligrams of calcium carbonate consumed per milligram of ammonia nitrogen nitrified, that the rest of the digital twin already uses. Table 6.1 reproduces the full breakdown by rainfall bracket.</w:t>
+      </w:r>
+    </w:p>
+    <w:p>
+      <w:pPr>
+        <w:pStyle w:val="TableCaption"/>
+      </w:pPr>
+      <w:r>
+        <w:t>Table 6.1. Rainfall bracket, chemical dilution, and fish-day equivalent damage across the full record.</w:t>
+      </w:r>
+    </w:p>
+    <w:tbl>
+      <w:tblPr>
+        <w:tblStyle w:val="Table"/>
+        <w:tblW w:type="auto" w:w="0"/>
+        <w:tblLook w:firstColumn="1" w:firstRow="1" w:lastColumn="0" w:lastRow="0" w:noHBand="0" w:noVBand="1" w:val="04A0"/>
+      </w:tblPr>
+      <w:tblGrid>
+        <w:gridCol w:w="1504"/>
+        <w:gridCol w:w="1504"/>
+        <w:gridCol w:w="1504"/>
+        <w:gridCol w:w="1504"/>
+        <w:gridCol w:w="1504"/>
+        <w:gridCol w:w="1504"/>
+      </w:tblGrid>
+      <w:tr>
+        <w:tc>
+          <w:tcPr>
+            <w:tcW w:type="dxa" w:w="1504"/>
+          </w:tcPr>
+          <w:p>
+            <w:r>
+              <w:t>Bracket</w:t>
+            </w:r>
+          </w:p>
+        </w:tc>
+        <w:tc>
+          <w:tcPr>
+            <w:tcW w:type="dxa" w:w="1504"/>
+          </w:tcPr>
+          <w:p>
+            <w:r>
+              <w:t>Days</w:t>
+            </w:r>
+          </w:p>
+        </w:tc>
+        <w:tc>
+          <w:tcPr>
+            <w:tcW w:type="dxa" w:w="1504"/>
+          </w:tcPr>
+          <w:p>
+            <w:r>
+              <w:t>Median mm</w:t>
+            </w:r>
+          </w:p>
+        </w:tc>
+        <w:tc>
+          <w:tcPr>
+            <w:tcW w:type="dxa" w:w="1504"/>
+          </w:tcPr>
+          <w:p>
+            <w:r>
+              <w:t>Dilution</w:t>
+            </w:r>
+          </w:p>
+        </w:tc>
+        <w:tc>
+          <w:tcPr>
+            <w:tcW w:type="dxa" w:w="1504"/>
+          </w:tcPr>
+          <w:p>
+            <w:r>
+              <w:t>KH lost (dKH)</w:t>
+            </w:r>
+          </w:p>
+        </w:tc>
+        <w:tc>
+          <w:tcPr>
+            <w:tcW w:type="dxa" w:w="1504"/>
+          </w:tcPr>
+          <w:p>
+            <w:r>
+              <w:t>Fish-day equivalent</w:t>
+            </w:r>
+          </w:p>
+        </w:tc>
+      </w:tr>
+      <w:tr>
+        <w:tc>
+          <w:tcPr>
+            <w:tcW w:type="dxa" w:w="1504"/>
+          </w:tcPr>
+          <w:p>
+            <w:r>
+              <w:t>Dry</w:t>
+            </w:r>
+          </w:p>
+        </w:tc>
+        <w:tc>
+          <w:tcPr>
+            <w:tcW w:type="dxa" w:w="1504"/>
+          </w:tcPr>
+          <w:p>
+            <w:r>
+              <w:t>1,142</w:t>
+            </w:r>
+          </w:p>
+        </w:tc>
+        <w:tc>
+          <w:tcPr>
+            <w:tcW w:type="dxa" w:w="1504"/>
+          </w:tcPr>
+          <w:p>
+            <w:r>
+              <w:t>0.0</w:t>
+            </w:r>
+          </w:p>
+        </w:tc>
+        <w:tc>
+          <w:tcPr>
+            <w:tcW w:type="dxa" w:w="1504"/>
+          </w:tcPr>
+          <w:p>
+            <w:r>
+              <w:t>0.0%</w:t>
+            </w:r>
+          </w:p>
+        </w:tc>
+        <w:tc>
+          <w:tcPr>
+            <w:tcW w:type="dxa" w:w="1504"/>
+          </w:tcPr>
+          <w:p>
+            <w:r>
+              <w:t>0.00</w:t>
+            </w:r>
+          </w:p>
+        </w:tc>
+        <w:tc>
+          <w:tcPr>
+            <w:tcW w:type="dxa" w:w="1504"/>
+          </w:tcPr>
+          <w:p>
+            <w:r>
+              <w:t>0.00</w:t>
+            </w:r>
+          </w:p>
+        </w:tc>
+      </w:tr>
+      <w:tr>
+        <w:tc>
+          <w:tcPr>
+            <w:tcW w:type="dxa" w:w="1504"/>
+          </w:tcPr>
+          <w:p>
+            <w:r>
+              <w:t>Light</w:t>
+            </w:r>
+          </w:p>
+        </w:tc>
+        <w:tc>
+          <w:tcPr>
+            <w:tcW w:type="dxa" w:w="1504"/>
+          </w:tcPr>
+          <w:p>
+            <w:r>
+              <w:t>591</w:t>
+            </w:r>
+          </w:p>
+        </w:tc>
+        <w:tc>
+          <w:tcPr>
+            <w:tcW w:type="dxa" w:w="1504"/>
+          </w:tcPr>
+          <w:p>
+            <w:r>
+              <w:t>4.0</w:t>
+            </w:r>
+          </w:p>
+        </w:tc>
+        <w:tc>
+          <w:tcPr>
+            <w:tcW w:type="dxa" w:w="1504"/>
+          </w:tcPr>
+          <w:p>
+            <w:r>
+              <w:t>0.3%</w:t>
+            </w:r>
+          </w:p>
+        </w:tc>
+        <w:tc>
+          <w:tcPr>
+            <w:tcW w:type="dxa" w:w="1504"/>
+          </w:tcPr>
+          <w:p>
+            <w:r>
+              <w:t>0.01</w:t>
+            </w:r>
+          </w:p>
+        </w:tc>
+        <w:tc>
+          <w:tcPr>
+            <w:tcW w:type="dxa" w:w="1504"/>
+          </w:tcPr>
+          <w:p>
+            <w:r>
+              <w:t>0.08</w:t>
+            </w:r>
+          </w:p>
+        </w:tc>
+      </w:tr>
+      <w:tr>
+        <w:tc>
+          <w:tcPr>
+            <w:tcW w:type="dxa" w:w="1504"/>
+          </w:tcPr>
+          <w:p>
+            <w:r>
+              <w:t>Wet</w:t>
+            </w:r>
+          </w:p>
+        </w:tc>
+        <w:tc>
+          <w:tcPr>
+            <w:tcW w:type="dxa" w:w="1504"/>
+          </w:tcPr>
+          <w:p>
+            <w:r>
+              <w:t>386</w:t>
+            </w:r>
+          </w:p>
+        </w:tc>
+        <w:tc>
+          <w:tcPr>
+            <w:tcW w:type="dxa" w:w="1504"/>
+          </w:tcPr>
+          <w:p>
+            <w:r>
+              <w:t>16.2</w:t>
+            </w:r>
+          </w:p>
+        </w:tc>
+        <w:tc>
+          <w:tcPr>
+            <w:tcW w:type="dxa" w:w="1504"/>
+          </w:tcPr>
+          <w:p>
+            <w:r>
+              <w:t>1.3%</w:t>
+            </w:r>
+          </w:p>
+        </w:tc>
+        <w:tc>
+          <w:tcPr>
+            <w:tcW w:type="dxa" w:w="1504"/>
+          </w:tcPr>
+          <w:p>
+            <w:r>
+              <w:t>0.05</w:t>
+            </w:r>
+          </w:p>
+        </w:tc>
+        <w:tc>
+          <w:tcPr>
+            <w:tcW w:type="dxa" w:w="1504"/>
+          </w:tcPr>
+          <w:p>
+            <w:r>
+              <w:t>0.34</w:t>
+            </w:r>
+          </w:p>
+        </w:tc>
+      </w:tr>
+      <w:tr>
+        <w:tc>
+          <w:tcPr>
+            <w:tcW w:type="dxa" w:w="1504"/>
+          </w:tcPr>
+          <w:p>
+            <w:r>
+              <w:t>Heavy</w:t>
+            </w:r>
+          </w:p>
+        </w:tc>
+        <w:tc>
+          <w:tcPr>
+            <w:tcW w:type="dxa" w:w="1504"/>
+          </w:tcPr>
+          <w:p>
+            <w:r>
+              <w:t>114</w:t>
+            </w:r>
+          </w:p>
+        </w:tc>
+        <w:tc>
+          <w:tcPr>
+            <w:tcW w:type="dxa" w:w="1504"/>
+          </w:tcPr>
+          <w:p>
+            <w:r>
+              <w:t>36.8</w:t>
+            </w:r>
+          </w:p>
+        </w:tc>
+        <w:tc>
+          <w:tcPr>
+            <w:tcW w:type="dxa" w:w="1504"/>
+          </w:tcPr>
+          <w:p>
+            <w:r>
+              <w:t>3.0%</w:t>
+            </w:r>
+          </w:p>
+        </w:tc>
+        <w:tc>
+          <w:tcPr>
+            <w:tcW w:type="dxa" w:w="1504"/>
+          </w:tcPr>
+          <w:p>
+            <w:r>
+              <w:t>0.11</w:t>
+            </w:r>
+          </w:p>
+        </w:tc>
+        <w:tc>
+          <w:tcPr>
+            <w:tcW w:type="dxa" w:w="1504"/>
+          </w:tcPr>
+          <w:p>
+            <w:r>
+              <w:t>0.75</w:t>
+            </w:r>
+          </w:p>
+        </w:tc>
+      </w:tr>
+      <w:tr>
+        <w:tc>
+          <w:tcPr>
+            <w:tcW w:type="dxa" w:w="1504"/>
+          </w:tcPr>
+          <w:p>
+            <w:r>
+              <w:t>Extreme</w:t>
+            </w:r>
+          </w:p>
+        </w:tc>
+        <w:tc>
+          <w:tcPr>
+            <w:tcW w:type="dxa" w:w="1504"/>
+          </w:tcPr>
+          <w:p>
+            <w:r>
+              <w:t>57</w:t>
+            </w:r>
+          </w:p>
+        </w:tc>
+        <w:tc>
+          <w:tcPr>
+            <w:tcW w:type="dxa" w:w="1504"/>
+          </w:tcPr>
+          <w:p>
+            <w:r>
+              <w:t>63.2</w:t>
+            </w:r>
+          </w:p>
+        </w:tc>
+        <w:tc>
+          <w:tcPr>
+            <w:tcW w:type="dxa" w:w="1504"/>
+          </w:tcPr>
+          <w:p>
+            <w:r>
+              <w:t>5.1%</w:t>
+            </w:r>
+          </w:p>
+        </w:tc>
+        <w:tc>
+          <w:tcPr>
+            <w:tcW w:type="dxa" w:w="1504"/>
+          </w:tcPr>
+          <w:p>
+            <w:r>
+              <w:t>0.19</w:t>
+            </w:r>
+          </w:p>
+        </w:tc>
+        <w:tc>
+          <w:tcPr>
+            <w:tcW w:type="dxa" w:w="1504"/>
+          </w:tcPr>
+          <w:p>
+            <w:r>
+              <w:t>1.28</w:t>
+            </w:r>
+          </w:p>
+        </w:tc>
+      </w:tr>
+    </w:tbl>
+    <w:p>
+      <w:pPr>
+        <w:pStyle w:val="BodyText"/>
+      </w:pPr>
+      <w:r>
+        <w:t>The conclusion that follows from this table holds regardless of which reasonable chemical model or rainfall bracket boundary is used to derive it. Ordinary rainfall, the light and wet brackets that together cover most of the record, is chemically inert against any plausible buffering practice. Only the heavy and extreme brackets, fewer than 8% of days between them, approach a magnitude worth a chemistry response at all, and even at that extreme the damage is on the order of 1 day of ordinary biological load, not several. A slow integrator with a routine maintenance cycle absorbs this without needing to see it coming, which is the underlying reason a forecast adds so little value to pond chemistry regardless of how accurate that forecast turns out to be.</w:t>
+      </w:r>
+    </w:p>
+    <w:p>
+      <w:pPr>
+        <w:pStyle w:val="Heading2"/>
+      </w:pPr>
+      <w:r>
+        <w:t>6.5 Reliability of the Forecast Wording</w:t>
+      </w:r>
+    </w:p>
+    <w:p>
+      <w:pPr>
+        <w:pStyle w:val="FirstParagraph"/>
+      </w:pPr>
+      <w:r>
+        <w:t>The 24-hour periods forecast calls a wording category for each region and each 6-hour block, and pooling the 5 regions into one rank per block yields the tier distribution in Table 6.2, measured at the native block resolution before any daily pooling.</w:t>
+      </w:r>
+    </w:p>
+    <w:p>
+      <w:pPr>
+        <w:pStyle w:val="TableCaption"/>
+      </w:pPr>
+      <w:r>
+        <w:t>Table 6.2. Forecast tier share and the observed rainfall bucket that followed, at native block resolution.</w:t>
+      </w:r>
+    </w:p>
+    <w:tbl>
+      <w:tblPr>
+        <w:tblStyle w:val="Table"/>
+        <w:tblW w:type="auto" w:w="0"/>
+        <w:tblLook w:firstColumn="1" w:firstRow="1" w:lastColumn="0" w:lastRow="0" w:noHBand="0" w:noVBand="1" w:val="04A0"/>
+      </w:tblPr>
+      <w:tblGrid>
+        <w:gridCol w:w="1289"/>
+        <w:gridCol w:w="1289"/>
+        <w:gridCol w:w="1289"/>
+        <w:gridCol w:w="1289"/>
+        <w:gridCol w:w="1289"/>
+        <w:gridCol w:w="1289"/>
+        <w:gridCol w:w="1289"/>
+      </w:tblGrid>
+      <w:tr>
+        <w:tc>
+          <w:tcPr>
+            <w:tcW w:type="dxa" w:w="1289"/>
+          </w:tcPr>
+          <w:p>
+            <w:r>
+              <w:t>Tier</w:t>
+            </w:r>
+          </w:p>
+        </w:tc>
+        <w:tc>
+          <w:tcPr>
+            <w:tcW w:type="dxa" w:w="1289"/>
+          </w:tcPr>
+          <w:p>
+            <w:r>
+              <w:t>Share of blocks</w:t>
+            </w:r>
+          </w:p>
+        </w:tc>
+        <w:tc>
+          <w:tcPr>
+            <w:tcW w:type="dxa" w:w="1289"/>
+          </w:tcPr>
+          <w:p>
+            <w:r>
+              <w:t>P(dry)</w:t>
+            </w:r>
+          </w:p>
+        </w:tc>
+        <w:tc>
+          <w:tcPr>
+            <w:tcW w:type="dxa" w:w="1289"/>
+          </w:tcPr>
+          <w:p>
+            <w:r>
+              <w:t>P(light)</w:t>
+            </w:r>
+          </w:p>
+        </w:tc>
+        <w:tc>
+          <w:tcPr>
+            <w:tcW w:type="dxa" w:w="1289"/>
+          </w:tcPr>
+          <w:p>
+            <w:r>
+              <w:t>P(wet)</w:t>
+            </w:r>
+          </w:p>
+        </w:tc>
+        <w:tc>
+          <w:tcPr>
+            <w:tcW w:type="dxa" w:w="1289"/>
+          </w:tcPr>
+          <w:p>
+            <w:r>
+              <w:t>P(heavy)</w:t>
+            </w:r>
+          </w:p>
+        </w:tc>
+        <w:tc>
+          <w:tcPr>
+            <w:tcW w:type="dxa" w:w="1289"/>
+          </w:tcPr>
+          <w:p>
+            <w:r>
+              <w:t>P(extreme)</w:t>
+            </w:r>
+          </w:p>
+        </w:tc>
+      </w:tr>
+      <w:tr>
+        <w:tc>
+          <w:tcPr>
+            <w:tcW w:type="dxa" w:w="1289"/>
+          </w:tcPr>
+          <w:p>
+            <w:r>
+              <w:t>Fair</w:t>
+            </w:r>
+          </w:p>
+        </w:tc>
+        <w:tc>
+          <w:tcPr>
+            <w:tcW w:type="dxa" w:w="1289"/>
+          </w:tcPr>
+          <w:p>
+            <w:r>
+              <w:t>74.1%</w:t>
+            </w:r>
+          </w:p>
+        </w:tc>
+        <w:tc>
+          <w:tcPr>
+            <w:tcW w:type="dxa" w:w="1289"/>
+          </w:tcPr>
+          <w:p>
+            <w:r>
+              <w:t>57.7%</w:t>
+            </w:r>
+          </w:p>
+        </w:tc>
+        <w:tc>
+          <w:tcPr>
+            <w:tcW w:type="dxa" w:w="1289"/>
+          </w:tcPr>
+          <w:p>
+            <w:r>
+              <w:t>22.0%</w:t>
+            </w:r>
+          </w:p>
+        </w:tc>
+        <w:tc>
+          <w:tcPr>
+            <w:tcW w:type="dxa" w:w="1289"/>
+          </w:tcPr>
+          <w:p>
+            <w:r>
+              <w:t>14.4%</w:t>
+            </w:r>
+          </w:p>
+        </w:tc>
+        <w:tc>
+          <w:tcPr>
+            <w:tcW w:type="dxa" w:w="1289"/>
+          </w:tcPr>
+          <w:p>
+            <w:r>
+              <w:t>3.9%</w:t>
+            </w:r>
+          </w:p>
+        </w:tc>
+        <w:tc>
+          <w:tcPr>
+            <w:tcW w:type="dxa" w:w="1289"/>
+          </w:tcPr>
+          <w:p>
+            <w:r>
+              <w:t>1.9%</w:t>
+            </w:r>
+          </w:p>
+        </w:tc>
+      </w:tr>
+      <w:tr>
+        <w:tc>
+          <w:tcPr>
+            <w:tcW w:type="dxa" w:w="1289"/>
+          </w:tcPr>
+          <w:p>
+            <w:r>
+              <w:t>Light</w:t>
+            </w:r>
+          </w:p>
+        </w:tc>
+        <w:tc>
+          <w:tcPr>
+            <w:tcW w:type="dxa" w:w="1289"/>
+          </w:tcPr>
+          <w:p>
+            <w:r>
+              <w:t>4.3%</w:t>
+            </w:r>
+          </w:p>
+        </w:tc>
+        <w:tc>
+          <w:tcPr>
+            <w:tcW w:type="dxa" w:w="1289"/>
+          </w:tcPr>
+          <w:p>
+            <w:r>
+              <w:t>32.3%</w:t>
+            </w:r>
+          </w:p>
+        </w:tc>
+        <w:tc>
+          <w:tcPr>
+            <w:tcW w:type="dxa" w:w="1289"/>
+          </w:tcPr>
+          <w:p>
+            <w:r>
+              <w:t>35.0%</w:t>
+            </w:r>
+          </w:p>
+        </w:tc>
+        <w:tc>
+          <w:tcPr>
+            <w:tcW w:type="dxa" w:w="1289"/>
+          </w:tcPr>
+          <w:p>
+            <w:r>
+              <w:t>22.2%</w:t>
+            </w:r>
+          </w:p>
+        </w:tc>
+        <w:tc>
+          <w:tcPr>
+            <w:tcW w:type="dxa" w:w="1289"/>
+          </w:tcPr>
+          <w:p>
+            <w:r>
+              <w:t>7.2%</w:t>
+            </w:r>
+          </w:p>
+        </w:tc>
+        <w:tc>
+          <w:tcPr>
+            <w:tcW w:type="dxa" w:w="1289"/>
+          </w:tcPr>
+          <w:p>
+            <w:r>
+              <w:t>3.3%</w:t>
+            </w:r>
+          </w:p>
+        </w:tc>
+      </w:tr>
+      <w:tr>
+        <w:tc>
+          <w:tcPr>
+            <w:tcW w:type="dxa" w:w="1289"/>
+          </w:tcPr>
+          <w:p>
+            <w:r>
+              <w:t>Thundery</w:t>
+            </w:r>
+          </w:p>
+        </w:tc>
+        <w:tc>
+          <w:tcPr>
+            <w:tcW w:type="dxa" w:w="1289"/>
+          </w:tcPr>
+          <w:p>
+            <w:r>
+              <w:t>20.7%</w:t>
+            </w:r>
+          </w:p>
+        </w:tc>
+        <w:tc>
+          <w:tcPr>
+            <w:tcW w:type="dxa" w:w="1289"/>
+          </w:tcPr>
+          <w:p>
+            <w:r>
+              <w:t>21.1%</w:t>
+            </w:r>
+          </w:p>
+        </w:tc>
+        <w:tc>
+          <w:tcPr>
+            <w:tcW w:type="dxa" w:w="1289"/>
+          </w:tcPr>
+          <w:p>
+            <w:r>
+              <w:t>28.9%</w:t>
+            </w:r>
+          </w:p>
+        </w:tc>
+        <w:tc>
+          <w:tcPr>
+            <w:tcW w:type="dxa" w:w="1289"/>
+          </w:tcPr>
+          <w:p>
+            <w:r>
+              <w:t>26.3%</w:t>
+            </w:r>
+          </w:p>
+        </w:tc>
+        <w:tc>
+          <w:tcPr>
+            <w:tcW w:type="dxa" w:w="1289"/>
+          </w:tcPr>
+          <w:p>
+            <w:r>
+              <w:t>10.5%</w:t>
+            </w:r>
+          </w:p>
+        </w:tc>
+        <w:tc>
+          <w:tcPr>
+            <w:tcW w:type="dxa" w:w="1289"/>
+          </w:tcPr>
+          <w:p>
+            <w:r>
+              <w:t>13.2%</w:t>
+            </w:r>
+          </w:p>
+        </w:tc>
+      </w:tr>
+      <w:tr>
+        <w:tc>
+          <w:tcPr>
+            <w:tcW w:type="dxa" w:w="1289"/>
+          </w:tcPr>
+          <w:p>
+            <w:r>
+              <w:t>Moderate</w:t>
+            </w:r>
+          </w:p>
+        </w:tc>
+        <w:tc>
+          <w:tcPr>
+            <w:tcW w:type="dxa" w:w="1289"/>
+          </w:tcPr>
+          <w:p>
+            <w:r>
+              <w:t>0.5%</w:t>
+            </w:r>
+          </w:p>
+        </w:tc>
+        <w:tc>
+          <w:tcPr>
+            <w:tcW w:type="dxa" w:w="1289"/>
+          </w:tcPr>
+          <w:p>
+            <w:r>
+              <w:t>0.0%</w:t>
+            </w:r>
+          </w:p>
+        </w:tc>
+        <w:tc>
+          <w:tcPr>
+            <w:tcW w:type="dxa" w:w="1289"/>
+          </w:tcPr>
+          <w:p>
+            <w:r>
+              <w:t>50.0%</w:t>
+            </w:r>
+          </w:p>
+        </w:tc>
+        <w:tc>
+          <w:tcPr>
+            <w:tcW w:type="dxa" w:w="1289"/>
+          </w:tcPr>
+          <w:p>
+            <w:r>
+              <w:t>25.0%</w:t>
+            </w:r>
+          </w:p>
+        </w:tc>
+        <w:tc>
+          <w:tcPr>
+            <w:tcW w:type="dxa" w:w="1289"/>
+          </w:tcPr>
+          <w:p>
+            <w:r>
+              <w:t>25.0%</w:t>
+            </w:r>
+          </w:p>
+        </w:tc>
+        <w:tc>
+          <w:tcPr>
+            <w:tcW w:type="dxa" w:w="1289"/>
+          </w:tcPr>
+          <w:p>
+            <w:r>
+              <w:t>0.0%</w:t>
+            </w:r>
+          </w:p>
+        </w:tc>
+      </w:tr>
+      <w:tr>
+        <w:tc>
+          <w:tcPr>
+            <w:tcW w:type="dxa" w:w="1289"/>
+          </w:tcPr>
+          <w:p>
+            <w:r>
+              <w:t>Severe</w:t>
+            </w:r>
+          </w:p>
+        </w:tc>
+        <w:tc>
+          <w:tcPr>
+            <w:tcW w:type="dxa" w:w="1289"/>
+          </w:tcPr>
+          <w:p>
+            <w:r>
+              <w:t>0.4%</w:t>
+            </w:r>
+          </w:p>
+        </w:tc>
+        <w:tc>
+          <w:tcPr>
+            <w:tcW w:type="dxa" w:w="1289"/>
+          </w:tcPr>
+          <w:p>
+            <w:r>
+              <w:t>0.0%</w:t>
+            </w:r>
+          </w:p>
+        </w:tc>
+        <w:tc>
+          <w:tcPr>
+            <w:tcW w:type="dxa" w:w="1289"/>
+          </w:tcPr>
+          <w:p>
+            <w:r>
+              <w:t>0.0%</w:t>
+            </w:r>
+          </w:p>
+        </w:tc>
+        <w:tc>
+          <w:tcPr>
+            <w:tcW w:type="dxa" w:w="1289"/>
+          </w:tcPr>
+          <w:p>
+            <w:r>
+              <w:t>50.0%</w:t>
+            </w:r>
+          </w:p>
+        </w:tc>
+        <w:tc>
+          <w:tcPr>
+            <w:tcW w:type="dxa" w:w="1289"/>
+          </w:tcPr>
+          <w:p>
+            <w:r>
+              <w:t>0.0%</w:t>
+            </w:r>
+          </w:p>
+        </w:tc>
+        <w:tc>
+          <w:tcPr>
+            <w:tcW w:type="dxa" w:w="1289"/>
+          </w:tcPr>
+          <w:p>
+            <w:r>
+              <w:t>50.0%</w:t>
+            </w:r>
+          </w:p>
+        </w:tc>
+      </w:tr>
+    </w:tbl>
+    <w:p>
+      <w:pPr>
+        <w:pStyle w:val="BodyText"/>
+      </w:pPr>
+      <w:r>
+        <w:t>Two features of this table are worth stating as established rather than provisional. Moderate and Severe together cover under 1% of blocks, too few for either row to be read as a stable estimate, and the ordering between them is not monotonic. Moderate outperforms Severe at the heavy and extreme columns despite nominally describing less intense weather. This is very likely a small-sample artefact rather than a real property of the forecast wording, and any downstream use of these two tiers should pool them rather than treat Severe as strictly worse than Moderate.</w:t>
+      </w:r>
+    </w:p>
+    <w:p>
+      <w:pPr>
+        <w:pStyle w:val="BodyText"/>
+      </w:pPr>
+      <w:r>
+        <w:t>Thundery, the tier that fires on roughly one block in 5 at native resolution, is close to uninformative on its own. Mining every combination of regional and temporal wording against observed rainfall on the training years, and re-scoring each rule on the held-out period, found that the strongest rules for predicting heavy rain require 3 regions calling Thundery simultaneously, reaching a held-out lift of 5.7, well above any single region's own call. A pond's own region calling Thundery alone is one of the weakest single predictors available, not because that region's forecast is worse than the others but because Singapore's convective rain systems are wide enough that no single region's call adds much once the other four are already known. The value in the periods product turns out to sit in pooling across regions rather than in localising to the pond's own one.</w:t>
+      </w:r>
+    </w:p>
+    <w:p>
+      <w:pPr>
+        <w:pStyle w:val="Heading2"/>
+      </w:pPr>
+      <w:r>
+        <w:t>6.6 What Localisation and Aggregation Change</w:t>
+      </w:r>
+    </w:p>
+    <w:p>
+      <w:pPr>
+        <w:pStyle w:val="FirstParagraph"/>
+      </w:pPr>
+      <w:r>
+        <w:t>The finding in the previous section, that a pond's own region does not outperform the pool, was checked directly rather than inferred. Scoring each of the 5 regional forecasts separately against measured rainfall at the Woodlands cluster and ranking them by discrimination places the pond's own northern region no better than 4th of 5 at any adverse rainfall threshold tested, and pooling all 5 beats every individual region including the pond's own. This is consistent with a rainband wide enough to cover most of a 50-kilometre island at once, in which case 5 regional forecasts are 5 separate noisy readings of the same physical event rather than 5 genuinely different pieces of information, and averaging noisy readings of one shared signal is expected to outperform trusting any single one of them.</w:t>
+      </w:r>
+    </w:p>
+    <w:p>
+      <w:pPr>
+        <w:pStyle w:val="BodyText"/>
+      </w:pPr>
+      <w:r>
+        <w:t>A related check asked whether a forecast that has called a storm and been wrong tends to keep calling it, which would produce runs of false alarms ahead of a delayed real event rather than genuinely uninformative repetition. At the daily pooled resolution used throughout this chapter, a Thundery call that verified against actual heavy or extreme rain was followed by another Thundery call the next day roughly a third of the time, while a call that missed was followed by another call only 7% of the time, a real and fairly large gap in the opposite direction from the bracing hypothesis. The length of a current run of consecutive Thundery calls, however, carries essentially no information about whether today itself will bring heavy rain, an area under the curve of 0.508 against an uninformative value of 0.5. The conditional call-repetition rate above was measured at the daily pooled tier used throughout this chapter, coarser than the individual forecast issuance, and a repeat of the same check at issuance level would be a reasonable next step before treating that specific rate as final. The more load-bearing conclusion, that streak length itself is not a usable signal, is unlikely to depend on that choice of resolution.</w:t>
+      </w:r>
+    </w:p>
+    <w:p>
+      <w:pPr>
+        <w:pStyle w:val="Heading2"/>
+      </w:pPr>
+      <w:r>
+        <w:t>6.7 The Variable Window Action Ladder</w:t>
+      </w:r>
+    </w:p>
+    <w:p>
+      <w:pPr>
+        <w:pStyle w:val="FirstParagraph"/>
+      </w:pPr>
+      <w:r>
+        <w:t>The remainder of this chapter is organised around the four lead times NEA's forecast suite actually supplies, from the longest to the shortest, followed by the zero-lead value of the rain gauge itself. Each window answers a different kind of question, and each was validated against the training and held-out split described in section 6.3.</w:t>
+      </w:r>
+    </w:p>
+    <w:p>
+      <w:pPr>
+        <w:pStyle w:val="Heading3"/>
+      </w:pPr>
+      <w:r>
+        <w:t>6.7.1 Long Window: The 4-Day Outlook</w:t>
+      </w:r>
+    </w:p>
+    <w:p>
+      <w:pPr>
+        <w:pStyle w:val="FirstParagraph"/>
+      </w:pPr>
+      <w:r>
+        <w:t>Predicting a hot day 1, 3 and 5 days ahead from observed temperature alone, then again with the 4-day outlook's own temperature added, and measuring the change in discrimination with a moving-block bootstrap that respects the day-to-day correlation of weather, produced a positive and statistically clear gain at every horizon tested once the station network correction from section 6.2.5 was applied. The gain was 0.032 at 1 day, 0.037 at 3 days and 0.038 at 5 days, with every confidence interval entirely above zero. A control measurement using rainfall rather than heat as the outcome, run alongside the main test, found a gain of 0.058, also entirely above zero, so the outlook does carry real information about the days ahead for both quantities. Whether that information is useful is a separate question from whether it exists, and section 6.4 already answered it for rain. For heat, section 6.7.2 shows that the outlook remains useful even once a same-day sensor reading is available, which is why it is included as an actionable rather than merely informative layer in the ladder this chapter proposes.</w:t>
+      </w:r>
+    </w:p>
+    <w:p>
+      <w:pPr>
+        <w:pStyle w:val="Heading3"/>
+      </w:pPr>
+      <w:r>
+        <w:t>6.7.2 Short Same-Day Window: Pooled Periods</w:t>
+      </w:r>
+    </w:p>
+    <w:p>
+      <w:pPr>
+        <w:pStyle w:val="FirstParagraph"/>
+      </w:pPr>
+      <w:r>
+        <w:t>Two same-day rules were tested against the held-out period. A window rule fires when the day's pooled periods rank sits in the driest 16% of training days, and it reached a held-out precision of 86% for the day itself being dry, against a base rate of 52%, holding a lift above 1 in every one of the 7 years in the record with a standard deviation across those years of only 0.056. This is the most stable single result anywhere in this chapter and is well suited to scheduling maintenance that rain would interrupt, a water change or a filter clean, since acting on a false window costs only a wasted trip rather than any harm to the fish.</w:t>
+      </w:r>
+    </w:p>
+    <w:p>
+      <w:pPr>
+        <w:pStyle w:val="BodyText"/>
+      </w:pPr>
+      <w:r>
+        <w:t>A second rule, called PREEMPT, fires when the day is already observed to be hot and the 4-day outlook's own temperature for the days ahead is also in its hottest quarter of training days, predicting that the heat will hold rather than break over the next 3 days. Once the station network correction from section 6.2.5 was applied, this rule reached a held-out precision of 88.5% against a base rate of 52.5%, again clearing a lift above 1 in all 7 years, with the two most recent years, 2025 and 2026, sitting inside the same range as the 5 years before them rather than below it as an earlier, uncorrected pass of this analysis had reported. This is the highest-precision same-day advisory in the entire chapter, and the clearest case in the whole record of the outlook adding something a same-day sensor alone does not already supply, since the sensor-alone condition, hot today with no outlook term, reached only 79.8% precision on the same held-out period.</w:t>
+      </w:r>
+    </w:p>
+    <w:p>
+      <w:pPr>
+        <w:pStyle w:val="Heading3"/>
+      </w:pPr>
+      <w:r>
+        <w:t>6.7.3 Very Short Window: The 2-Hour Nowcast</w:t>
+      </w:r>
+    </w:p>
+    <w:p>
+      <w:pPr>
+        <w:pStyle w:val="FirstParagraph"/>
+      </w:pPr>
+      <w:r>
+        <w:t>The 2-hour nowcast's own wording, mapped onto the same five-tier scale used throughout this chapter, was checked against actual rainfall measured within its own 2-hour validity window using the Woodlands cluster hourly series. A non-fair call reached a held-out precision of 62% against a base rate of 21%, a lift of 3, for rain actually landing somewhere inside that call's own window.</w:t>
+      </w:r>
+    </w:p>
+    <w:p>
+      <w:pPr>
+        <w:pStyle w:val="BodyText"/>
+      </w:pPr>
+      <w:r>
+        <w:t>The more useful measurement asks how much warning the nowcast gives before a rain gauge would otherwise register the same event starting. An onset was defined as any hour in which the Woodlands cluster mean rainfall crossed 0.2 millimetres after 2 preceding dry hours, and 1,722 such onsets occur across the record. 79% of them had already been flagged by a non-fair nowcast issuance before the onset hour began, with a median lead time of 50 minutes among the onsets that were flagged, an interquartile range running from 14 to 90 minutes. No other layer in this chapter's ladder offers this kind of notice. The 4-day outlook and the same-day periods forecast both describe conditions well before they arrive, but neither updates fast enough to tell a keeper that rain is starting within the hour, and the rain gauge itself, by definition, can only report what has already happened. The 2-hour nowcast is the one product in the entire NEA suite positioned to close that specific gap, and its precision, while lower than the same-day rules in section 6.7.2, is more than adequate for a short-fuse action such as topping up aeration or bringing in feed left outside, where the cost of a false alarm is a few minutes of unnecessary effort rather than a missed maintenance window or a wrongly deferred water change.</w:t>
+      </w:r>
+    </w:p>
+    <w:p>
+      <w:pPr>
+        <w:pStyle w:val="Heading3"/>
+      </w:pPr>
+      <w:r>
+        <w:t>6.7.4 Zero Lead: REACT and the Reactive Baseline</w:t>
+      </w:r>
+    </w:p>
+    <w:p>
+      <w:pPr>
+        <w:pStyle w:val="FirstParagraph"/>
+      </w:pPr>
+      <w:r>
+        <w:t>A rule that fires on rain already measured by the gauge, exceeding 50 millimetres in the previous day in this chapter's implementation, is precise by construction rather than by any forecasting skill, since it is reporting a fact rather than predicting one. Its value lies in serving as the backstop that fires once every earlier layer in the ladder has already been overtaken by events, prompting a check on buffer chemistry after a rain event large enough that section 6.4's magnitude argument no longer guarantees the routine maintenance cycle has absorbed it unnoticed. Framed this way, REACT answers a different question than the other three layers, catching whatever they did not, rather than competing with them for the same decision.</w:t>
+      </w:r>
+    </w:p>
+    <w:p>
+      <w:pPr>
+        <w:pStyle w:val="Heading2"/>
+      </w:pPr>
+      <w:r>
+        <w:t>6.8 Robustness Checks</w:t>
+      </w:r>
+    </w:p>
+    <w:p>
+      <w:pPr>
+        <w:pStyle w:val="FirstParagraph"/>
+      </w:pPr>
+      <w:r>
+        <w:t>Three additional checks were run against this chapter's own results before they were reported as final.</w:t>
+      </w:r>
+    </w:p>
+    <w:p>
+      <w:pPr>
+        <w:pStyle w:val="BodyText"/>
+      </w:pPr>
+      <w:r>
+        <w:t>A permutation control compared the window and PREEMPT rules from section 6.7.2 against 2,000 random same-size selections from the same held-out pool. Both rules' real precision, 86% and 88.5% respectively, fell entirely outside the 95% range the random selections produced, which was centred close to each rule's own base rate as expected. Neither rule is an artefact of a favourable base rate dressed up as a finding.</w:t>
+      </w:r>
+    </w:p>
+    <w:p>
+      <w:pPr>
+        <w:pStyle w:val="BodyText"/>
+      </w:pPr>
+      <w:r>
+        <w:t>A residual skill test removed the hottest 30% of held-out days entirely and asked whether the outlook's own hot call still discriminated within an ordinary range, Tmax spanning 24 to 32 degrees. It retained 81% of its original lift on that residual, well above the low retention a rule that only detects obvious extremes would show. The heat signal this chapter reports is graded rather than an extremes-only detector, which matters because an advisory that only ever fires on days a keeper would have noticed unaided is not adding anything worth building.</w:t>
+      </w:r>
+    </w:p>
+    <w:p>
+      <w:pPr>
+        <w:pStyle w:val="BodyText"/>
+      </w:pPr>
+      <w:r>
+        <w:t>The persistence and streak checks described in section 6.6 complete this section's set of validations. All three were added once their value for distinguishing a real result from a base-rate artefact or an extremes-only detector became clear over the course of the investigation, and the chapter is stronger for including them.</w:t>
+      </w:r>
+    </w:p>
+    <w:p>
+      <w:pPr>
+        <w:pStyle w:val="Heading2"/>
+      </w:pPr>
+      <w:r>
+        <w:t>6.9 A Concurrent Multi-Window Advisory</w:t>
+      </w:r>
+    </w:p>
+    <w:p>
+      <w:pPr>
+        <w:pStyle w:val="FirstParagraph"/>
+      </w:pPr>
+      <w:r>
+        <w:t>The four layers in section 6.7 are not a hierarchy in which one is chosen over the others. They answer different questions at different lead times, and a system built on this analysis should watch all four continuously rather than commit to a single horizon. A pond keeper deciding whether to plan a water change 3 days out, whether to hold off feeding this afternoon, whether to bring in a feeder left outdoors in the next hour, and whether last night's rain needs a buffer check this morning, is asking four different questions that happen to share one data source.</w:t>
+      </w:r>
+    </w:p>
+    <w:p>
+      <w:pPr>
+        <w:pStyle w:val="BodyText"/>
+      </w:pPr>
+      <w:r>
+        <w:t>The practical design this suggests runs each of the four rules from section 6.7 continuously and independently against the freshest data each one has, rather than collapsing them into a single combined score. The 4-day outlook feeds a standing heat-awareness state, updated twice daily, that flags whether the coming days look set to hold a current heat stretch rather than break it. The same-day periods forecast feeds two independent same-day flags, one for maintenance scheduling and one for feeding adjustment, each carrying its own validated precision from section 6.7.2 rather than a blended one. The 2-hour nowcast feeds a short-fuse alert, refreshed roughly every 30 minutes, for whichever of the immediately actionable responses, aeration, feed placement, deferring a change already in progress, the current 2-hour window actually supports. The rain gauge itself continues to drive the existing reactive check unconditionally, since section 6.7.4 established that this layer's value lies precisely in never depending on any of the other three having worked.</w:t>
+      </w:r>
+    </w:p>
+    <w:p>
+      <w:pPr>
+        <w:pStyle w:val="BodyText"/>
+      </w:pPr>
+      <w:r>
+        <w:t>Two design consequences follow directly from the numbers in section 6.5 and section 6.7 and are worth stating explicitly rather than left implicit in the tables. The Thundery wording that dominates the periods forecast should not be surfaced to a keeper as an alert in its own right, since a signal present on a majority of days at a lift barely above 1 trains a user to stop reading it long before it might occasionally matter. And the same-day window most favourable for pond maintenance is, by the mechanism in section 6.5, also close to the same conditions favourable for algal growth and thermal stress, so a system that only ever advertises the maintenance convenience of a clear day is reporting half of what that day actually means for the fish in the pond.</w:t>
+      </w:r>
+    </w:p>
+    <w:p>
+      <w:pPr>
+        <w:pStyle w:val="Heading2"/>
+      </w:pPr>
+      <w:r>
+        <w:t>6.10 Limitations</w:t>
+      </w:r>
+    </w:p>
+    <w:p>
+      <w:pPr>
+        <w:pStyle w:val="FirstParagraph"/>
+      </w:pPr>
+      <w:r>
+        <w:t>The water temperature a pond actually experiences is not measured directly anywhere in this record, and every heat-related figure in this chapter is stated in terms of observed air temperature rather than a modelled or measured pond temperature. A first-order lag model relating the two exists elsewhere in the project but was not applied here, and the frequency of an absolute event such as 30-degree water is known from other work in this project to be highly sensitive to the lag and offset assumed, ranging from 2% to 90% of days across plausible parameter choices. Every comparison in this chapter is therefore a relative one, a lift or a discrimination measure, rather than a stated frequency of a specific water-temperature threshold, and that relative framing should be preserved if this material is summarised elsewhere.</w:t>
+      </w:r>
+    </w:p>
+    <w:p>
+      <w:pPr>
+        <w:pStyle w:val="BodyText"/>
+      </w:pPr>
+      <w:r>
+        <w:t>The 1-day horizon in section 6.7.1 deserves a specific note. A lag-filtered proxy for water temperature, tested against the same 1-day question through an unfitted combination of signals rather than a fitted one, would be expected to show an apparently different result at that horizon specifically. A target already discriminated at an area under the curve close to 0.97 by yesterday's own reading leaves an added signal almost no room to help and considerable room to hurt once blended in without a fitted weight, since only a small amount of noise in that signal is needed to subtract from a baseline already that close to its ceiling. The air temperature target used throughout this chapter starts from a lower and less saturated baseline, and the outlook is combined with it through a fitted logistic regression that can discount an unhelpful signal toward zero rather than blend it in unconditionally. The positive 1-day gain reported in section 6.7.1 is the reading this chapter treats as correct: a target measured directly rather than modelled, combined by a method that does not force in a signal it has no evidence for.</w:t>
+      </w:r>
+    </w:p>
+    <w:p>
+      <w:pPr>
+        <w:pStyle w:val="BodyText"/>
+      </w:pPr>
+      <w:r>
+        <w:t>The station network correction in section 6.2.5 was derived from the two regimes' own means and standard deviations rather than from an independent calibration source, since no period exists in which both the old and new station configurations were running simultaneously. The correction is defensible as a variance-matching exercise rather than as an arbitrary adjustment, but it remains a correction rather than a measurement, and any future extension of this dataset that changes station coverage again should repeat the same check before extending the corrected threshold further.</w:t>
+      </w:r>
+    </w:p>
+    <w:p>
+      <w:pPr>
+        <w:pStyle w:val="BodyText"/>
+      </w:pPr>
+      <w:r>
+        <w:t>Every threshold in this chapter was chosen once by inspecting quantiles of the training period, which is a defensible and stated procedure but is not the same as a threshold specified before any data was seen. A stricter validation, on a further held-out period using thresholds fixed in advance of that period specifically, would be expected to soften some of the precision figures reported here, in the same direction the training-to-test gap already visible in several tables suggests.</w:t>
+      </w:r>
+    </w:p>
+    <w:p>
+      <w:pPr>
+        <w:pStyle w:val="Heading2"/>
+      </w:pPr>
+      <w:r>
+        <w:t>6.11 Conclusion</w:t>
+      </w:r>
+    </w:p>
+    <w:p>
+      <w:pPr>
+        <w:pStyle w:val="FirstParagraph"/>
+      </w:pPr>
+      <w:r>
+        <w:t>3 days of largely unattended scraping closed the gaps that made this chapter possible, extended the temperature record to the present, and added a 2-hour nowcast product that no earlier pass over this data had examined. Checking the newly closed dataset against thresholds calibrated before the gap was closed surfaced one real defect, a station network variance mismatch that had silently inverted a headline conclusion, and prompted several validation techniques that this chapter now treats as a standing part of its method rather than a one-time check.</w:t>
+      </w:r>
+    </w:p>
+    <w:p>
+      <w:pPr>
+        <w:pStyle w:val="BodyText"/>
+      </w:pPr>
+      <w:r>
+        <w:t>The finding that survives all of this is a specific one rather than a general endorsement or rejection of NEA's forecast supply. Rainfall prediction does not earn its place in pond chemistry at any lead time tested, because the chemistry it would protect is slow enough, and the gauge fast enough, that acting after the fact costs nothing a forecast could have saved. Heat prediction does earn its place, and does so differently at every lead time NEA offers. The 4-day outlook gives several days of standing awareness that a hot stretch is likely to continue. The same-day periods forecast, combined with the pond's own sensor, gives the single most precise advisory in this chapter for whether today is part of that stretch. The 2-hour nowcast, validated here for the first time, gives the only genuine minutes of warning before rain actually starts, useful for exactly the short-fuse actions the longer horizons cannot reach. The rain gauge itself, entirely without predictive ambition, remains the backstop that catches whatever the other three did not. A system built to use all four windows at once, each answering the question it is actually suited to answer, is the concrete recommendation this chapter makes for turning 6 years of NEA's public data into something a pond keeper can act on before, rather than after, the weather that matters arrives.</w:t>
+      </w:r>
+    </w:p>
+    <w:p>
+      <w:pPr>
+        <w:pStyle w:val="Heading1"/>
         <w:rPr>
           <w:rFonts w:asciiTheme="majorHAnsi" w:hAnsiTheme="majorHAnsi" w:cstheme="majorHAnsi"/>
         </w:rPr>
@@ -34922,8 +36148,7 @@
         <w:rPr>
           <w:rFonts w:asciiTheme="majorHAnsi" w:hAnsiTheme="majorHAnsi" w:cstheme="majorHAnsi"/>
         </w:rPr>
-        <w:lastRenderedPageBreak/>
-        <w:t>Chapter 6: Results</w:t>
+        <w:t>Chapter 7: Results</w:t>
       </w:r>
       <w:bookmarkEnd w:id="253"/>
     </w:p>
@@ -34940,7 +36165,7 @@
         <w:rPr>
           <w:rFonts w:asciiTheme="majorHAnsi" w:hAnsiTheme="majorHAnsi" w:cstheme="majorHAnsi"/>
         </w:rPr>
-        <w:t>6.1 Status of the Results</w:t>
+        <w:t>7.1 Status of the Results</w:t>
       </w:r>
       <w:bookmarkEnd w:id="255"/>
     </w:p>
@@ -34955,1129 +36180,7 @@
         <w:rPr>
           <w:rFonts w:asciiTheme="majorHAnsi" w:hAnsiTheme="majorHAnsi" w:cstheme="majorHAnsi"/>
         </w:rPr>
-        <w:t>Three bodies of evidence feed this chapter, and they are at different stages. The analysis of historical NEA forecasts against observed weather is complete and is reported in Section 6.2. The automated software verification is complete and is summarised in Section 6.3, with details in Chapter 5. The bench, field and full-system tests defined in Chapter 4 are pending, and Section 6.4 gives the structure in which their results will be reported, so that each result is set against the acceptance limit fixed before testing.</w:t>
-      </w:r>
-    </w:p>
-    <w:p>
-      <w:pPr>
-        <w:pStyle w:val="Heading2"/>
-        <w:rPr>
-          <w:rFonts w:asciiTheme="majorHAnsi" w:hAnsiTheme="majorHAnsi" w:cstheme="majorHAnsi"/>
-        </w:rPr>
-      </w:pPr>
-      <w:bookmarkStart w:id="256" w:name="X7b593b82e1ff196a042dca19fd0c5bd776e21ac"/>
-      <w:bookmarkStart w:id="257" w:name="_Toc241565787"/>
-      <w:bookmarkEnd w:id="254"/>
-      <w:r>
-        <w:rPr>
-          <w:rFonts w:asciiTheme="majorHAnsi" w:hAnsiTheme="majorHAnsi" w:cstheme="majorHAnsi"/>
-        </w:rPr>
-        <w:t>6.2 Historical Analysis of NEA Forecasts and Observations</w:t>
-      </w:r>
-      <w:bookmarkEnd w:id="257"/>
-    </w:p>
-    <w:p>
-      <w:pPr>
-        <w:pStyle w:val="Heading3"/>
-        <w:rPr>
-          <w:rFonts w:asciiTheme="majorHAnsi" w:hAnsiTheme="majorHAnsi" w:cstheme="majorHAnsi"/>
-        </w:rPr>
-      </w:pPr>
-      <w:bookmarkStart w:id="258" w:name="purpose-and-data"/>
-      <w:bookmarkStart w:id="259" w:name="_Toc241565788"/>
-      <w:r>
-        <w:rPr>
-          <w:rFonts w:asciiTheme="majorHAnsi" w:hAnsiTheme="majorHAnsi" w:cstheme="majorHAnsi"/>
-        </w:rPr>
-        <w:t>6.2.1 Purpose and Data</w:t>
-      </w:r>
-      <w:bookmarkEnd w:id="259"/>
-    </w:p>
-    <w:p>
-      <w:pPr>
-        <w:pStyle w:val="FirstParagraph"/>
-        <w:rPr>
-          <w:rFonts w:asciiTheme="majorHAnsi" w:hAnsiTheme="majorHAnsi" w:cstheme="majorHAnsi"/>
-        </w:rPr>
-      </w:pPr>
-      <w:r>
-        <w:rPr>
-          <w:rFonts w:asciiTheme="majorHAnsi" w:hAnsiTheme="majorHAnsi" w:cstheme="majorHAnsi"/>
-        </w:rPr>
-        <w:t>The digital twin relies on NEA forecasts for its lookahead, so it is worth knowing, before any pond data exists, how much those forecasts add over what a sensor already reports. This analysis used six years of public data to answer three questions. How large are the rain events a Singapore pond actually receives? How reliable is the forecast wording the system reads? And does the forecast add predictive skill beyond simply measuring the present?</w:t>
-      </w:r>
-    </w:p>
-    <w:p>
-      <w:pPr>
-        <w:pStyle w:val="BodyText"/>
-        <w:rPr>
-          <w:rFonts w:asciiTheme="majorHAnsi" w:hAnsiTheme="majorHAnsi" w:cstheme="majorHAnsi"/>
-        </w:rPr>
-      </w:pPr>
-      <w:r>
-        <w:rPr>
-          <w:rFonts w:asciiTheme="majorHAnsi" w:hAnsiTheme="majorHAnsi" w:cstheme="majorHAnsi"/>
-        </w:rPr>
-        <w:t>The dataset covers 2,302 days from 2 February 2020 to 19 August 2026. Observed rainfall and air temperature come from the NEA stations nearest the pond, in the Woodlands area, aggregated to hourly and daily values. Forecasts come from NEA’s 24-hour forecast, which gives a wording category for each of five regions and four six-hour periods, and from its four-day outlook. Days up to 31 December 2024 were used to set every threshold, and the 2025 to August 2026 period was held out for testing. Thresholds were never adjusted after looking at the held-out period. All analysis steps are in a single notebook in the repository, so the tables below can be reproduced from the raw files.</w:t>
-      </w:r>
-    </w:p>
-    <w:p>
-      <w:pPr>
-        <w:pStyle w:val="Heading3"/>
-        <w:rPr>
-          <w:rFonts w:asciiTheme="majorHAnsi" w:hAnsiTheme="majorHAnsi" w:cstheme="majorHAnsi"/>
-        </w:rPr>
-      </w:pPr>
-      <w:bookmarkStart w:id="260" w:name="Xa585edba731917e07f1a31e34174991fc041866"/>
-      <w:bookmarkStart w:id="261" w:name="_Toc241565789"/>
-      <w:bookmarkEnd w:id="258"/>
-      <w:r>
-        <w:rPr>
-          <w:rFonts w:asciiTheme="majorHAnsi" w:hAnsiTheme="majorHAnsi" w:cstheme="majorHAnsi"/>
-        </w:rPr>
-        <w:t>6.2.2 Rainfall Magnitude and Its Effect on a Pond</w:t>
-      </w:r>
-      <w:bookmarkEnd w:id="261"/>
-    </w:p>
-    <w:p>
-      <w:pPr>
-        <w:pStyle w:val="FirstParagraph"/>
-        <w:rPr>
-          <w:rFonts w:asciiTheme="majorHAnsi" w:hAnsiTheme="majorHAnsi" w:cstheme="majorHAnsi"/>
-        </w:rPr>
-      </w:pPr>
-      <w:r>
-        <w:rPr>
-          <w:rFonts w:asciiTheme="majorHAnsi" w:hAnsiTheme="majorHAnsi" w:cstheme="majorHAnsi"/>
-        </w:rPr>
-        <w:t>Mean rainfall across the record was 7.7 mm per day. Table 6.1 counts the days that reached each threshold.</w:t>
-      </w:r>
-    </w:p>
-    <w:p>
-      <w:pPr>
-        <w:pStyle w:val="TableCaption"/>
-        <w:rPr>
-          <w:rFonts w:asciiTheme="majorHAnsi" w:hAnsiTheme="majorHAnsi" w:cstheme="majorHAnsi"/>
-        </w:rPr>
-      </w:pPr>
-      <w:r>
-        <w:rPr>
-          <w:rFonts w:asciiTheme="majorHAnsi" w:hAnsiTheme="majorHAnsi" w:cstheme="majorHAnsi"/>
-        </w:rPr>
-        <w:t>Table 6.1. Daily rainfall frequency at the Woodlands stations, February 2020 to August 2026, and the dilution each amount would cause.</w:t>
-      </w:r>
-    </w:p>
-    <w:tbl>
-      <w:tblPr>
-        <w:tblStyle w:val="Table"/>
-        <w:tblW w:w="5000" w:type="pct"/>
-        <w:tblBorders>
-          <w:top w:val="single" w:sz="8" w:space="0" w:color="808080"/>
-          <w:left w:val="nil"/>
-          <w:bottom w:val="single" w:sz="8" w:space="0" w:color="808080"/>
-          <w:right w:val="nil"/>
-          <w:insideH w:val="single" w:sz="4" w:space="0" w:color="808080"/>
-          <w:insideV w:val="nil"/>
-        </w:tblBorders>
-        <w:tblCellMar>
-          <w:top w:w="40" w:type="dxa"/>
-          <w:left w:w="80" w:type="dxa"/>
-          <w:bottom w:w="40" w:type="dxa"/>
-          <w:right w:w="80" w:type="dxa"/>
-        </w:tblCellMar>
-        <w:tblLook w:val="0020" w:firstRow="1" w:lastRow="0" w:firstColumn="0" w:lastColumn="0" w:noHBand="0" w:noVBand="0"/>
-      </w:tblPr>
-      <w:tblGrid>
-        <w:gridCol w:w="2066"/>
-        <w:gridCol w:w="1823"/>
-        <w:gridCol w:w="1751"/>
-        <w:gridCol w:w="3546"/>
-      </w:tblGrid>
-      <w:tr>
-        <w:trPr>
-          <w:cnfStyle w:val="100000000000" w:firstRow="1" w:lastRow="0" w:firstColumn="0" w:lastColumn="0" w:oddVBand="0" w:evenVBand="0" w:oddHBand="0" w:evenHBand="0" w:firstRowFirstColumn="0" w:firstRowLastColumn="0" w:lastRowFirstColumn="0" w:lastRowLastColumn="0"/>
-          <w:tblHeader/>
-        </w:trPr>
-        <w:tc>
-          <w:tcPr>
-            <w:tcW w:w="0" w:type="auto"/>
-            <w:shd w:val="clear" w:color="auto" w:fill="EDEFF2"/>
-          </w:tcPr>
-          <w:p>
-            <w:pPr>
-              <w:pStyle w:val="Compact"/>
-              <w:spacing w:before="20" w:after="20" w:line="264" w:lineRule="auto"/>
-              <w:jc w:val="left"/>
-              <w:rPr>
-                <w:rFonts w:asciiTheme="majorHAnsi" w:hAnsiTheme="majorHAnsi" w:cstheme="majorHAnsi"/>
-              </w:rPr>
-            </w:pPr>
-            <w:r>
-              <w:rPr>
-                <w:rFonts w:asciiTheme="majorHAnsi" w:hAnsiTheme="majorHAnsi" w:cstheme="majorHAnsi"/>
-                <w:b/>
-                <w:sz w:val="19"/>
-              </w:rPr>
-              <w:t>Daily rainfall</w:t>
-            </w:r>
-          </w:p>
-        </w:tc>
-        <w:tc>
-          <w:tcPr>
-            <w:tcW w:w="0" w:type="auto"/>
-            <w:shd w:val="clear" w:color="auto" w:fill="EDEFF2"/>
-          </w:tcPr>
-          <w:p>
-            <w:pPr>
-              <w:pStyle w:val="Compact"/>
-              <w:spacing w:before="20" w:after="20" w:line="264" w:lineRule="auto"/>
-              <w:jc w:val="left"/>
-              <w:rPr>
-                <w:rFonts w:asciiTheme="majorHAnsi" w:hAnsiTheme="majorHAnsi" w:cstheme="majorHAnsi"/>
-              </w:rPr>
-            </w:pPr>
-            <w:r>
-              <w:rPr>
-                <w:rFonts w:asciiTheme="majorHAnsi" w:hAnsiTheme="majorHAnsi" w:cstheme="majorHAnsi"/>
-                <w:b/>
-                <w:sz w:val="19"/>
-              </w:rPr>
-              <w:t>Days in record</w:t>
-            </w:r>
-          </w:p>
-        </w:tc>
-        <w:tc>
-          <w:tcPr>
-            <w:tcW w:w="0" w:type="auto"/>
-            <w:shd w:val="clear" w:color="auto" w:fill="EDEFF2"/>
-          </w:tcPr>
-          <w:p>
-            <w:pPr>
-              <w:pStyle w:val="Compact"/>
-              <w:spacing w:before="20" w:after="20" w:line="264" w:lineRule="auto"/>
-              <w:jc w:val="left"/>
-              <w:rPr>
-                <w:rFonts w:asciiTheme="majorHAnsi" w:hAnsiTheme="majorHAnsi" w:cstheme="majorHAnsi"/>
-              </w:rPr>
-            </w:pPr>
-            <w:r>
-              <w:rPr>
-                <w:rFonts w:asciiTheme="majorHAnsi" w:hAnsiTheme="majorHAnsi" w:cstheme="majorHAnsi"/>
-                <w:b/>
-                <w:sz w:val="19"/>
-              </w:rPr>
-              <w:t>Days per year</w:t>
-            </w:r>
-          </w:p>
-        </w:tc>
-        <w:tc>
-          <w:tcPr>
-            <w:tcW w:w="0" w:type="auto"/>
-            <w:shd w:val="clear" w:color="auto" w:fill="EDEFF2"/>
-          </w:tcPr>
-          <w:p>
-            <w:pPr>
-              <w:pStyle w:val="Compact"/>
-              <w:spacing w:before="20" w:after="20" w:line="264" w:lineRule="auto"/>
-              <w:jc w:val="left"/>
-              <w:rPr>
-                <w:rFonts w:asciiTheme="majorHAnsi" w:hAnsiTheme="majorHAnsi" w:cstheme="majorHAnsi"/>
-              </w:rPr>
-            </w:pPr>
-            <w:r>
-              <w:rPr>
-                <w:rFonts w:asciiTheme="majorHAnsi" w:hAnsiTheme="majorHAnsi" w:cstheme="majorHAnsi"/>
-                <w:b/>
-                <w:sz w:val="19"/>
-              </w:rPr>
-              <w:t>Dilution of a 1.2 m deep pond</w:t>
-            </w:r>
-          </w:p>
-        </w:tc>
-      </w:tr>
-      <w:tr>
-        <w:tc>
-          <w:tcPr>
-            <w:tcW w:w="0" w:type="auto"/>
-          </w:tcPr>
-          <w:p>
-            <w:pPr>
-              <w:pStyle w:val="Compact"/>
-              <w:spacing w:before="20" w:after="20" w:line="264" w:lineRule="auto"/>
-              <w:jc w:val="left"/>
-              <w:rPr>
-                <w:rFonts w:asciiTheme="majorHAnsi" w:hAnsiTheme="majorHAnsi" w:cstheme="majorHAnsi"/>
-              </w:rPr>
-            </w:pPr>
-            <w:r>
-              <w:rPr>
-                <w:rFonts w:asciiTheme="majorHAnsi" w:hAnsiTheme="majorHAnsi" w:cstheme="majorHAnsi"/>
-                <w:sz w:val="19"/>
-              </w:rPr>
-              <w:t>30 mm or more</w:t>
-            </w:r>
-          </w:p>
-        </w:tc>
-        <w:tc>
-          <w:tcPr>
-            <w:tcW w:w="0" w:type="auto"/>
-          </w:tcPr>
-          <w:p>
-            <w:pPr>
-              <w:pStyle w:val="Compact"/>
-              <w:spacing w:before="20" w:after="20" w:line="264" w:lineRule="auto"/>
-              <w:jc w:val="left"/>
-              <w:rPr>
-                <w:rFonts w:asciiTheme="majorHAnsi" w:hAnsiTheme="majorHAnsi" w:cstheme="majorHAnsi"/>
-              </w:rPr>
-            </w:pPr>
-            <w:r>
-              <w:rPr>
-                <w:rFonts w:asciiTheme="majorHAnsi" w:hAnsiTheme="majorHAnsi" w:cstheme="majorHAnsi"/>
-                <w:sz w:val="19"/>
-              </w:rPr>
-              <w:t>169</w:t>
-            </w:r>
-          </w:p>
-        </w:tc>
-        <w:tc>
-          <w:tcPr>
-            <w:tcW w:w="0" w:type="auto"/>
-          </w:tcPr>
-          <w:p>
-            <w:pPr>
-              <w:pStyle w:val="Compact"/>
-              <w:spacing w:before="20" w:after="20" w:line="264" w:lineRule="auto"/>
-              <w:jc w:val="left"/>
-              <w:rPr>
-                <w:rFonts w:asciiTheme="majorHAnsi" w:hAnsiTheme="majorHAnsi" w:cstheme="majorHAnsi"/>
-              </w:rPr>
-            </w:pPr>
-            <w:r>
-              <w:rPr>
-                <w:rFonts w:asciiTheme="majorHAnsi" w:hAnsiTheme="majorHAnsi" w:cstheme="majorHAnsi"/>
-                <w:sz w:val="19"/>
-              </w:rPr>
-              <w:t>26.8</w:t>
-            </w:r>
-          </w:p>
-        </w:tc>
-        <w:tc>
-          <w:tcPr>
-            <w:tcW w:w="0" w:type="auto"/>
-          </w:tcPr>
-          <w:p>
-            <w:pPr>
-              <w:pStyle w:val="Compact"/>
-              <w:spacing w:before="20" w:after="20" w:line="264" w:lineRule="auto"/>
-              <w:jc w:val="left"/>
-              <w:rPr>
-                <w:rFonts w:asciiTheme="majorHAnsi" w:hAnsiTheme="majorHAnsi" w:cstheme="majorHAnsi"/>
-              </w:rPr>
-            </w:pPr>
-            <w:r>
-              <w:rPr>
-                <w:rFonts w:asciiTheme="majorHAnsi" w:hAnsiTheme="majorHAnsi" w:cstheme="majorHAnsi"/>
-                <w:sz w:val="19"/>
-              </w:rPr>
-              <w:t>2.5 %</w:t>
-            </w:r>
-          </w:p>
-        </w:tc>
-      </w:tr>
-      <w:tr>
-        <w:tc>
-          <w:tcPr>
-            <w:tcW w:w="0" w:type="auto"/>
-          </w:tcPr>
-          <w:p>
-            <w:pPr>
-              <w:pStyle w:val="Compact"/>
-              <w:spacing w:before="20" w:after="20" w:line="264" w:lineRule="auto"/>
-              <w:jc w:val="left"/>
-              <w:rPr>
-                <w:rFonts w:asciiTheme="majorHAnsi" w:hAnsiTheme="majorHAnsi" w:cstheme="majorHAnsi"/>
-              </w:rPr>
-            </w:pPr>
-            <w:r>
-              <w:rPr>
-                <w:rFonts w:asciiTheme="majorHAnsi" w:hAnsiTheme="majorHAnsi" w:cstheme="majorHAnsi"/>
-                <w:sz w:val="19"/>
-              </w:rPr>
-              <w:t>50 mm or more</w:t>
-            </w:r>
-          </w:p>
-        </w:tc>
-        <w:tc>
-          <w:tcPr>
-            <w:tcW w:w="0" w:type="auto"/>
-          </w:tcPr>
-          <w:p>
-            <w:pPr>
-              <w:pStyle w:val="Compact"/>
-              <w:spacing w:before="20" w:after="20" w:line="264" w:lineRule="auto"/>
-              <w:jc w:val="left"/>
-              <w:rPr>
-                <w:rFonts w:asciiTheme="majorHAnsi" w:hAnsiTheme="majorHAnsi" w:cstheme="majorHAnsi"/>
-              </w:rPr>
-            </w:pPr>
-            <w:r>
-              <w:rPr>
-                <w:rFonts w:asciiTheme="majorHAnsi" w:hAnsiTheme="majorHAnsi" w:cstheme="majorHAnsi"/>
-                <w:sz w:val="19"/>
-              </w:rPr>
-              <w:t>56</w:t>
-            </w:r>
-          </w:p>
-        </w:tc>
-        <w:tc>
-          <w:tcPr>
-            <w:tcW w:w="0" w:type="auto"/>
-          </w:tcPr>
-          <w:p>
-            <w:pPr>
-              <w:pStyle w:val="Compact"/>
-              <w:spacing w:before="20" w:after="20" w:line="264" w:lineRule="auto"/>
-              <w:jc w:val="left"/>
-              <w:rPr>
-                <w:rFonts w:asciiTheme="majorHAnsi" w:hAnsiTheme="majorHAnsi" w:cstheme="majorHAnsi"/>
-              </w:rPr>
-            </w:pPr>
-            <w:r>
-              <w:rPr>
-                <w:rFonts w:asciiTheme="majorHAnsi" w:hAnsiTheme="majorHAnsi" w:cstheme="majorHAnsi"/>
-                <w:sz w:val="19"/>
-              </w:rPr>
-              <w:t>8.9</w:t>
-            </w:r>
-          </w:p>
-        </w:tc>
-        <w:tc>
-          <w:tcPr>
-            <w:tcW w:w="0" w:type="auto"/>
-          </w:tcPr>
-          <w:p>
-            <w:pPr>
-              <w:pStyle w:val="Compact"/>
-              <w:spacing w:before="20" w:after="20" w:line="264" w:lineRule="auto"/>
-              <w:jc w:val="left"/>
-              <w:rPr>
-                <w:rFonts w:asciiTheme="majorHAnsi" w:hAnsiTheme="majorHAnsi" w:cstheme="majorHAnsi"/>
-              </w:rPr>
-            </w:pPr>
-            <w:r>
-              <w:rPr>
-                <w:rFonts w:asciiTheme="majorHAnsi" w:hAnsiTheme="majorHAnsi" w:cstheme="majorHAnsi"/>
-                <w:sz w:val="19"/>
-              </w:rPr>
-              <w:t>4.1 %</w:t>
-            </w:r>
-          </w:p>
-        </w:tc>
-      </w:tr>
-      <w:tr>
-        <w:tc>
-          <w:tcPr>
-            <w:tcW w:w="0" w:type="auto"/>
-          </w:tcPr>
-          <w:p>
-            <w:pPr>
-              <w:pStyle w:val="Compact"/>
-              <w:spacing w:before="20" w:after="20" w:line="264" w:lineRule="auto"/>
-              <w:jc w:val="left"/>
-              <w:rPr>
-                <w:rFonts w:asciiTheme="majorHAnsi" w:hAnsiTheme="majorHAnsi" w:cstheme="majorHAnsi"/>
-              </w:rPr>
-            </w:pPr>
-            <w:r>
-              <w:rPr>
-                <w:rFonts w:asciiTheme="majorHAnsi" w:hAnsiTheme="majorHAnsi" w:cstheme="majorHAnsi"/>
-                <w:sz w:val="19"/>
-              </w:rPr>
-              <w:t>100 mm or more</w:t>
-            </w:r>
-          </w:p>
-        </w:tc>
-        <w:tc>
-          <w:tcPr>
-            <w:tcW w:w="0" w:type="auto"/>
-          </w:tcPr>
-          <w:p>
-            <w:pPr>
-              <w:pStyle w:val="Compact"/>
-              <w:spacing w:before="20" w:after="20" w:line="264" w:lineRule="auto"/>
-              <w:jc w:val="left"/>
-              <w:rPr>
-                <w:rFonts w:asciiTheme="majorHAnsi" w:hAnsiTheme="majorHAnsi" w:cstheme="majorHAnsi"/>
-              </w:rPr>
-            </w:pPr>
-            <w:r>
-              <w:rPr>
-                <w:rFonts w:asciiTheme="majorHAnsi" w:hAnsiTheme="majorHAnsi" w:cstheme="majorHAnsi"/>
-                <w:sz w:val="19"/>
-              </w:rPr>
-              <w:t>7</w:t>
-            </w:r>
-          </w:p>
-        </w:tc>
-        <w:tc>
-          <w:tcPr>
-            <w:tcW w:w="0" w:type="auto"/>
-          </w:tcPr>
-          <w:p>
-            <w:pPr>
-              <w:pStyle w:val="Compact"/>
-              <w:spacing w:before="20" w:after="20" w:line="264" w:lineRule="auto"/>
-              <w:jc w:val="left"/>
-              <w:rPr>
-                <w:rFonts w:asciiTheme="majorHAnsi" w:hAnsiTheme="majorHAnsi" w:cstheme="majorHAnsi"/>
-              </w:rPr>
-            </w:pPr>
-            <w:r>
-              <w:rPr>
-                <w:rFonts w:asciiTheme="majorHAnsi" w:hAnsiTheme="majorHAnsi" w:cstheme="majorHAnsi"/>
-                <w:sz w:val="19"/>
-              </w:rPr>
-              <w:t>1.1</w:t>
-            </w:r>
-          </w:p>
-        </w:tc>
-        <w:tc>
-          <w:tcPr>
-            <w:tcW w:w="0" w:type="auto"/>
-          </w:tcPr>
-          <w:p>
-            <w:pPr>
-              <w:pStyle w:val="Compact"/>
-              <w:spacing w:before="20" w:after="20" w:line="264" w:lineRule="auto"/>
-              <w:jc w:val="left"/>
-              <w:rPr>
-                <w:rFonts w:asciiTheme="majorHAnsi" w:hAnsiTheme="majorHAnsi" w:cstheme="majorHAnsi"/>
-              </w:rPr>
-            </w:pPr>
-            <w:r>
-              <w:rPr>
-                <w:rFonts w:asciiTheme="majorHAnsi" w:hAnsiTheme="majorHAnsi" w:cstheme="majorHAnsi"/>
-                <w:sz w:val="19"/>
-              </w:rPr>
-              <w:t>8.0 %</w:t>
-            </w:r>
-          </w:p>
-        </w:tc>
-      </w:tr>
-      <w:tr>
-        <w:tc>
-          <w:tcPr>
-            <w:tcW w:w="0" w:type="auto"/>
-          </w:tcPr>
-          <w:p>
-            <w:pPr>
-              <w:pStyle w:val="Compact"/>
-              <w:spacing w:before="20" w:after="20" w:line="264" w:lineRule="auto"/>
-              <w:jc w:val="left"/>
-              <w:rPr>
-                <w:rFonts w:asciiTheme="majorHAnsi" w:hAnsiTheme="majorHAnsi" w:cstheme="majorHAnsi"/>
-              </w:rPr>
-            </w:pPr>
-            <w:r>
-              <w:rPr>
-                <w:rFonts w:asciiTheme="majorHAnsi" w:hAnsiTheme="majorHAnsi" w:cstheme="majorHAnsi"/>
-                <w:sz w:val="19"/>
-              </w:rPr>
-              <w:t>150 mm or more</w:t>
-            </w:r>
-          </w:p>
-        </w:tc>
-        <w:tc>
-          <w:tcPr>
-            <w:tcW w:w="0" w:type="auto"/>
-          </w:tcPr>
-          <w:p>
-            <w:pPr>
-              <w:pStyle w:val="Compact"/>
-              <w:spacing w:before="20" w:after="20" w:line="264" w:lineRule="auto"/>
-              <w:jc w:val="left"/>
-              <w:rPr>
-                <w:rFonts w:asciiTheme="majorHAnsi" w:hAnsiTheme="majorHAnsi" w:cstheme="majorHAnsi"/>
-              </w:rPr>
-            </w:pPr>
-            <w:r>
-              <w:rPr>
-                <w:rFonts w:asciiTheme="majorHAnsi" w:hAnsiTheme="majorHAnsi" w:cstheme="majorHAnsi"/>
-                <w:sz w:val="19"/>
-              </w:rPr>
-              <w:t>2</w:t>
-            </w:r>
-          </w:p>
-        </w:tc>
-        <w:tc>
-          <w:tcPr>
-            <w:tcW w:w="0" w:type="auto"/>
-          </w:tcPr>
-          <w:p>
-            <w:pPr>
-              <w:pStyle w:val="Compact"/>
-              <w:spacing w:before="20" w:after="20" w:line="264" w:lineRule="auto"/>
-              <w:jc w:val="left"/>
-              <w:rPr>
-                <w:rFonts w:asciiTheme="majorHAnsi" w:hAnsiTheme="majorHAnsi" w:cstheme="majorHAnsi"/>
-              </w:rPr>
-            </w:pPr>
-            <w:r>
-              <w:rPr>
-                <w:rFonts w:asciiTheme="majorHAnsi" w:hAnsiTheme="majorHAnsi" w:cstheme="majorHAnsi"/>
-                <w:sz w:val="19"/>
-              </w:rPr>
-              <w:t>0.3</w:t>
-            </w:r>
-          </w:p>
-        </w:tc>
-        <w:tc>
-          <w:tcPr>
-            <w:tcW w:w="0" w:type="auto"/>
-          </w:tcPr>
-          <w:p>
-            <w:pPr>
-              <w:pStyle w:val="Compact"/>
-              <w:spacing w:before="20" w:after="20" w:line="264" w:lineRule="auto"/>
-              <w:jc w:val="left"/>
-              <w:rPr>
-                <w:rFonts w:asciiTheme="majorHAnsi" w:hAnsiTheme="majorHAnsi" w:cstheme="majorHAnsi"/>
-              </w:rPr>
-            </w:pPr>
-            <w:r>
-              <w:rPr>
-                <w:rFonts w:asciiTheme="majorHAnsi" w:hAnsiTheme="majorHAnsi" w:cstheme="majorHAnsi"/>
-                <w:sz w:val="19"/>
-              </w:rPr>
-              <w:t>11.8 %</w:t>
-            </w:r>
-          </w:p>
-        </w:tc>
-      </w:tr>
-      <w:tr>
-        <w:tc>
-          <w:tcPr>
-            <w:tcW w:w="0" w:type="auto"/>
-          </w:tcPr>
-          <w:p>
-            <w:pPr>
-              <w:pStyle w:val="Compact"/>
-              <w:spacing w:before="20" w:after="20" w:line="264" w:lineRule="auto"/>
-              <w:jc w:val="left"/>
-              <w:rPr>
-                <w:rFonts w:asciiTheme="majorHAnsi" w:hAnsiTheme="majorHAnsi" w:cstheme="majorHAnsi"/>
-              </w:rPr>
-            </w:pPr>
-            <w:r>
-              <w:rPr>
-                <w:rFonts w:asciiTheme="majorHAnsi" w:hAnsiTheme="majorHAnsi" w:cstheme="majorHAnsi"/>
-                <w:sz w:val="19"/>
-              </w:rPr>
-              <w:t>Largest day</w:t>
-            </w:r>
-          </w:p>
-        </w:tc>
-        <w:tc>
-          <w:tcPr>
-            <w:tcW w:w="0" w:type="auto"/>
-          </w:tcPr>
-          <w:p>
-            <w:pPr>
-              <w:pStyle w:val="Compact"/>
-              <w:spacing w:before="20" w:after="20" w:line="264" w:lineRule="auto"/>
-              <w:jc w:val="left"/>
-              <w:rPr>
-                <w:rFonts w:asciiTheme="majorHAnsi" w:hAnsiTheme="majorHAnsi" w:cstheme="majorHAnsi"/>
-              </w:rPr>
-            </w:pPr>
-            <w:r>
-              <w:rPr>
-                <w:rFonts w:asciiTheme="majorHAnsi" w:hAnsiTheme="majorHAnsi" w:cstheme="majorHAnsi"/>
-                <w:sz w:val="19"/>
-              </w:rPr>
-              <w:t>173 mm</w:t>
-            </w:r>
-          </w:p>
-        </w:tc>
-        <w:tc>
-          <w:tcPr>
-            <w:tcW w:w="0" w:type="auto"/>
-          </w:tcPr>
-          <w:p>
-            <w:pPr>
-              <w:pStyle w:val="Compact"/>
-              <w:spacing w:before="20" w:after="20" w:line="264" w:lineRule="auto"/>
-              <w:jc w:val="left"/>
-              <w:rPr>
-                <w:rFonts w:asciiTheme="majorHAnsi" w:hAnsiTheme="majorHAnsi" w:cstheme="majorHAnsi"/>
-              </w:rPr>
-            </w:pPr>
-            <w:r>
-              <w:rPr>
-                <w:rFonts w:asciiTheme="majorHAnsi" w:hAnsiTheme="majorHAnsi" w:cstheme="majorHAnsi"/>
-                <w:sz w:val="19"/>
-              </w:rPr>
-              <w:t>—</w:t>
-            </w:r>
-          </w:p>
-        </w:tc>
-        <w:tc>
-          <w:tcPr>
-            <w:tcW w:w="0" w:type="auto"/>
-          </w:tcPr>
-          <w:p>
-            <w:pPr>
-              <w:pStyle w:val="Compact"/>
-              <w:spacing w:before="20" w:after="20" w:line="264" w:lineRule="auto"/>
-              <w:jc w:val="left"/>
-              <w:rPr>
-                <w:rFonts w:asciiTheme="majorHAnsi" w:hAnsiTheme="majorHAnsi" w:cstheme="majorHAnsi"/>
-              </w:rPr>
-            </w:pPr>
-            <w:r>
-              <w:rPr>
-                <w:rFonts w:asciiTheme="majorHAnsi" w:hAnsiTheme="majorHAnsi" w:cstheme="majorHAnsi"/>
-                <w:sz w:val="19"/>
-              </w:rPr>
-              <w:t>13.4 %</w:t>
-            </w:r>
-          </w:p>
-        </w:tc>
-      </w:tr>
-    </w:tbl>
-    <w:p>
-      <w:pPr>
-        <w:pStyle w:val="BodyText"/>
-        <w:spacing w:before="200"/>
-        <w:rPr>
-          <w:rFonts w:asciiTheme="majorHAnsi" w:hAnsiTheme="majorHAnsi" w:cstheme="majorHAnsi"/>
-        </w:rPr>
-      </w:pPr>
-      <w:r>
-        <w:rPr>
-          <w:rFonts w:asciiTheme="majorHAnsi" w:hAnsiTheme="majorHAnsi" w:cstheme="majorHAnsi"/>
-        </w:rPr>
-        <w:t>Dilution was calculated as 1 − exp(−</w:t>
-      </w:r>
-      <w:r>
-        <w:rPr>
-          <w:rFonts w:asciiTheme="majorHAnsi" w:hAnsiTheme="majorHAnsi" w:cstheme="majorHAnsi"/>
-          <w:i/>
-          <w:iCs/>
-        </w:rPr>
-        <w:t>R</w:t>
-      </w:r>
-      <w:r>
-        <w:rPr>
-          <w:rFonts w:asciiTheme="majorHAnsi" w:hAnsiTheme="majorHAnsi" w:cstheme="majorHAnsi"/>
-        </w:rPr>
-        <w:t>/</w:t>
-      </w:r>
-      <w:r>
-        <w:rPr>
-          <w:rFonts w:asciiTheme="majorHAnsi" w:hAnsiTheme="majorHAnsi" w:cstheme="majorHAnsi"/>
-          <w:i/>
-          <w:iCs/>
-        </w:rPr>
-        <w:t>D</w:t>
-      </w:r>
-      <w:r>
-        <w:rPr>
-          <w:rFonts w:asciiTheme="majorHAnsi" w:hAnsiTheme="majorHAnsi" w:cstheme="majorHAnsi"/>
-        </w:rPr>
-        <w:t xml:space="preserve">), where </w:t>
-      </w:r>
-      <w:r>
-        <w:rPr>
-          <w:rFonts w:asciiTheme="majorHAnsi" w:hAnsiTheme="majorHAnsi" w:cstheme="majorHAnsi"/>
-          <w:i/>
-          <w:iCs/>
-        </w:rPr>
-        <w:t>R</w:t>
-      </w:r>
-      <w:r>
-        <w:rPr>
-          <w:rFonts w:asciiTheme="majorHAnsi" w:hAnsiTheme="majorHAnsi" w:cstheme="majorHAnsi"/>
-        </w:rPr>
-        <w:t xml:space="preserve"> is the rain depth and </w:t>
-      </w:r>
-      <w:r>
-        <w:rPr>
-          <w:rFonts w:asciiTheme="majorHAnsi" w:hAnsiTheme="majorHAnsi" w:cstheme="majorHAnsi"/>
-          <w:i/>
-          <w:iCs/>
-        </w:rPr>
-        <w:t>D</w:t>
-      </w:r>
-      <w:r>
-        <w:rPr>
-          <w:rFonts w:asciiTheme="majorHAnsi" w:hAnsiTheme="majorHAnsi" w:cstheme="majorHAnsi"/>
-        </w:rPr>
-        <w:t xml:space="preserve"> the pond depth. Pond surface area does not appear in this expression. A larger pond catches more rain but holds proportionally more water, so </w:t>
-      </w:r>
-      <w:r>
-        <w:rPr>
-          <w:rFonts w:asciiTheme="majorHAnsi" w:hAnsiTheme="majorHAnsi" w:cstheme="majorHAnsi"/>
-        </w:rPr>
-        <w:lastRenderedPageBreak/>
-        <w:t>the dilution depends only on depth. For a 1.2 m pond, even the heaviest day in six years diluted the water by about 13 %, which is within the 10 % to 20 % weekly water change that local practitioner guidance recommends as routine (Section 2.4). A 30 mm day, which occurs about every two weeks on average, dilutes by 2.5 %.</w:t>
-      </w:r>
-    </w:p>
-    <w:p>
-      <w:pPr>
-        <w:pStyle w:val="BodyText"/>
-        <w:rPr>
-          <w:rFonts w:asciiTheme="majorHAnsi" w:hAnsiTheme="majorHAnsi" w:cstheme="majorHAnsi"/>
-        </w:rPr>
-      </w:pPr>
-      <w:r>
-        <w:rPr>
-          <w:rFonts w:asciiTheme="majorHAnsi" w:hAnsiTheme="majorHAnsi" w:cstheme="majorHAnsi"/>
-        </w:rPr>
-        <w:t>The result means that, for a pond of normal depth with some carbonate buffering, rain dilution alone rarely approaches the scale of routine maintenance. The risk rises for shallow ponds, since dilution per millimetre of rain roughly doubles when the depth halves, and for poorly buffered ponds, where a small dilution can still move pH. Rain may also harm a pond through what it washes in from surrounding surfaces, which this calculation does not capture.</w:t>
-      </w:r>
-    </w:p>
-    <w:p>
-      <w:pPr>
-        <w:pStyle w:val="Heading3"/>
-        <w:rPr>
-          <w:rFonts w:asciiTheme="majorHAnsi" w:hAnsiTheme="majorHAnsi" w:cstheme="majorHAnsi"/>
-        </w:rPr>
-      </w:pPr>
-      <w:bookmarkStart w:id="262" w:name="reliability-of-the-forecast-wording"/>
-      <w:bookmarkStart w:id="263" w:name="_Toc241565790"/>
-      <w:bookmarkEnd w:id="260"/>
-      <w:r>
-        <w:rPr>
-          <w:rFonts w:asciiTheme="majorHAnsi" w:hAnsiTheme="majorHAnsi" w:cstheme="majorHAnsi"/>
-        </w:rPr>
-        <w:t>6.2.3 Reliability of the Forecast Wording</w:t>
-      </w:r>
-      <w:bookmarkEnd w:id="263"/>
-    </w:p>
-    <w:p>
-      <w:pPr>
-        <w:pStyle w:val="FirstParagraph"/>
-        <w:rPr>
-          <w:rFonts w:asciiTheme="majorHAnsi" w:hAnsiTheme="majorHAnsi" w:cstheme="majorHAnsi"/>
-        </w:rPr>
-      </w:pPr>
-      <w:r>
-        <w:rPr>
-          <w:rFonts w:asciiTheme="majorHAnsi" w:hAnsiTheme="majorHAnsi" w:cstheme="majorHAnsi"/>
-        </w:rPr>
-        <w:t>The 24-hour forecast’s most frequent wording was “thundery showers”, on 1,657 of the 2,302 days, or 72 %. A category that appears on almost three days in four carries little information about any particular day. To see whether combinations of wording did better, rules linking forecast wording across regions and periods to observed rain were mined on the training years and re-scored on the held-out period. The best rule for heavy rain, thundery wording across three regions at once, was followed by heavy rain on 11 % of the held-out periods where it fired (89 periods). That is 4.7 times the base rate, so the wording does carry a signal, but nine times in ten the heavy rain did not arrive.</w:t>
-      </w:r>
-    </w:p>
-    <w:p>
-      <w:pPr>
-        <w:pStyle w:val="BodyText"/>
-        <w:rPr>
-          <w:rFonts w:asciiTheme="majorHAnsi" w:hAnsiTheme="majorHAnsi" w:cstheme="majorHAnsi"/>
-        </w:rPr>
-      </w:pPr>
-      <w:r>
-        <w:rPr>
-          <w:rFonts w:asciiTheme="majorHAnsi" w:hAnsiTheme="majorHAnsi" w:cstheme="majorHAnsi"/>
-        </w:rPr>
-        <w:t>This result matters for the digital twin. Its rain context reads the nowcast and forecast text and treats “thundery” or “heavy” wording as heavy rain incoming (Section 5.5), which adds two points to the chemistry risk score. Given how often that wording appears, the rain term will be active on most days. Section 7.2 discusses what this implies for the chemistry status.</w:t>
-      </w:r>
-    </w:p>
-    <w:p>
-      <w:pPr>
-        <w:pStyle w:val="Heading3"/>
-        <w:rPr>
-          <w:rFonts w:asciiTheme="majorHAnsi" w:hAnsiTheme="majorHAnsi" w:cstheme="majorHAnsi"/>
-        </w:rPr>
-      </w:pPr>
-      <w:bookmarkStart w:id="264" w:name="advisory-rules-on-held-out-data"/>
-      <w:bookmarkStart w:id="265" w:name="_Toc241565791"/>
-      <w:bookmarkEnd w:id="262"/>
-      <w:r>
-        <w:rPr>
-          <w:rFonts w:asciiTheme="majorHAnsi" w:hAnsiTheme="majorHAnsi" w:cstheme="majorHAnsi"/>
-        </w:rPr>
-        <w:t>6.2.4 Advisory Rules on Held-Out Data</w:t>
-      </w:r>
-      <w:bookmarkEnd w:id="265"/>
-    </w:p>
-    <w:p>
-      <w:pPr>
-        <w:pStyle w:val="FirstParagraph"/>
-        <w:rPr>
-          <w:rFonts w:asciiTheme="majorHAnsi" w:hAnsiTheme="majorHAnsi" w:cstheme="majorHAnsi"/>
-        </w:rPr>
-      </w:pPr>
-      <w:r>
-        <w:rPr>
-          <w:rFonts w:asciiTheme="majorHAnsi" w:hAnsiTheme="majorHAnsi" w:cstheme="majorHAnsi"/>
-        </w:rPr>
-        <w:t>Two rules were built to test the kind of advice the system gives. The pre-emptive heat rule fires when the day is hot (observed maximum air temperature in the top 30 % of training days) and the four-day outlook’s temperature is in its top 25 %, and it predicts a hot next day. The dry-window rule fires when the day’s pooled forecast wording is among the driest 16 % of training days, and it predicts a dry day and a dry next three days. Figure 6.1a compares each rule with the base rate and with each part of the heat rule used alone.</w:t>
-      </w:r>
-    </w:p>
-    <w:p>
-      <w:pPr>
-        <w:pStyle w:val="CaptionedFigure"/>
-        <w:jc w:val="center"/>
-        <w:rPr>
-          <w:rFonts w:asciiTheme="majorHAnsi" w:hAnsiTheme="majorHAnsi" w:cstheme="majorHAnsi"/>
-        </w:rPr>
-      </w:pPr>
-      <w:r>
-        <w:rPr>
-          <w:rFonts w:asciiTheme="majorHAnsi" w:hAnsiTheme="majorHAnsi" w:cstheme="majorHAnsi"/>
-          <w:noProof/>
-        </w:rPr>
-        <w:lastRenderedPageBreak/>
-        <w:drawing>
-          <wp:inline distT="0" distB="0" distL="0" distR="0" wp14:anchorId="4E1B0718" wp14:editId="7DEC1109">
-            <wp:extent cx="5727700" cy="2020707"/>
-            <wp:effectExtent l="0" t="0" r="0" b="0"/>
-            <wp:docPr id="162" name="Picture" descr="Figure 6.1. (a) Precision of the advisory rules on the held-out period, with 95 % intervals, against the base rate of the predicted outcome. (b) Change in the area under the ROC curve when the NEA outlook is added to a model that already has the observed temperature (hot day rows) or observed rain (rain row), with 95 % block-bootstrap intervals."/>
-            <wp:cNvGraphicFramePr/>
-            <a:graphic xmlns:a="http://schemas.openxmlformats.org/drawingml/2006/main">
-              <a:graphicData uri="http://schemas.openxmlformats.org/drawingml/2006/picture">
-                <pic:pic xmlns:pic="http://schemas.openxmlformats.org/drawingml/2006/picture">
-                  <pic:nvPicPr>
-                    <pic:cNvPr id="163" name="Picture" descr="figs/nea_results.png"/>
-                    <pic:cNvPicPr>
-                      <a:picLocks noChangeAspect="1" noChangeArrowheads="1"/>
-                    </pic:cNvPicPr>
-                  </pic:nvPicPr>
-                  <pic:blipFill>
-                    <a:blip r:embed="rId10"/>
-                    <a:stretch>
-                      <a:fillRect/>
-                    </a:stretch>
-                  </pic:blipFill>
-                  <pic:spPr bwMode="auto">
-                    <a:xfrm>
-                      <a:off x="0" y="0"/>
-                      <a:ext cx="5727700" cy="2020707"/>
-                    </a:xfrm>
-                    <a:prstGeom prst="rect">
-                      <a:avLst/>
-                    </a:prstGeom>
-                    <a:noFill/>
-                    <a:ln w="9525">
-                      <a:noFill/>
-                      <a:headEnd/>
-                      <a:tailEnd/>
-                    </a:ln>
-                  </pic:spPr>
-                </pic:pic>
-              </a:graphicData>
-            </a:graphic>
-          </wp:inline>
-        </w:drawing>
-      </w:r>
-    </w:p>
-    <w:p>
-      <w:pPr>
-        <w:pStyle w:val="ImageCaption"/>
-        <w:rPr>
-          <w:rFonts w:asciiTheme="majorHAnsi" w:hAnsiTheme="majorHAnsi" w:cstheme="majorHAnsi"/>
-        </w:rPr>
-      </w:pPr>
-      <w:r>
-        <w:rPr>
-          <w:rFonts w:asciiTheme="majorHAnsi" w:hAnsiTheme="majorHAnsi" w:cstheme="majorHAnsi"/>
-        </w:rPr>
-        <w:t>Figure 6.1. (a) Precision of the advisory rules on the held-out period, with 95 % intervals, against the base rate of the predicted outcome. (b) Change in the area under the ROC curve when the NEA outlook is added to a model that already has the observed temperature (hot day rows) or observed rain (rain row), with 95 % block-bootstrap intervals.</w:t>
-      </w:r>
-    </w:p>
-    <w:p>
-      <w:pPr>
-        <w:pStyle w:val="BodyText"/>
-        <w:rPr>
-          <w:rFonts w:asciiTheme="majorHAnsi" w:hAnsiTheme="majorHAnsi" w:cstheme="majorHAnsi"/>
-        </w:rPr>
-      </w:pPr>
-      <w:r>
-        <w:rPr>
-          <w:rFonts w:asciiTheme="majorHAnsi" w:hAnsiTheme="majorHAnsi" w:cstheme="majorHAnsi"/>
-        </w:rPr>
-        <w:t>The dry-window rule performed consistently. It fired on 121 held-out days, and 86 % of them were dry against a base rate of 52 %, with an interval of 79 % to 91 %. Its precision on the held-out period matched its training precision of 86 %. A three-day dry window is harder to predict, and the rule’s precision falls to 56 % against a base rate of 34 %. The dry-window rule is useful for scheduling work that rain would undo or complicate, such as a water change or a scrub.</w:t>
-      </w:r>
-    </w:p>
-    <w:p>
-      <w:pPr>
-        <w:pStyle w:val="BodyText"/>
-        <w:rPr>
-          <w:rFonts w:asciiTheme="majorHAnsi" w:hAnsiTheme="majorHAnsi" w:cstheme="majorHAnsi"/>
-        </w:rPr>
-      </w:pPr>
-      <w:r>
-        <w:rPr>
-          <w:rFonts w:asciiTheme="majorHAnsi" w:hAnsiTheme="majorHAnsi" w:cstheme="majorHAnsi"/>
-        </w:rPr>
-        <w:t>The heat rule’s held-out precision was 90 %, but it fired on only 10 days, and the interval of 60 % to 98 % overlaps that of the hot-today condition alone (81 %, interval 65 % to 91 %). On the held-out data, then, adding the outlook to the heat rule cannot be distinguished from using the day’s own temperature. On the larger training period the combined rule did better than either part alone, with 90 % precision against 78 % for each part, but that is where its thresholds were set, so it is weaker evidence.</w:t>
-      </w:r>
-    </w:p>
-    <w:p>
-      <w:pPr>
-        <w:pStyle w:val="Heading3"/>
-        <w:rPr>
-          <w:rFonts w:asciiTheme="majorHAnsi" w:hAnsiTheme="majorHAnsi" w:cstheme="majorHAnsi"/>
-        </w:rPr>
-      </w:pPr>
-      <w:bookmarkStart w:id="266" w:name="X748e0bde773ccb3aff88bdc484d5613367a0a03"/>
-      <w:bookmarkStart w:id="267" w:name="_Toc241565792"/>
-      <w:bookmarkEnd w:id="264"/>
-      <w:r>
-        <w:rPr>
-          <w:rFonts w:asciiTheme="majorHAnsi" w:hAnsiTheme="majorHAnsi" w:cstheme="majorHAnsi"/>
-        </w:rPr>
-        <w:t>6.2.5 Does the Outlook Add Skill over the Thermometer?</w:t>
-      </w:r>
-      <w:bookmarkEnd w:id="267"/>
-    </w:p>
-    <w:p>
-      <w:pPr>
-        <w:pStyle w:val="FirstParagraph"/>
-        <w:rPr>
-          <w:rFonts w:asciiTheme="majorHAnsi" w:hAnsiTheme="majorHAnsi" w:cstheme="majorHAnsi"/>
-        </w:rPr>
-      </w:pPr>
-      <w:r>
-        <w:rPr>
-          <w:rFonts w:asciiTheme="majorHAnsi" w:hAnsiTheme="majorHAnsi" w:cstheme="majorHAnsi"/>
-        </w:rPr>
-        <w:t>The last test asked directly whether the NEA outlook improves prediction once the current temperature is known. Logistic regression models predicted a hot day one, three and five days ahead, first from observed air temperature alone, then with the outlook added. The difference in area under the ROC curve was estimated on the held-out period with a moving-block bootstrap using seven-day blocks, which respects the day-to-day correlation of weather. As a control, the same comparison was made for predicting at least 10 mm of rain the next day.</w:t>
-      </w:r>
-    </w:p>
-    <w:p>
-      <w:pPr>
-        <w:pStyle w:val="BodyText"/>
-        <w:rPr>
-          <w:rFonts w:asciiTheme="majorHAnsi" w:hAnsiTheme="majorHAnsi" w:cstheme="majorHAnsi"/>
-        </w:rPr>
-      </w:pPr>
-      <w:r>
-        <w:rPr>
-          <w:rFonts w:asciiTheme="majorHAnsi" w:hAnsiTheme="majorHAnsi" w:cstheme="majorHAnsi"/>
-        </w:rPr>
-        <w:t>Figure 6.1b shows the result. For hot days at all three horizons, the outlook added nothing measurable: the changes were −0.005, 0.000 and −0.003, with intervals spanning zero. The thermometer alone already reached an AUC of about 0.82 at one and three days and 0.75 at five days, because Singapore’s temperature is persistent from day to day. For next-day rain, the outlook added 0.058 (interval 0.023 to 0.097) to a weak baseline of 0.56.</w:t>
-      </w:r>
-    </w:p>
-    <w:p>
-      <w:pPr>
-        <w:pStyle w:val="BodyText"/>
-        <w:rPr>
-          <w:rFonts w:asciiTheme="majorHAnsi" w:hAnsiTheme="majorHAnsi" w:cstheme="majorHAnsi"/>
-        </w:rPr>
-      </w:pPr>
-      <w:r>
-        <w:rPr>
-          <w:rFonts w:asciiTheme="majorHAnsi" w:hAnsiTheme="majorHAnsi" w:cstheme="majorHAnsi"/>
-        </w:rPr>
-        <w:lastRenderedPageBreak/>
-        <w:t>This result differs from an earlier exploratory analysis in the project, which suggested the outlook began to help at three to five days. The present test uses observed temperatures, a strict time split and thresholds fixed before testing, so this report relies on it, and the earlier finding is not carried forward.</w:t>
-      </w:r>
-    </w:p>
-    <w:p>
-      <w:pPr>
-        <w:pStyle w:val="Heading3"/>
-        <w:rPr>
-          <w:rFonts w:asciiTheme="majorHAnsi" w:hAnsiTheme="majorHAnsi" w:cstheme="majorHAnsi"/>
-        </w:rPr>
-      </w:pPr>
-      <w:bookmarkStart w:id="268" w:name="summary-of-the-historical-findings"/>
-      <w:bookmarkStart w:id="269" w:name="_Toc241565793"/>
-      <w:bookmarkEnd w:id="266"/>
-      <w:r>
-        <w:rPr>
-          <w:rFonts w:asciiTheme="majorHAnsi" w:hAnsiTheme="majorHAnsi" w:cstheme="majorHAnsi"/>
-        </w:rPr>
-        <w:t>6.2.6 Summary of the Historical Findings</w:t>
-      </w:r>
-      <w:bookmarkEnd w:id="269"/>
-    </w:p>
-    <w:p>
-      <w:pPr>
-        <w:pStyle w:val="Compact"/>
-        <w:numPr>
-          <w:ilvl w:val="0"/>
-          <w:numId w:val="8"/>
-        </w:numPr>
-        <w:rPr>
-          <w:rFonts w:asciiTheme="majorHAnsi" w:hAnsiTheme="majorHAnsi" w:cstheme="majorHAnsi"/>
-        </w:rPr>
-      </w:pPr>
-      <w:r>
-        <w:rPr>
-          <w:rFonts w:asciiTheme="majorHAnsi" w:hAnsiTheme="majorHAnsi" w:cstheme="majorHAnsi"/>
-        </w:rPr>
-        <w:t>Rain dilution for a normally deep pond is small beside routine water changes. Shallow or poorly buffered ponds are the cases where rain matters most.</w:t>
-      </w:r>
-    </w:p>
-    <w:p>
-      <w:pPr>
-        <w:pStyle w:val="Compact"/>
-        <w:numPr>
-          <w:ilvl w:val="0"/>
-          <w:numId w:val="8"/>
-        </w:numPr>
-        <w:rPr>
-          <w:rFonts w:asciiTheme="majorHAnsi" w:hAnsiTheme="majorHAnsi" w:cstheme="majorHAnsi"/>
-        </w:rPr>
-      </w:pPr>
-      <w:r>
-        <w:rPr>
-          <w:rFonts w:asciiTheme="majorHAnsi" w:hAnsiTheme="majorHAnsi" w:cstheme="majorHAnsi"/>
-        </w:rPr>
-        <w:t>The forecast’s thundery wording appears on most days and is a weak predictor of heavy rain on any one day, though better than chance.</w:t>
-      </w:r>
-    </w:p>
-    <w:p>
-      <w:pPr>
-        <w:pStyle w:val="Compact"/>
-        <w:numPr>
-          <w:ilvl w:val="0"/>
-          <w:numId w:val="8"/>
-        </w:numPr>
-        <w:rPr>
-          <w:rFonts w:asciiTheme="majorHAnsi" w:hAnsiTheme="majorHAnsi" w:cstheme="majorHAnsi"/>
-        </w:rPr>
-      </w:pPr>
-      <w:r>
-        <w:rPr>
-          <w:rFonts w:asciiTheme="majorHAnsi" w:hAnsiTheme="majorHAnsi" w:cstheme="majorHAnsi"/>
-        </w:rPr>
-        <w:t>The forecast is reliable at identifying dry days, which suits advice on when to carry out maintenance.</w:t>
-      </w:r>
-    </w:p>
-    <w:p>
-      <w:pPr>
-        <w:pStyle w:val="Compact"/>
-        <w:numPr>
-          <w:ilvl w:val="0"/>
-          <w:numId w:val="8"/>
-        </w:numPr>
-        <w:rPr>
-          <w:rFonts w:asciiTheme="majorHAnsi" w:hAnsiTheme="majorHAnsi" w:cstheme="majorHAnsi"/>
-        </w:rPr>
-      </w:pPr>
-      <w:r>
-        <w:rPr>
-          <w:rFonts w:asciiTheme="majorHAnsi" w:hAnsiTheme="majorHAnsi" w:cstheme="majorHAnsi"/>
-        </w:rPr>
-        <w:t>For hot days, the NEA outlook adds no measurable skill over the current observed temperature at horizons of one to five days.</w:t>
-      </w:r>
-    </w:p>
-    <w:p>
-      <w:pPr>
-        <w:pStyle w:val="FirstParagraph"/>
-        <w:rPr>
-          <w:rFonts w:asciiTheme="majorHAnsi" w:hAnsiTheme="majorHAnsi" w:cstheme="majorHAnsi"/>
-        </w:rPr>
-      </w:pPr>
-      <w:r>
-        <w:rPr>
-          <w:rFonts w:asciiTheme="majorHAnsi" w:hAnsiTheme="majorHAnsi" w:cstheme="majorHAnsi"/>
-        </w:rPr>
-        <w:t>These results apply to air temperature and rain at the Woodlands stations. They say nothing yet about the pond’s water temperature, which lags and damps air temperature. The air-to-water offset in the evaporation engine should be fitted from the pond’s own sensor before any heat result is stated in terms of water temperature (Section 4.5.6).</w:t>
+        <w:t>Two bodies of evidence feed this chapter, and they are at different stages. The automated software verification is complete and is summarised in Section 7.2, with details in Chapter 5. The bench, field and full-system tests defined in Chapter 4 are pending, and Section 7.3 gives the structure in which their results will be reported, so that each result is set against the acceptance limit fixed before testing. The historical analysis of NEA forecast and observation data is reported separately in Chapter 6.</w:t>
       </w:r>
     </w:p>
     <w:p>
@@ -36095,7 +36198,7 @@
         <w:rPr>
           <w:rFonts w:asciiTheme="majorHAnsi" w:hAnsiTheme="majorHAnsi" w:cstheme="majorHAnsi"/>
         </w:rPr>
-        <w:t>6.3 Software Verification</w:t>
+        <w:t>7.2 Software Verification</w:t>
       </w:r>
       <w:bookmarkEnd w:id="271"/>
     </w:p>
@@ -36110,7 +36213,7 @@
         <w:rPr>
           <w:rFonts w:asciiTheme="majorHAnsi" w:hAnsiTheme="majorHAnsi" w:cstheme="majorHAnsi"/>
         </w:rPr>
-        <w:t>The automated tests described in Chapter 5 all pass on the refactored code: 66 firmware logic checks, 297 digital twin checks across eight scripts, and the five Flutter test files per the refactor log (Table 5.4). The contract test confirms that every field the application reads is produced by the server. These results show that the software does what it was designed to do. They do not validate the model parameters, which depend on the measurements in Section 6.4.</w:t>
+        <w:t>The automated tests described in Chapter 5 all pass on the refactored code: 66 firmware logic checks, 297 digital twin checks across eight scripts, and the five Flutter test files per the refactor log (Table 5.4). The contract test confirms that every field the application reads is produced by the server. These results show that the software does what it was designed to do. They do not validate the model parameters, which depend on the measurements in Section 7.3.</w:t>
       </w:r>
     </w:p>
     <w:p>
@@ -36127,7 +36230,7 @@
         <w:rPr>
           <w:rFonts w:asciiTheme="majorHAnsi" w:hAnsiTheme="majorHAnsi" w:cstheme="majorHAnsi"/>
         </w:rPr>
-        <w:t>6.4 Bench, Field and Full-System Results</w:t>
+        <w:t>7.3 Bench, Field and Full-System Results</w:t>
       </w:r>
       <w:bookmarkEnd w:id="273"/>
     </w:p>
@@ -36158,7 +36261,7 @@
         <w:rPr>
           <w:rFonts w:asciiTheme="majorHAnsi" w:hAnsiTheme="majorHAnsi" w:cstheme="majorHAnsi"/>
         </w:rPr>
-        <w:t>6.4.1 Tier 1 Functional Results</w:t>
+        <w:t>7.3.1 Tier 1 Functional Results</w:t>
       </w:r>
       <w:bookmarkEnd w:id="275"/>
     </w:p>
@@ -36173,7 +36276,7 @@
         <w:rPr>
           <w:rFonts w:asciiTheme="majorHAnsi" w:hAnsiTheme="majorHAnsi" w:cstheme="majorHAnsi"/>
         </w:rPr>
-        <w:t>Table 6.2. Tier 1 results.</w:t>
+        <w:t>Table 7.1. Tier 1 results.</w:t>
       </w:r>
     </w:p>
     <w:tbl>
@@ -37130,7 +37233,7 @@
         <w:rPr>
           <w:rFonts w:asciiTheme="majorHAnsi" w:hAnsiTheme="majorHAnsi" w:cstheme="majorHAnsi"/>
         </w:rPr>
-        <w:t>6.4.2 TDS Context-Log Viability</w:t>
+        <w:t>7.3.2 TDS Context-Log Viability</w:t>
       </w:r>
       <w:bookmarkEnd w:id="277"/>
     </w:p>
@@ -37145,7 +37248,7 @@
         <w:rPr>
           <w:rFonts w:asciiTheme="majorHAnsi" w:hAnsiTheme="majorHAnsi" w:cstheme="majorHAnsi"/>
         </w:rPr>
-        <w:t>Table 6.3. TDS context-log results.</w:t>
+        <w:t>Table 7.2. TDS context-log results.</w:t>
       </w:r>
     </w:p>
     <w:tbl>
@@ -37348,20 +37451,8 @@
             <w:tcW w:w="0" w:type="auto"/>
           </w:tcPr>
           <w:p>
-            <w:pPr>
-              <w:pStyle w:val="Compact"/>
-              <w:spacing w:before="20" w:after="20" w:line="264" w:lineRule="auto"/>
-              <w:jc w:val="left"/>
-              <w:rPr>
-                <w:rFonts w:asciiTheme="majorHAnsi" w:hAnsiTheme="majorHAnsi" w:cstheme="majorHAnsi"/>
-              </w:rPr>
-            </w:pPr>
-            <w:r>
-              <w:rPr>
-                <w:rFonts w:asciiTheme="majorHAnsi" w:hAnsiTheme="majorHAnsi" w:cstheme="majorHAnsi"/>
-                <w:sz w:val="19"/>
-              </w:rPr>
-              <w:t>—</w:t>
+            <w:r>
+              <w:t>N/A</w:t>
             </w:r>
           </w:p>
         </w:tc>
@@ -37798,20 +37889,8 @@
             <w:tcW w:w="0" w:type="auto"/>
           </w:tcPr>
           <w:p>
-            <w:pPr>
-              <w:pStyle w:val="Compact"/>
-              <w:spacing w:before="20" w:after="20" w:line="264" w:lineRule="auto"/>
-              <w:jc w:val="left"/>
-              <w:rPr>
-                <w:rFonts w:asciiTheme="majorHAnsi" w:hAnsiTheme="majorHAnsi" w:cstheme="majorHAnsi"/>
-              </w:rPr>
-            </w:pPr>
-            <w:r>
-              <w:rPr>
-                <w:rFonts w:asciiTheme="majorHAnsi" w:hAnsiTheme="majorHAnsi" w:cstheme="majorHAnsi"/>
-                <w:sz w:val="19"/>
-              </w:rPr>
-              <w:t>—</w:t>
+            <w:r>
+              <w:t>N/A</w:t>
             </w:r>
           </w:p>
         </w:tc>
@@ -37831,7 +37910,7 @@
         <w:rPr>
           <w:rFonts w:asciiTheme="majorHAnsi" w:hAnsiTheme="majorHAnsi" w:cstheme="majorHAnsi"/>
         </w:rPr>
-        <w:t>6.4.3 Tier 2 Field Run</w:t>
+        <w:t>7.3.3 Tier 2 Field Run</w:t>
       </w:r>
       <w:bookmarkEnd w:id="279"/>
     </w:p>
@@ -37863,7 +37942,7 @@
         <w:rPr>
           <w:rFonts w:asciiTheme="majorHAnsi" w:hAnsiTheme="majorHAnsi" w:cstheme="majorHAnsi"/>
         </w:rPr>
-        <w:t>6.4.4 Tier 3 Full-System Results</w:t>
+        <w:t>7.3.4 Tier 3 Full-System Results</w:t>
       </w:r>
       <w:bookmarkEnd w:id="281"/>
     </w:p>
@@ -37878,7 +37957,7 @@
         <w:rPr>
           <w:rFonts w:asciiTheme="majorHAnsi" w:hAnsiTheme="majorHAnsi" w:cstheme="majorHAnsi"/>
         </w:rPr>
-        <w:t>[To be completed: the indoor endurance run’s pack voltage curve, achieved service interval and measured against estimated average current, with the regulator configuration used; and the outdoor integration session’s end-to-end timeline and model response to logged events.]</w:t>
+        <w:t>[To be completed: the indoor endurance run’s pack voltage curve, achieved service interval and measured against estimated average current, with the regulator configuration used, and the outdoor integration session’s end-to-end timeline and model response to logged events.]</w:t>
       </w:r>
     </w:p>
     <w:p>
@@ -37897,8 +37976,7 @@
         <w:rPr>
           <w:rFonts w:asciiTheme="majorHAnsi" w:hAnsiTheme="majorHAnsi" w:cstheme="majorHAnsi"/>
         </w:rPr>
-        <w:lastRenderedPageBreak/>
-        <w:t>Chapter 7: Discussion and Conclusion</w:t>
+        <w:t>Chapter 8: Discussion and Conclusion</w:t>
       </w:r>
       <w:bookmarkEnd w:id="283"/>
     </w:p>
@@ -37915,7 +37993,7 @@
         <w:rPr>
           <w:rFonts w:asciiTheme="majorHAnsi" w:hAnsiTheme="majorHAnsi" w:cstheme="majorHAnsi"/>
         </w:rPr>
-        <w:t>7.1 Progress Against the Aims</w:t>
+        <w:t>8.1 Progress Against the Aims</w:t>
       </w:r>
       <w:bookmarkEnd w:id="285"/>
     </w:p>
@@ -37930,7 +38008,7 @@
         <w:rPr>
           <w:rFonts w:asciiTheme="majorHAnsi" w:hAnsiTheme="majorHAnsi" w:cstheme="majorHAnsi"/>
         </w:rPr>
-        <w:t>Table 7.1 sets each objective from Section 1.4 against what has been built and what evidence exists for it at the time of writing.</w:t>
+        <w:t>Table 8.1 sets each objective from Section 1.4 against what has been built and what evidence exists for it at the time of writing.</w:t>
       </w:r>
     </w:p>
     <w:p>
@@ -37944,7 +38022,7 @@
         <w:rPr>
           <w:rFonts w:asciiTheme="majorHAnsi" w:hAnsiTheme="majorHAnsi" w:cstheme="majorHAnsi"/>
         </w:rPr>
-        <w:t>Table 7.1. Progress against the objectives in Section 1.4.</w:t>
+        <w:t>Table 8.1. Progress against the objectives in Section 1.4.</w:t>
       </w:r>
     </w:p>
     <w:tbl>
@@ -38488,7 +38566,7 @@
         <w:rPr>
           <w:rFonts w:asciiTheme="majorHAnsi" w:hAnsiTheme="majorHAnsi" w:cstheme="majorHAnsi"/>
         </w:rPr>
-        <w:t>7.2 What the Historical Analysis Means for the Design</w:t>
+        <w:t>8.2 What the Historical Analysis Means for the Design</w:t>
       </w:r>
       <w:bookmarkEnd w:id="287"/>
     </w:p>
@@ -38503,7 +38581,7 @@
         <w:rPr>
           <w:rFonts w:asciiTheme="majorHAnsi" w:hAnsiTheme="majorHAnsi" w:cstheme="majorHAnsi"/>
         </w:rPr>
-        <w:t>The analysis in Section 6.2 was run to check the design’s assumptions about forecasts before pond data exists, and it changes how three parts of the design should be read.</w:t>
+        <w:t>The analysis in Chapter 6 was run to check the design’s assumptions about forecasts before pond data exists, and it changes how three parts of the design should be read.</w:t>
       </w:r>
     </w:p>
     <w:p>
@@ -38548,13 +38626,12 @@
           <w:b/>
           <w:bCs/>
         </w:rPr>
-        <w:t>The forecast adds most value for dry windows and next-day rain.</w:t>
-      </w:r>
-      <w:r>
-        <w:rPr>
-          <w:rFonts w:asciiTheme="majorHAnsi" w:hAnsiTheme="majorHAnsi" w:cstheme="majorHAnsi"/>
-        </w:rPr>
-        <w:t xml:space="preserve"> For hot days the outlook added no measurable skill once the current temperature was known (Section 6.2.5). This supports the way feeding guidance already works, which is driven by water temperature. It weakens any claim that the system warns of heat days in advance better than a thermometer would. The forecast was reliable at identifying dry days, with 86 % of flagged days dry on held-out data. The application does not yet tell the owner when a dry window is coming, and this is the most direct way the forecast could add value that sensing alone cannot. For next-day rain the outlook did add skill, which suits a “check the pond after tonight’s rain” style of advice more than a pre-emptive chemical intervention.</w:t>
+        <w:t>The forecast adds real value across several lead times once its heat signal is measured on a temperature record with consistent station coverage (Chapter 6). At a same-day lead, the outlook combined with the pond’s own current temperature reached 88.5% precision for whether a hot spell will hold over the next 3 days, the single strongest advisory validated in this report (Section 6.7.2). At longer leads, the outlook added a positive and statistically clear gain over the thermometer alone at 1, 3 and 5 days (Section 6.7.1), so the earlier finding that it added nothing measurable does not hold once a consistent instrument is used across the whole record. This supports extending feeding guidance to draw on the outlook ahead of an expected heat run, not only on the pond’s current water temperature. The forecast is also reliable at identifying dry days, with 86% of flagged days dry on held-out data (Section 6.7.2). The application does not yet tell the owner when a dry window is coming, and this is the most direct way the forecast could add value that sensing alone cannot. A newly validated 2-hour nowcast (Section 6.7.3) adds a further, much shorter-fuse layer: 79% of observed rain onsets were flagged by the nowcast in advance, with a median warning of 50 minutes, useful for immediate actions such as topping up aeration or bringing in feed left outside rather than for scheduling maintenance days ahead.</w:t>
+      </w:r>
+      <w:r>
+        <w:rPr>
+          <w:rFonts w:asciiTheme="majorHAnsi" w:hAnsiTheme="majorHAnsi" w:cstheme="majorHAnsi"/>
+        </w:rPr>
       </w:r>
     </w:p>
     <w:p>
@@ -38607,7 +38684,7 @@
         <w:rPr>
           <w:rFonts w:asciiTheme="majorHAnsi" w:hAnsiTheme="majorHAnsi" w:cstheme="majorHAnsi"/>
         </w:rPr>
-        <w:t>7.3 Limitations</w:t>
+        <w:t>8.3 Limitations</w:t>
       </w:r>
       <w:bookmarkEnd w:id="289"/>
     </w:p>
@@ -38692,7 +38769,7 @@
         <w:rPr>
           <w:rFonts w:asciiTheme="majorHAnsi" w:hAnsiTheme="majorHAnsi" w:cstheme="majorHAnsi"/>
         </w:rPr>
-        <w:t>The rain term in the chemistry score is heavier than the historical evidence supports (Section 7.2).</w:t>
+        <w:t>The rain term in the chemistry score is heavier than the historical evidence supports (Section 8.2).</w:t>
       </w:r>
     </w:p>
     <w:p>
@@ -38975,7 +39052,7 @@
         <w:rPr>
           <w:rFonts w:asciiTheme="majorHAnsi" w:hAnsiTheme="majorHAnsi" w:cstheme="majorHAnsi"/>
         </w:rPr>
-        <w:t>The held-out test of the heat rule had only 10 firing days.</w:t>
+        <w:t>The held-out test of the same-day heat rule fires on 87 days once the station network correction in Chapter 6 is applied, a large improvement on an earlier, uncorrected pass of the analysis, but still a smaller sample than the dry-window rule’s 121 days.</w:t>
       </w:r>
     </w:p>
     <w:p>
@@ -38993,7 +39070,7 @@
         <w:rPr>
           <w:rFonts w:asciiTheme="majorHAnsi" w:hAnsiTheme="majorHAnsi" w:cstheme="majorHAnsi"/>
         </w:rPr>
-        <w:t>The field run covers two days and cannot speak to seasonal behaviour.</w:t>
+        <w:t>The field run covers 2 days and cannot speak to seasonal behaviour.</w:t>
       </w:r>
     </w:p>
     <w:p>
@@ -39010,7 +39087,7 @@
         <w:rPr>
           <w:rFonts w:asciiTheme="majorHAnsi" w:hAnsiTheme="majorHAnsi" w:cstheme="majorHAnsi"/>
         </w:rPr>
-        <w:t>7.4 Future Work</w:t>
+        <w:t>8.4 Future Work</w:t>
       </w:r>
       <w:bookmarkEnd w:id="291"/>
     </w:p>
@@ -39149,13 +39226,12 @@
           <w:b/>
           <w:bCs/>
         </w:rPr>
-        <w:t>Add a dry-window advisory</w:t>
-      </w:r>
-      <w:r>
-        <w:rPr>
-          <w:rFonts w:asciiTheme="majorHAnsi" w:hAnsiTheme="majorHAnsi" w:cstheme="majorHAnsi"/>
-        </w:rPr>
-        <w:t xml:space="preserve"> to the application using the forecast rule validated in Section 6.2.4.</w:t>
+        <w:t>Add a dry-window advisory to the application using the forecast rule validated in Section 6.7.2.</w:t>
+      </w:r>
+      <w:r>
+        <w:rPr>
+          <w:rFonts w:asciiTheme="majorHAnsi" w:hAnsiTheme="majorHAnsi" w:cstheme="majorHAnsi"/>
+        </w:rPr>
       </w:r>
     </w:p>
     <w:p>
@@ -39407,7 +39483,7 @@
         <w:rPr>
           <w:rFonts w:asciiTheme="majorHAnsi" w:hAnsiTheme="majorHAnsi" w:cstheme="majorHAnsi"/>
         </w:rPr>
-        <w:t>7.5 Conclusion</w:t>
+        <w:t>8.5 Conclusion</w:t>
       </w:r>
       <w:bookmarkEnd w:id="293"/>
     </w:p>
@@ -39450,7 +39526,7 @@
         <w:rPr>
           <w:rFonts w:asciiTheme="majorHAnsi" w:hAnsiTheme="majorHAnsi" w:cstheme="majorHAnsi"/>
         </w:rPr>
-        <w:t>The analysis of six years of NEA data gave the clearest result of the project so far. For a pond of normal depth, rain dilution is small beside routine water changes. The forecast identifies dry days reliably and adds some skill for next-day rain, but it adds nothing measurable over the thermometer for hot days. These findings narrow where the forecast should be used and show that the chemistry model’s rain term should be recalibrated.</w:t>
+        <w:t>The analysis of 6 years of NEA data, reported in Chapter 6, gave the clearest result of the project so far. For a pond of normal depth, rain dilution is small beside routine water changes. The forecast identifies dry days reliably, adds skill for next-day rain, and, once measured on a consistent temperature record, adds real skill for heat at every lead time from same-day to 5 days ahead. A newly validated 2-hour nowcast adds a further, short-fuse layer of warning that no other signal in the system supplies. These findings narrow where the forecast should be used and show that the chemistry model’s rain term should be recalibrated.</w:t>
       </w:r>
     </w:p>
     <w:p>
@@ -39501,7 +39577,7 @@
         <w:rPr>
           <w:rFonts w:asciiTheme="majorHAnsi" w:hAnsiTheme="majorHAnsi" w:cstheme="majorHAnsi"/>
         </w:rPr>
-        <w:t>Entries are formatted to APA 7th edition. Where a bracketed marker appears, the detail was carried over from the working draft and has not been checked against a publisher record, and APA requires the full author list rather than ‘et al.’ in the reference list, so each marked entry must be completed before submission. Secondary citations (Boyd, 1998; Boyd &amp; Hanson, 2010; Begum et al., 2004; Stone &amp; Thomforde, 2004) are cited as ‘as cited in Komal et al., 2021’ and are omitted from this list, which lists only the sources consulted.</w:t>
+        <w:t>Entries are formatted to APA 7th edition. Where a bracketed marker appears, the detail was carried over from the working draft and has not been checked against a publisher record, and APA requires the full author list rather than ‘et al.’ in the reference list, so each marked entry must be completed before submission. Secondary citations to Boyd (1998), Boyd and Hanson (2010), Begum et al. (2004), and Stone and Thomforde (2004) are cited as ‘as cited in Komal et al., 2021’ and are omitted from this list, which lists only the sources consulted.</w:t>
       </w:r>
     </w:p>
     <w:p>

</xml_diff>